<commit_message>
Added left right rotation to markdwon
</commit_message>
<xml_diff>
--- a/AVL Trees.docx
+++ b/AVL Trees.docx
@@ -31,7 +31,13 @@
         <w:tab/>
       </w:r>
       <w:r>
-        <w:t xml:space="preserve">     A binary </w:t>
+        <w:t>     A</w:t>
+      </w:r>
+      <w:r>
+        <w:t xml:space="preserve"> traditional</w:t>
+      </w:r>
+      <w:r>
+        <w:t xml:space="preserve"> binary </w:t>
       </w:r>
       <w:r>
         <w:t xml:space="preserve">search </w:t>
@@ -57,15 +63,33 @@
       </w:r>
       <w:proofErr w:type="gramEnd"/>
       <w:r>
-        <w:t xml:space="preserve"> a significant flaw in that they are entirely dependent on the </w:t>
-      </w:r>
-      <w:proofErr w:type="gramStart"/>
-      <w:r>
-        <w:t>insertion order of the data</w:t>
-      </w:r>
-      <w:proofErr w:type="gramEnd"/>
-      <w:r>
-        <w:t>. When a binary tree is unbalanced, its performance is affected and can result in a worst-case scenario of O(n) for various operations. This research paper investigates the data structure of an AVL tree an AVL is a self-balancing tree that corrects for a binary tree’s worst-case scenario. To understand the effectiveness of this algorithm, our research will be discussed in four sections:</w:t>
+        <w:t xml:space="preserve"> a significant flaw in that they are entirely dependent on the insertion of the data. When a binary tree is unbalanced, its performance is affected and can result in a worst-case scenario of O(n) for various operations. </w:t>
+      </w:r>
+    </w:p>
+    <w:p>
+      <w:pPr>
+        <w:ind w:firstLine="360"/>
+      </w:pPr>
+      <w:r>
+        <w:t>This research paper investigates the data structure of an AVL tree</w:t>
+      </w:r>
+      <w:r>
+        <w:t>.</w:t>
+      </w:r>
+      <w:r>
+        <w:t xml:space="preserve"> </w:t>
+      </w:r>
+      <w:r>
+        <w:t>A</w:t>
+      </w:r>
+      <w:r>
+        <w:t>n AVL is a self-balancing tree that corrects for a binary tree’s worst-case scenario</w:t>
+      </w:r>
+      <w:r>
+        <w:t xml:space="preserve"> for height</w:t>
+      </w:r>
+      <w:r>
+        <w:t>. To understand the effectiveness of this algorithm, our research will be discussed in four sections:</w:t>
       </w:r>
     </w:p>
     <w:p>
@@ -101,7 +125,29 @@
         <w:t>Theoretical Analysis</w:t>
       </w:r>
       <w:r>
-        <w:t>: Analyzing Big(O) for insertion, deletion, and searching, and proving correctness.</w:t>
+        <w:t xml:space="preserve">: </w:t>
+      </w:r>
+      <w:r>
+        <w:t>Showing $h = O(\</w:t>
+      </w:r>
+      <w:proofErr w:type="gramStart"/>
+      <w:r>
+        <w:t>log((</w:t>
+      </w:r>
+      <w:proofErr w:type="gramEnd"/>
+      <w:r>
+        <w:t>n</w:t>
+      </w:r>
+      <w:proofErr w:type="gramStart"/>
+      <w:r>
+        <w:t>))$</w:t>
+      </w:r>
+      <w:proofErr w:type="gramEnd"/>
+      <w:r>
+        <w:t xml:space="preserve"> and then a</w:t>
+      </w:r>
+      <w:r>
+        <w:t>nalyzing Big(O) for insertion, deletion, and searching.</w:t>
       </w:r>
     </w:p>
     <w:p>
@@ -120,7 +166,28 @@
         <w:t>Implementation</w:t>
       </w:r>
       <w:r>
-        <w:t>: A discussion of the reports code base and the design decisions behind the data structures implementation.</w:t>
+        <w:rPr>
+          <w:b/>
+          <w:bCs/>
+        </w:rPr>
+        <w:t>/Experiment</w:t>
+      </w:r>
+      <w:r>
+        <w:t xml:space="preserve">: A discussion of the reports code base </w:t>
+      </w:r>
+      <w:proofErr w:type="gramStart"/>
+      <w:r>
+        <w:t>and</w:t>
+      </w:r>
+      <w:r>
+        <w:t>of</w:t>
+      </w:r>
+      <w:proofErr w:type="gramEnd"/>
+      <w:r>
+        <w:t xml:space="preserve"> our experiment</w:t>
+      </w:r>
+      <w:r>
+        <w:t>.</w:t>
       </w:r>
     </w:p>
     <w:p>
@@ -138,13 +205,19 @@
         <w:t>Empirical Analysis</w:t>
       </w:r>
       <w:r>
-        <w:t xml:space="preserve">: analyzing the runtime </w:t>
-      </w:r>
-      <w:r>
-        <w:t>using</w:t>
-      </w:r>
-      <w:r>
-        <w:t xml:space="preserve"> an experiment.</w:t>
+        <w:t>: analyzing the runtime</w:t>
+      </w:r>
+      <w:r>
+        <w:t>s</w:t>
+      </w:r>
+      <w:r>
+        <w:t xml:space="preserve"> </w:t>
+      </w:r>
+      <w:r>
+        <w:t>using our experimental data</w:t>
+      </w:r>
+      <w:r>
+        <w:t>.</w:t>
       </w:r>
     </w:p>
     <w:p>
@@ -161,51 +234,9 @@
     <w:p>
       <w:r>
         <w:tab/>
-        <w:t xml:space="preserve">In 1962 </w:t>
-      </w:r>
-      <w:r>
-        <w:t xml:space="preserve">a </w:t>
-      </w:r>
-      <w:r>
-        <w:t>pair of Soviet mathematicians</w:t>
-      </w:r>
-      <w:r>
-        <w:t>,</w:t>
-      </w:r>
-      <w:r>
-        <w:t xml:space="preserve"> </w:t>
-      </w:r>
-      <w:r>
-        <w:t>Georgy Adelson-</w:t>
-      </w:r>
-      <w:proofErr w:type="spellStart"/>
-      <w:r>
-        <w:t>Velsky</w:t>
-      </w:r>
-      <w:proofErr w:type="spellEnd"/>
-      <w:r>
-        <w:t xml:space="preserve"> and </w:t>
-      </w:r>
-      <w:r>
-        <w:t>Evgenii Landis</w:t>
-      </w:r>
-      <w:r>
-        <w:t xml:space="preserve">, </w:t>
-      </w:r>
-      <w:r>
-        <w:t xml:space="preserve">sought to create a </w:t>
-      </w:r>
-      <w:r>
-        <w:t>d</w:t>
-      </w:r>
-      <w:r>
-        <w:t xml:space="preserve">ata </w:t>
-      </w:r>
-      <w:r>
-        <w:t>s</w:t>
-      </w:r>
-      <w:r>
-        <w:t>tructure which guaranteed $O(\log(n</w:t>
+      </w:r>
+      <w:r>
+        <w:t>In 1962, a pair of Soviet mathematicians, Georgy Adelson-Velsky and Evgenii Landis, sought to create a data structure that guaranteed $O(\log(n</w:t>
       </w:r>
       <w:proofErr w:type="gramStart"/>
       <w:r>
@@ -213,58 +244,19 @@
       </w:r>
       <w:proofErr w:type="gramEnd"/>
       <w:r>
-        <w:t xml:space="preserve"> performance </w:t>
-      </w:r>
-      <w:r>
-        <w:t>for</w:t>
-      </w:r>
-      <w:r>
-        <w:t xml:space="preserve"> deletion, search and </w:t>
-      </w:r>
-      <w:proofErr w:type="gramStart"/>
-      <w:r>
-        <w:t>insertion</w:t>
-      </w:r>
-      <w:r>
-        <w:t>[</w:t>
-      </w:r>
-      <w:proofErr w:type="gramEnd"/>
-      <w:r>
-        <w:t>1]</w:t>
-      </w:r>
-      <w:r>
-        <w:t xml:space="preserve">. </w:t>
-      </w:r>
-      <w:r>
-        <w:t xml:space="preserve">To reach this goal, they needed a tree which was as dense as possible. This idea of a </w:t>
-      </w:r>
-      <w:r>
-        <w:t xml:space="preserve">dense </w:t>
-      </w:r>
-      <w:r>
-        <w:t xml:space="preserve">tree is what can be referred to as a balanced tree. </w:t>
-      </w:r>
-      <w:r>
-        <w:t>A balanced tree</w:t>
-      </w:r>
-      <w:r>
-        <w:t xml:space="preserve"> is a tree whose height at the root node is no larger than $log(n)$ [3]. When we have this property, </w:t>
-      </w:r>
-      <w:r>
-        <w:t xml:space="preserve">a </w:t>
-      </w:r>
-      <w:r>
-        <w:t xml:space="preserve">BST is guaranteed to </w:t>
-      </w:r>
-      <w:proofErr w:type="gramStart"/>
-      <w:r>
-        <w:t xml:space="preserve">achieve </w:t>
-      </w:r>
-      <w:r>
-        <w:t xml:space="preserve"> </w:t>
-      </w:r>
-      <w:r>
-        <w:t>$</w:t>
+        <w:t xml:space="preserve"> performance for deletion, search, and </w:t>
+      </w:r>
+      <w:proofErr w:type="gramStart"/>
+      <w:r>
+        <w:t>insertion[</w:t>
+      </w:r>
+      <w:proofErr w:type="gramEnd"/>
+      <w:r>
+        <w:t xml:space="preserve">1]. To reach this goal, they needed a tree that was as dense as possible. This idea of a dense tree is what can be referred to as a balanced tree. A balanced tree is a tree whose height at the root node is no larger than $log(n)$ [3]. As previously discussed, when we have this property, a BST is guaranteed to </w:t>
+      </w:r>
+      <w:proofErr w:type="gramStart"/>
+      <w:r>
+        <w:t>achieve  $</w:t>
       </w:r>
       <w:proofErr w:type="gramEnd"/>
       <w:r>
@@ -276,89 +268,54 @@
       </w:r>
       <w:proofErr w:type="gramEnd"/>
       <w:r>
-        <w:t xml:space="preserve"> </w:t>
-      </w:r>
-      <w:r>
-        <w:t>performance</w:t>
-      </w:r>
-      <w:r>
-        <w:t xml:space="preserve">, but </w:t>
-      </w:r>
-      <w:r>
-        <w:t>a traditional BST is not guaranteed to be balanced</w:t>
-      </w:r>
-      <w:r>
-        <w:t xml:space="preserve">. </w:t>
-      </w:r>
-      <w:r>
-        <w:t>To solve this issue, our Soviet mathematicians created the AVL tree which is a self-balancing tree.</w:t>
-      </w:r>
-    </w:p>
-    <w:p>
-      <w:pPr>
-        <w:ind w:firstLine="720"/>
-      </w:pPr>
-      <w:r>
-        <w:t xml:space="preserve">Today, the AVL Tree has several use cases and has a rich history of practical application. </w:t>
-      </w:r>
-      <w:r>
-        <w:t xml:space="preserve"> </w:t>
-      </w:r>
-      <w:r>
-        <w:t xml:space="preserve">For example, Linux before 2.4.10 used AVL trees for tracking virtual memory areas. Linux also used AVL trees for its peer cache tracking system. </w:t>
-      </w:r>
-      <w:r>
-        <w:t>Generally,</w:t>
-      </w:r>
-      <w:r>
-        <w:t xml:space="preserve"> you’ll most often find AVL trees used in system operating kernels</w:t>
-      </w:r>
-      <w:r>
-        <w:t>,</w:t>
-      </w:r>
-      <w:r>
-        <w:t xml:space="preserve"> and other system software.</w:t>
-      </w:r>
-      <w:r>
-        <w:t xml:space="preserve"> AVL trees are foundational to computer science because they have characteristics that are both practical and useful. </w:t>
-      </w:r>
-      <w:proofErr w:type="gramStart"/>
-      <w:r>
-        <w:t>In particular, t</w:t>
-      </w:r>
-      <w:r>
-        <w:t>his</w:t>
-      </w:r>
-      <w:proofErr w:type="gramEnd"/>
-      <w:r>
-        <w:t xml:space="preserve"> data structure should be used if insertion often occurs in sorted </w:t>
-      </w:r>
-      <w:r>
-        <w:t>order, and</w:t>
-      </w:r>
-      <w:r>
-        <w:t xml:space="preserve"> if retrieval and deletion is random</w:t>
-      </w:r>
-      <w:r>
-        <w:t xml:space="preserve"> [4]. To gain an understanding </w:t>
+        <w:t xml:space="preserve"> performance, but a traditional BST is not guaranteed to be balanced. To solve this issue, our Soviet mathematicians created the AVL tree, which is a self-balancing binary search tree.</w:t>
+      </w:r>
+    </w:p>
+    <w:p>
+      <w:r>
+        <w:t xml:space="preserve">Today, the AVL tree has a rich history of practical application.  For example, Linux kernel before 2.4.10 used AVL trees for tracking virtual memory areas. Linux also uses AVL trees for its peer cache tracking system. Generally, AVL trees are used in system operating kernels and other system software. AVL trees are foundational to computer science because they have characteristics that are both practical and useful. </w:t>
+      </w:r>
+      <w:proofErr w:type="gramStart"/>
+      <w:r>
+        <w:t>In particular, this</w:t>
+      </w:r>
+      <w:proofErr w:type="gramEnd"/>
+      <w:r>
+        <w:t xml:space="preserve"> data </w:t>
       </w:r>
       <w:r>
         <w:lastRenderedPageBreak/>
-        <w:t xml:space="preserve">of an AVL tree, </w:t>
-      </w:r>
-      <w:proofErr w:type="gramStart"/>
-      <w:r>
-        <w:t>We</w:t>
-      </w:r>
-      <w:proofErr w:type="gramEnd"/>
-      <w:r>
-        <w:t xml:space="preserve"> will first discuss how it identifies and tracks and balance and then discuss how it fixes imbalance.</w:t>
-      </w:r>
-    </w:p>
-    <w:p>
-      <w:pPr>
-        <w:pStyle w:val="Heading3"/>
-      </w:pPr>
+        <w:t>structure should be used if data is often inserted in order or if retrieval and deletion are random [4].</w:t>
+      </w:r>
+    </w:p>
+    <w:p>
+      <w:r>
+        <w:t xml:space="preserve">As discussed, this data structure is practical, but how does it achieve this? To gain an understanding of an AVL tree, we are going to discuss two topics: </w:t>
+      </w:r>
+    </w:p>
+    <w:p>
+      <w:pPr>
+        <w:numPr>
+          <w:ilvl w:val="0"/>
+          <w:numId w:val="10"/>
+        </w:numPr>
+      </w:pPr>
+      <w:r>
+        <w:t>Imbalance: how an AVL tree identifies imbalance</w:t>
+      </w:r>
+    </w:p>
+    <w:p>
+      <w:pPr>
+        <w:numPr>
+          <w:ilvl w:val="0"/>
+          <w:numId w:val="10"/>
+        </w:numPr>
+      </w:pPr>
+      <w:r>
+        <w:t>Rotation: how an AVL tree corrects for this imbalance.</w:t>
+      </w:r>
+    </w:p>
+    <w:p>
       <w:r>
         <w:t>Identifying Imbalance</w:t>
       </w:r>
@@ -413,51 +370,90 @@
     <w:p>
       <w:r>
         <w:tab/>
-        <w:t xml:space="preserve">Figure one outlines some fundamental properties of an AVL tree. Each node in an AVL tree </w:t>
-      </w:r>
-      <w:r>
-        <w:t>store</w:t>
-      </w:r>
-      <w:r>
-        <w:t>s</w:t>
-      </w:r>
-      <w:r>
-        <w:t xml:space="preserve"> its height or simply put the length of the largest path beneath </w:t>
-      </w:r>
-      <w:r>
-        <w:t>it</w:t>
-      </w:r>
-      <w:r>
-        <w:t xml:space="preserve">.  </w:t>
-      </w:r>
-      <w:r>
-        <w:t>As shown in Figure 1, the height of a node is then used to calculate its balance factor (</w:t>
-      </w:r>
-      <w:r>
-        <w:t>$B_F$</w:t>
-      </w:r>
-      <w:r>
-        <w:t xml:space="preserve">). An AVL tree ensures that each </w:t>
-      </w:r>
-      <w:bookmarkStart w:id="0" w:name="_Hlk214821966"/>
-      <w:r>
-        <w:t>node has a</w:t>
-      </w:r>
-      <w:r>
-        <w:t xml:space="preserve"> $|B_F| \le 1$</w:t>
-      </w:r>
-      <w:bookmarkEnd w:id="0"/>
-      <w:r>
-        <w:t xml:space="preserve">. When each node is constrained to this property, we are guaranteed to have a balanced tree which we will show prove in later sections.  To maintain the property of </w:t>
-      </w:r>
-      <w:r>
-        <w:t>$|B_F| \le 1$</w:t>
-      </w:r>
-      <w:r>
-        <w:t xml:space="preserve">, </w:t>
-      </w:r>
-      <w:r>
-        <w:t>an AVL tree performs left, right, left-right, right-left rotations.</w:t>
+      </w:r>
+      <w:r>
+        <w:t xml:space="preserve">Figure 1 outlines some fundamental properties of an AVL tree. Each node in an AVL tree stores its height, or simply put, the length of the longest path beneath it.  With the height of a node, we can then calculate a </w:t>
+      </w:r>
+      <w:proofErr w:type="gramStart"/>
+      <w:r>
+        <w:t>node’s  balance</w:t>
+      </w:r>
+      <w:proofErr w:type="gramEnd"/>
+      <w:r>
+        <w:t xml:space="preserve"> factor ($B_F$), which is the difference in the height of a node's left and right subtrees. When a $B_F$ is positive, our left subtree is taller, and when it is negative, our right subtree is taller. We use $B_F$ to identify imbalance within our tree, and if $|B_F| &gt; 1$ we correct for this imbalance. When an AVL tree is constrained to this property, we are guaranteed to have a height of $O(log(n</w:t>
+      </w:r>
+      <w:proofErr w:type="gramStart"/>
+      <w:r>
+        <w:t>))$</w:t>
+      </w:r>
+      <w:proofErr w:type="gramEnd"/>
+      <w:r>
+        <w:t>.  To maintain the property of $|B_F| \le 1$, an AVL tree performs left, right, left-right, and right-left rotations.</w:t>
+      </w:r>
+    </w:p>
+    <w:p/>
+    <w:p/>
+    <w:p/>
+    <w:p/>
+    <w:p/>
+    <w:p>
+      <w:pPr>
+        <w:rPr>
+          <w:b/>
+          <w:bCs/>
+        </w:rPr>
+      </w:pPr>
+      <w:r>
+        <w:rPr>
+          <w:b/>
+          <w:bCs/>
+        </w:rPr>
+        <w:lastRenderedPageBreak/>
+        <w:t>Rotations:</w:t>
+      </w:r>
+    </w:p>
+    <w:p>
+      <w:r>
+        <w:t>To correct for an imbalance in an AVL tree we perform something called a rotation.</w:t>
+      </w:r>
+      <w:r>
+        <w:t xml:space="preserve"> Rotations rearrange nodes </w:t>
+      </w:r>
+      <w:r>
+        <w:t>to</w:t>
+      </w:r>
+      <w:r>
+        <w:t xml:space="preserve"> maintain our balance fact constraint. </w:t>
+      </w:r>
+      <w:r>
+        <w:t>Rotations have constant time and space complexity which makes them cheap to perform</w:t>
+      </w:r>
+      <w:r>
+        <w:t xml:space="preserve">. </w:t>
+      </w:r>
+      <w:r>
+        <w:t>There are four types of rotations</w:t>
+      </w:r>
+      <w:r>
+        <w:t xml:space="preserve"> L (left), R(right)</w:t>
+      </w:r>
+      <w:r>
+        <w:t xml:space="preserve"> </w:t>
+      </w:r>
+      <w:r>
+        <w:t xml:space="preserve">LL (left-left), </w:t>
+      </w:r>
+      <w:r>
+        <w:t xml:space="preserve">and </w:t>
+      </w:r>
+      <w:r>
+        <w:t>RR (right-right)</w:t>
+      </w:r>
+      <w:r>
+        <w:t xml:space="preserve">. In the sections below we discuss </w:t>
+      </w:r>
+      <w:r>
+        <w:t xml:space="preserve">each type of rotation and what types of imbalances it corrects. </w:t>
       </w:r>
     </w:p>
     <w:p>
@@ -511,102 +507,48 @@
       </w:r>
     </w:p>
     <w:p>
-      <w:pPr>
-        <w:ind w:firstLine="720"/>
-      </w:pPr>
-      <w:r>
-        <w:lastRenderedPageBreak/>
-        <w:t xml:space="preserve">Figure Two outlines the process for right rotation. Although left and right </w:t>
-      </w:r>
-      <w:r>
-        <w:t>rotations</w:t>
-      </w:r>
-      <w:r>
-        <w:t xml:space="preserve"> are different from one another, their core logic is just simply reversed and therefore we’ll just cover </w:t>
-      </w:r>
-      <w:r>
-        <w:t>a</w:t>
-      </w:r>
-      <w:r>
-        <w:t xml:space="preserve"> right</w:t>
-      </w:r>
-      <w:r>
-        <w:t xml:space="preserve"> rotation</w:t>
-      </w:r>
-      <w:r>
-        <w:t>.</w:t>
-      </w:r>
-      <w:r>
-        <w:t xml:space="preserve"> </w:t>
-      </w:r>
-      <w:r>
-        <w:t>For an example of a left rotation please see the appendix (cite)</w:t>
-      </w:r>
-      <w:r>
-        <w:t xml:space="preserve">. </w:t>
-      </w:r>
-    </w:p>
-    <w:p>
-      <w:pPr>
-        <w:ind w:firstLine="720"/>
-        <w:rPr>
-          <w:rStyle w:val="Heading3Char"/>
-          <w:rFonts w:eastAsiaTheme="minorHAnsi" w:cstheme="minorBidi"/>
-          <w:color w:val="auto"/>
-          <w:sz w:val="24"/>
-          <w:szCs w:val="24"/>
-        </w:rPr>
-      </w:pPr>
-      <w:r>
-        <w:t>A right rotation is triggered by a left imbalance in the tree. Looking at the diagram above, we find th</w:t>
-      </w:r>
-      <w:r>
-        <w:t xml:space="preserve">at </w:t>
-      </w:r>
-      <w:r>
-        <w:t>Node</w:t>
-      </w:r>
-      <w:r>
-        <w:t xml:space="preserve"> 3 has a $B_F \</w:t>
-      </w:r>
-      <w:proofErr w:type="spellStart"/>
-      <w:r>
-        <w:t>gte</w:t>
-      </w:r>
-      <w:proofErr w:type="spellEnd"/>
-      <w:r>
-        <w:t xml:space="preserve"> 1</w:t>
-      </w:r>
-      <w:proofErr w:type="gramStart"/>
-      <w:r>
-        <w:t>$  and</w:t>
-      </w:r>
-      <w:proofErr w:type="gramEnd"/>
-      <w:r>
-        <w:t xml:space="preserve"> Node 2 has a </w:t>
-      </w:r>
-      <w:r>
-        <w:t>$B_F \</w:t>
-      </w:r>
-      <w:proofErr w:type="spellStart"/>
-      <w:r>
-        <w:t>gte</w:t>
-      </w:r>
-      <w:proofErr w:type="spellEnd"/>
-      <w:r>
-        <w:t xml:space="preserve"> </w:t>
-      </w:r>
-      <w:r>
-        <w:t>0</w:t>
-      </w:r>
-      <w:r>
-        <w:t>$</w:t>
-      </w:r>
-      <w:r>
-        <w:t xml:space="preserve">. Under these conditions, we trigger the </w:t>
-      </w:r>
-      <w:r>
-        <w:t>process of a right rotation. The Pseudo code in the diagram walks through this process step-by-step, but simply put, Node 2 becomes the new root node in this process with node 3 being reassigned as its right child.</w:t>
+      <w:r>
+        <w:t xml:space="preserve">The above figure shows the process for </w:t>
+      </w:r>
+      <w:proofErr w:type="gramStart"/>
+      <w:r>
+        <w:t>a right</w:t>
+      </w:r>
+      <w:proofErr w:type="gramEnd"/>
+      <w:r>
+        <w:t xml:space="preserve"> rotation. Left and right rotations are inversely related, and thus, fundamentally, their core logic is the same. Since these rotations are logically equivalent, we will just cover </w:t>
+      </w:r>
+      <w:proofErr w:type="gramStart"/>
+      <w:r>
+        <w:t>a right</w:t>
+      </w:r>
+      <w:proofErr w:type="gramEnd"/>
+      <w:r>
+        <w:t xml:space="preserve"> rotation. For an example of a left rotation, please see the appendix (cite). </w:t>
+      </w:r>
+      <w:proofErr w:type="gramStart"/>
+      <w:r>
+        <w:t>A right</w:t>
+      </w:r>
+      <w:proofErr w:type="gramEnd"/>
+      <w:r>
+        <w:t xml:space="preserve"> rotation is triggered by a left imbalance in the </w:t>
+      </w:r>
+      <w:proofErr w:type="gramStart"/>
+      <w:r>
+        <w:t>tree .</w:t>
+      </w:r>
+      <w:proofErr w:type="gramEnd"/>
+      <w:r>
+        <w:t xml:space="preserve"> Looking at the diagram above, we find that Node 3 has a $B_F \ge 1</w:t>
+      </w:r>
+      <w:proofErr w:type="gramStart"/>
+      <w:r>
+        <w:t>$  and</w:t>
+      </w:r>
+      <w:proofErr w:type="gramEnd"/>
+      <w:r>
+        <w:t xml:space="preserve"> Node 2 has a $B_F \ge 0$. Under these conditions, we trigger the process of a right rotation. The Pseudo code above walks through this process step-by-step, but simply put, Node 2 becomes the new root node in this process, with node 3 being reassigned as its right child.</w:t>
       </w:r>
     </w:p>
     <w:p>
@@ -636,6 +578,7 @@
     </w:p>
     <w:p>
       <w:r>
+        <w:lastRenderedPageBreak/>
         <w:t>Figure 3</w:t>
       </w:r>
       <w:r>
@@ -681,58 +624,37 @@
     </w:p>
     <w:p>
       <w:r>
-        <w:t xml:space="preserve">When </w:t>
-      </w:r>
-      <w:r>
-        <w:t xml:space="preserve">we have an imbalance that has </w:t>
-      </w:r>
-      <w:r>
-        <w:t xml:space="preserve">a zigzag pattern, we perform either a left-right or a right-left rotation. The diagram above outlines a left -right rotation, and in the </w:t>
-      </w:r>
-      <w:r>
-        <w:t>appendix,</w:t>
-      </w:r>
-      <w:r>
-        <w:t xml:space="preserve"> you</w:t>
-      </w:r>
-      <w:r>
-        <w:t>’ll</w:t>
-      </w:r>
-      <w:r>
-        <w:t xml:space="preserve"> find similar logic for a right-left rotation</w:t>
-      </w:r>
-      <w:r>
-        <w:t xml:space="preserve"> </w:t>
-      </w:r>
-      <w:r>
-        <w:t xml:space="preserve">(CITE). A left right rotation is triggered by two conditions: condition </w:t>
-      </w:r>
-      <w:r>
-        <w:t>one,</w:t>
-      </w:r>
-      <w:r>
-        <w:t xml:space="preserve"> </w:t>
-      </w:r>
-      <w:r>
-        <w:t>the current node has a $B_F&gt;1$; and</w:t>
-      </w:r>
-      <w:r>
-        <w:t xml:space="preserve"> condition 2, </w:t>
-      </w:r>
-      <w:r>
-        <w:t>the current node’s</w:t>
-      </w:r>
-      <w:r>
-        <w:t xml:space="preserve"> left child has a</w:t>
-      </w:r>
-      <w:r>
-        <w:t xml:space="preserve"> $B_F&gt;1$</w:t>
-      </w:r>
-      <w:r>
-        <w:t xml:space="preserve">. </w:t>
-      </w:r>
-      <w:r>
-        <w:t xml:space="preserve"> To fix this imbalance we perform steps. The first step flattens out the zigzag by performing a left rotation. The second step we correct for the observed imbalances by performing a right rotation. </w:t>
+        <w:t xml:space="preserve">When we have an imbalance that has a zigzag pattern, we perform either a left-right (LR) or a right-left (RL) rotation. The diagram above outlines an LR rotation, and in the appendix, you’ll find similar logic for an RL rotation (CITE). An LR rotation is triggered by two conditions: condition one, the parent node has a $B_F&gt;1$; and condition two, the parent node’s left child has a $B_F&lt;0$. To fix this imbalance, we </w:t>
+      </w:r>
+      <w:proofErr w:type="gramStart"/>
+      <w:r>
+        <w:t>perform</w:t>
+      </w:r>
+      <w:proofErr w:type="gramEnd"/>
+      <w:r>
+        <w:t xml:space="preserve"> two steps:</w:t>
+      </w:r>
+    </w:p>
+    <w:p>
+      <w:pPr>
+        <w:numPr>
+          <w:ilvl w:val="0"/>
+          <w:numId w:val="11"/>
+        </w:numPr>
+      </w:pPr>
+      <w:r>
+        <w:t xml:space="preserve">Step One: Flatten the zigzag by performing a left rotation. </w:t>
+      </w:r>
+    </w:p>
+    <w:p>
+      <w:pPr>
+        <w:numPr>
+          <w:ilvl w:val="0"/>
+          <w:numId w:val="11"/>
+        </w:numPr>
+      </w:pPr>
+      <w:r>
+        <w:t>Step Two: Correct the imbalances by performing a right rotation.</w:t>
       </w:r>
     </w:p>
     <w:p>
@@ -814,205 +736,406 @@
         <w:pStyle w:val="Heading4"/>
       </w:pPr>
       <w:r>
+        <w:t>Proving AVL’s Height</w:t>
+      </w:r>
+    </w:p>
+    <w:p>
+      <w:pPr>
+        <w:pStyle w:val="Heading4"/>
+      </w:pPr>
+      <w:r>
+        <w:t>Proof:</w:t>
+      </w:r>
+    </w:p>
+    <w:p>
+      <w:pPr>
+        <w:pStyle w:val="Heading4"/>
+      </w:pPr>
+      <w:r>
+        <w:t>Proof Discussion:</w:t>
+      </w:r>
+    </w:p>
+    <w:p>
+      <w:pPr>
+        <w:ind w:firstLine="720"/>
+      </w:pPr>
+      <w:r>
+        <w:t xml:space="preserve">The proof above shows that the height of an AVL tree is </w:t>
+      </w:r>
+      <w:proofErr w:type="gramStart"/>
+      <w:r>
+        <w:t>bounded</w:t>
+      </w:r>
+      <w:proofErr w:type="gramEnd"/>
+      <w:r>
+        <w:t xml:space="preserve"> to $O(\log(n</w:t>
+      </w:r>
+      <w:proofErr w:type="gramStart"/>
+      <w:r>
+        <w:t>))$</w:t>
+      </w:r>
+      <w:proofErr w:type="gramEnd"/>
+      <w:r>
+        <w:t xml:space="preserve">. </w:t>
+      </w:r>
+      <w:r>
+        <w:t xml:space="preserve">We were able to come to this conclusion by combing the proofs of ____ and ___. Upon a review of </w:t>
+      </w:r>
+      <w:r>
+        <w:t>their</w:t>
+      </w:r>
+      <w:r>
+        <w:t xml:space="preserve"> proofs, </w:t>
+      </w:r>
+      <w:r>
+        <w:t xml:space="preserve">it was revealed that’s solving for height ($h$) was </w:t>
+      </w:r>
+      <w:proofErr w:type="gramStart"/>
+      <w:r>
+        <w:t>actually more</w:t>
+      </w:r>
+      <w:proofErr w:type="gramEnd"/>
+      <w:r>
+        <w:t xml:space="preserve"> difficult than solving for the minimum number of nodes under a specific height ($N_h$). If we can show that $N_h$ grows exponentially as the $h$ increases, we can reverse this and show that $h$ is bound by $</w:t>
+      </w:r>
+      <w:r>
+        <w:t>O(</w:t>
+      </w:r>
+      <w:r>
+        <w:t>\log(n</w:t>
+      </w:r>
+      <w:proofErr w:type="gramStart"/>
+      <w:r>
+        <w:t>)</w:t>
+      </w:r>
+      <w:r>
+        <w:t>)</w:t>
+      </w:r>
+      <w:r>
+        <w:t>$</w:t>
+      </w:r>
+      <w:proofErr w:type="gramEnd"/>
+      <w:r>
+        <w:t xml:space="preserve">. </w:t>
+      </w:r>
+    </w:p>
+    <w:p>
+      <w:pPr>
+        <w:ind w:firstLine="720"/>
+      </w:pPr>
+      <w:r>
+        <w:t xml:space="preserve">This idea of </w:t>
+      </w:r>
+      <w:proofErr w:type="gramStart"/>
+      <w:r>
+        <w:t>solving for</w:t>
+      </w:r>
+      <w:proofErr w:type="gramEnd"/>
+      <w:r>
+        <w:t xml:space="preserve"> the lower bound $N_h$ is foundational to our proof. W</w:t>
+      </w:r>
+      <w:r>
+        <w:t xml:space="preserve">e rely on </w:t>
+      </w:r>
+      <w:r>
+        <w:t xml:space="preserve">$N_h$ </w:t>
+      </w:r>
+      <w:r>
+        <w:t xml:space="preserve">because this provides the </w:t>
+      </w:r>
+      <w:r>
+        <w:t>least</w:t>
+      </w:r>
+      <w:r>
+        <w:t xml:space="preserve"> amount of restraint on </w:t>
+      </w:r>
+      <w:r>
+        <w:t xml:space="preserve">the growth of </w:t>
+      </w:r>
+      <w:r>
+        <w:t>$h</w:t>
+      </w:r>
+      <w:r>
+        <w:t xml:space="preserve">$.  </w:t>
+      </w:r>
+      <w:r>
         <w:lastRenderedPageBreak/>
-        <w:t>Proving AVL’s Height</w:t>
-      </w:r>
-    </w:p>
-    <w:p>
-      <w:pPr>
-        <w:pStyle w:val="Heading4"/>
-      </w:pPr>
-      <w:r>
-        <w:t>Proof:</w:t>
-      </w:r>
-    </w:p>
-    <w:p>
-      <w:pPr>
-        <w:pStyle w:val="Heading4"/>
-      </w:pPr>
-      <w:r>
-        <w:t>Proof Discussion:</w:t>
-      </w:r>
-    </w:p>
-    <w:p>
-      <w:pPr>
-        <w:ind w:firstLine="720"/>
-      </w:pPr>
-      <w:r>
-        <w:t xml:space="preserve">The proof above shows that the height of an AVL tree is </w:t>
-      </w:r>
-      <w:proofErr w:type="gramStart"/>
-      <w:r>
-        <w:t>bounded</w:t>
-      </w:r>
-      <w:proofErr w:type="gramEnd"/>
-      <w:r>
-        <w:t xml:space="preserve"> to $O(\log(n</w:t>
-      </w:r>
-      <w:proofErr w:type="gramStart"/>
-      <w:r>
-        <w:t>))$</w:t>
-      </w:r>
-      <w:proofErr w:type="gramEnd"/>
-      <w:r>
-        <w:t xml:space="preserve">. </w:t>
-      </w:r>
-      <w:r>
-        <w:t xml:space="preserve">We were able to come to this conclusion by combing the proofs of ____ and ___. Upon a review of </w:t>
-      </w:r>
-      <w:r>
-        <w:t>their</w:t>
-      </w:r>
-      <w:r>
-        <w:t xml:space="preserve"> proofs, </w:t>
-      </w:r>
-      <w:r>
-        <w:t xml:space="preserve">it was revealed that’s solving for height ($h$) was </w:t>
-      </w:r>
-      <w:proofErr w:type="gramStart"/>
-      <w:r>
-        <w:t>actually more</w:t>
-      </w:r>
-      <w:proofErr w:type="gramEnd"/>
-      <w:r>
-        <w:t xml:space="preserve"> difficult than solving for the minimum number of nodes under a specific height ($</w:t>
-      </w:r>
-      <w:proofErr w:type="spellStart"/>
-      <w:r>
-        <w:t>N_h</w:t>
-      </w:r>
-      <w:proofErr w:type="spellEnd"/>
-      <w:r>
-        <w:t>$). If we can show that $</w:t>
-      </w:r>
-      <w:proofErr w:type="spellStart"/>
-      <w:r>
-        <w:t>N_h</w:t>
-      </w:r>
-      <w:proofErr w:type="spellEnd"/>
-      <w:r>
-        <w:t>$ grows exponentially as the $h$ increases, we can reverse this and show that $h$ is bound by $</w:t>
-      </w:r>
-      <w:r>
-        <w:t>O(</w:t>
-      </w:r>
-      <w:r>
-        <w:t>\log(n</w:t>
-      </w:r>
-      <w:proofErr w:type="gramStart"/>
-      <w:r>
-        <w:t>)</w:t>
-      </w:r>
-      <w:r>
-        <w:t>)</w:t>
+        <w:t xml:space="preserve">Meaning, if $N_h$ still grows exponentially then anything above this is still greater </w:t>
+      </w:r>
+      <w:proofErr w:type="gramStart"/>
+      <w:r>
+        <w:t>then</w:t>
+      </w:r>
+      <w:proofErr w:type="gramEnd"/>
+      <w:r>
+        <w:t xml:space="preserve"> or</w:t>
+      </w:r>
+      <w:r>
+        <w:t xml:space="preserve"> equal to exponential growth. </w:t>
+      </w:r>
+      <w:r>
+        <w:t xml:space="preserve">Given the relationship between the growth of $N_h$ and the growth of $h$, we </w:t>
+      </w:r>
+      <w:proofErr w:type="gramStart"/>
+      <w:r>
+        <w:t>where</w:t>
+      </w:r>
+      <w:proofErr w:type="gramEnd"/>
+      <w:r>
+        <w:t xml:space="preserve"> able to solve for the upper bound of $h$ in a three-step process:</w:t>
+      </w:r>
+    </w:p>
+    <w:p>
+      <w:pPr>
+        <w:pStyle w:val="Heading6"/>
+      </w:pPr>
+      <w:r>
+        <w:t xml:space="preserve">Step </w:t>
+      </w:r>
+      <w:r>
+        <w:t>One</w:t>
+      </w:r>
+      <w:r>
+        <w:t xml:space="preserve">: Define the Recursive </w:t>
+      </w:r>
+      <w:r>
+        <w:t>Relationship</w:t>
+      </w:r>
+    </w:p>
+    <w:p>
+      <w:r>
+        <w:t>\[</w:t>
+      </w:r>
+    </w:p>
+    <w:p>
+      <w:r>
+        <w:t xml:space="preserve">  N_h = </w:t>
+      </w:r>
+      <w:proofErr w:type="gramStart"/>
+      <w:r>
+        <w:t>N_{</w:t>
+      </w:r>
+      <w:proofErr w:type="gramEnd"/>
+      <w:r>
+        <w:t xml:space="preserve">h-1} + </w:t>
+      </w:r>
+      <w:proofErr w:type="gramStart"/>
+      <w:r>
+        <w:t>N_{</w:t>
+      </w:r>
+      <w:proofErr w:type="gramEnd"/>
+      <w:r>
+        <w:t>h-2} + 1 \</w:t>
+      </w:r>
+      <w:proofErr w:type="gramStart"/>
+      <w:r>
+        <w:t>quad{</w:t>
+      </w:r>
+      <w:proofErr w:type="gramEnd"/>
+      <w:r>
+        <w:t xml:space="preserve">+1 for the </w:t>
+      </w:r>
+      <w:r>
+        <w:t>height</w:t>
+      </w:r>
+      <w:r>
+        <w:t xml:space="preserve"> of the root}</w:t>
+      </w:r>
+    </w:p>
+    <w:p>
+      <w:r>
+        <w:t xml:space="preserve"> \]</w:t>
+      </w:r>
+    </w:p>
+    <w:p>
+      <w:r>
+        <w:t xml:space="preserve">The above equation </w:t>
+      </w:r>
+      <w:proofErr w:type="gramStart"/>
+      <w:r>
+        <w:t>d</w:t>
+      </w:r>
+      <w:r>
+        <w:t xml:space="preserve">efines  </w:t>
       </w:r>
       <w:r>
         <w:t>$</w:t>
       </w:r>
       <w:proofErr w:type="gramEnd"/>
       <w:r>
-        <w:t xml:space="preserve">. </w:t>
-      </w:r>
-    </w:p>
-    <w:p>
-      <w:pPr>
-        <w:ind w:firstLine="720"/>
-      </w:pPr>
-      <w:r>
-        <w:t xml:space="preserve">This idea of </w:t>
-      </w:r>
-      <w:proofErr w:type="gramStart"/>
-      <w:r>
-        <w:t>solving for</w:t>
-      </w:r>
-      <w:proofErr w:type="gramEnd"/>
-      <w:r>
-        <w:t xml:space="preserve"> the lower bound $</w:t>
-      </w:r>
-      <w:proofErr w:type="spellStart"/>
-      <w:r>
-        <w:t>N_h</w:t>
-      </w:r>
-      <w:proofErr w:type="spellEnd"/>
-      <w:r>
-        <w:t>$ is foundational to our proof. W</w:t>
-      </w:r>
-      <w:r>
-        <w:t xml:space="preserve">e rely on </w:t>
+        <w:t>N_h$</w:t>
+      </w:r>
+      <w:r>
+        <w:t xml:space="preserve"> recursively by </w:t>
+      </w:r>
+      <w:proofErr w:type="gramStart"/>
+      <w:r>
+        <w:t>showing that is</w:t>
+      </w:r>
+      <w:proofErr w:type="gramEnd"/>
+      <w:r>
+        <w:t xml:space="preserve"> that it is the composition of</w:t>
+      </w:r>
+      <w:r>
+        <w:t xml:space="preserve"> its subtrees plus its connection to those subtrees. As previously discussed, an AVL tree’s height is bounded by the balancing factor which states that $|B_f| \le 1$. Given this constraint, the left and right tree of $N_h$ can most have a one level difference. This information allows us to define $N_h$ recursively.</w:t>
+      </w:r>
+    </w:p>
+    <w:p>
+      <w:pPr>
+        <w:pStyle w:val="Heading6"/>
+      </w:pPr>
+      <w:r>
+        <w:t xml:space="preserve">Step </w:t>
+      </w:r>
+      <w:r>
+        <w:t>Two</w:t>
+      </w:r>
+      <w:r>
+        <w:t xml:space="preserve">: </w:t>
+      </w:r>
+      <w:r>
+        <w:t>Lower</w:t>
+      </w:r>
+      <w:r>
+        <w:t xml:space="preserve"> Bound of $N_h$</w:t>
+      </w:r>
+    </w:p>
+    <w:p>
+      <w:r>
+        <w:t xml:space="preserve">The proofs of __and __, use a direct proof via algebraic manipulation </w:t>
+      </w:r>
+      <w:r>
+        <w:t>to</w:t>
+      </w:r>
+      <w:r>
+        <w:t xml:space="preserve"> show the lower bound of $N_h$. Our proof took a slightly different route where we decided to use strong induction.</w:t>
+      </w:r>
+      <w:r>
+        <w:t xml:space="preserve"> Although we did not use an algebraic approach to solve for $N_h$, the work of __ and __ allowed us </w:t>
+      </w:r>
+      <w:proofErr w:type="gramStart"/>
+      <w:r>
+        <w:t>more easily define</w:t>
+      </w:r>
+      <w:proofErr w:type="gramEnd"/>
+      <w:r>
+        <w:t xml:space="preserve"> our inductive hypothesis. Take note that in the proof we </w:t>
+      </w:r>
+      <w:proofErr w:type="gramStart"/>
+      <w:r>
+        <w:t>are able to</w:t>
+      </w:r>
+      <w:proofErr w:type="gramEnd"/>
+      <w:r>
+        <w:t xml:space="preserve"> simplify $</w:t>
+      </w:r>
+      <w:r>
+        <w:t xml:space="preserve">N_k + </w:t>
+      </w:r>
+      <w:proofErr w:type="gramStart"/>
+      <w:r>
+        <w:t>N_{</w:t>
+      </w:r>
+      <w:proofErr w:type="gramEnd"/>
+      <w:r>
+        <w:t>k-1} + 1</w:t>
+      </w:r>
+      <w:r>
+        <w:t>$ to $</w:t>
+      </w:r>
+      <w:r>
+        <w:t xml:space="preserve"> </w:t>
+      </w:r>
+      <w:r>
+        <w:t>2</w:t>
+      </w:r>
+      <w:proofErr w:type="gramStart"/>
+      <w:r>
+        <w:t>N_{</w:t>
+      </w:r>
+      <w:proofErr w:type="gramEnd"/>
+      <w:r>
+        <w:t>k-</w:t>
+      </w:r>
+      <w:proofErr w:type="gramStart"/>
+      <w:r>
+        <w:t>1}</w:t>
       </w:r>
       <w:r>
         <w:t>$</w:t>
       </w:r>
-      <w:proofErr w:type="spellStart"/>
-      <w:r>
-        <w:t>N_h</w:t>
-      </w:r>
-      <w:proofErr w:type="spellEnd"/>
-      <w:r>
-        <w:t xml:space="preserve">$ </w:t>
-      </w:r>
-      <w:r>
-        <w:t xml:space="preserve">because this provides the </w:t>
-      </w:r>
-      <w:r>
-        <w:t>least</w:t>
-      </w:r>
-      <w:r>
-        <w:t xml:space="preserve"> amount of restraint on </w:t>
-      </w:r>
-      <w:r>
-        <w:t xml:space="preserve">the growth of </w:t>
-      </w:r>
-      <w:r>
-        <w:t>$h</w:t>
-      </w:r>
-      <w:r>
-        <w:t>$.  Meaning, if $</w:t>
-      </w:r>
-      <w:proofErr w:type="spellStart"/>
-      <w:r>
-        <w:t>N_h</w:t>
-      </w:r>
-      <w:proofErr w:type="spellEnd"/>
-      <w:r>
-        <w:t xml:space="preserve">$ still grows exponentially then anything above this is still greater </w:t>
-      </w:r>
-      <w:proofErr w:type="spellStart"/>
-      <w:proofErr w:type="gramStart"/>
-      <w:r>
-        <w:t>then</w:t>
-      </w:r>
-      <w:proofErr w:type="spellEnd"/>
-      <w:proofErr w:type="gramEnd"/>
-      <w:r>
-        <w:t xml:space="preserve"> or</w:t>
-      </w:r>
-      <w:r>
-        <w:t xml:space="preserve"> equal to exponential growth. </w:t>
-      </w:r>
-      <w:r>
-        <w:t>Given the relationship between the growth of $</w:t>
-      </w:r>
-      <w:proofErr w:type="spellStart"/>
-      <w:r>
-        <w:t>N_h</w:t>
-      </w:r>
-      <w:proofErr w:type="spellEnd"/>
-      <w:r>
-        <w:t xml:space="preserve">$ and the growth of $h$, </w:t>
-      </w:r>
-      <w:proofErr w:type="spellStart"/>
-      <w:r>
-        <w:t xml:space="preserve">we </w:t>
-      </w:r>
-      <w:proofErr w:type="gramStart"/>
-      <w:r>
-        <w:t>where</w:t>
-      </w:r>
-      <w:proofErr w:type="spellEnd"/>
-      <w:proofErr w:type="gramEnd"/>
-      <w:r>
-        <w:t xml:space="preserve"> able to solve for the upper bound of $h$ in a three-step process:</w:t>
+      <w:proofErr w:type="gramEnd"/>
+      <w:r>
+        <w:t xml:space="preserve">. We </w:t>
+      </w:r>
+      <w:proofErr w:type="gramStart"/>
+      <w:r>
+        <w:t>are able to</w:t>
+      </w:r>
+      <w:proofErr w:type="gramEnd"/>
+      <w:r>
+        <w:t xml:space="preserve"> do this because since </w:t>
+      </w:r>
+      <w:r>
+        <w:t>$</w:t>
+      </w:r>
+      <w:r>
+        <w:t xml:space="preserve">N_k + </w:t>
+      </w:r>
+      <w:proofErr w:type="gramStart"/>
+      <w:r>
+        <w:t>N_{</w:t>
+      </w:r>
+      <w:proofErr w:type="gramEnd"/>
+      <w:r>
+        <w:t>k-1} + 1</w:t>
+      </w:r>
+      <w:r>
+        <w:t xml:space="preserve"> &gt; </w:t>
+      </w:r>
+      <w:r>
+        <w:t>2</w:t>
+      </w:r>
+      <w:proofErr w:type="gramStart"/>
+      <w:r>
+        <w:t>N_{</w:t>
+      </w:r>
+      <w:proofErr w:type="gramEnd"/>
+      <w:r>
+        <w:t>k-</w:t>
+      </w:r>
+      <w:proofErr w:type="gramStart"/>
+      <w:r>
+        <w:t>1}</w:t>
+      </w:r>
+      <w:r>
+        <w:t>$</w:t>
+      </w:r>
+      <w:proofErr w:type="gramEnd"/>
+      <w:r>
+        <w:t>.</w:t>
+      </w:r>
+      <w:r>
+        <w:t xml:space="preserve"> This step allowed us to simplify the process for solving for $N_h$, but it is worth mentioning that ____ did not take this </w:t>
+      </w:r>
+      <w:proofErr w:type="gramStart"/>
+      <w:r>
+        <w:t>step, and</w:t>
+      </w:r>
+      <w:proofErr w:type="gramEnd"/>
+      <w:r>
+        <w:t xml:space="preserve"> was therefore able show a tighter bound via the golden ratio and the </w:t>
+      </w:r>
+      <w:r>
+        <w:t>Fibonacci</w:t>
+      </w:r>
+      <w:r>
+        <w:t xml:space="preserve"> sequence. </w:t>
+      </w:r>
+    </w:p>
+    <w:p>
+      <w:r>
+        <w:t xml:space="preserve"> </w:t>
       </w:r>
     </w:p>
     <w:p>
@@ -1023,13 +1146,41 @@
         <w:t xml:space="preserve">Step </w:t>
       </w:r>
       <w:r>
-        <w:t>One</w:t>
-      </w:r>
-      <w:r>
-        <w:t xml:space="preserve">: Define the Recursive </w:t>
-      </w:r>
-      <w:r>
-        <w:t>Relationship</w:t>
+        <w:t>Three</w:t>
+      </w:r>
+      <w:r>
+        <w:t xml:space="preserve">: </w:t>
+      </w:r>
+      <w:r>
+        <w:t xml:space="preserve">Upper </w:t>
+      </w:r>
+      <w:r>
+        <w:t>Bound of $</w:t>
+      </w:r>
+      <w:r>
+        <w:t>h</w:t>
+      </w:r>
+      <w:r>
+        <w:t>$</w:t>
+      </w:r>
+    </w:p>
+    <w:p>
+      <w:r>
+        <w:t>With the strong induction proof in hand, it was now time to solve for the upper bound of $h$. We were able to show the upper bound of $h$ with simple algerbraic manipulation which results in $</w:t>
+      </w:r>
+      <w:r>
+        <w:t>h &lt; 2\log_2(N_</w:t>
+      </w:r>
+      <w:proofErr w:type="gramStart"/>
+      <w:r>
+        <w:t>h)</w:t>
+      </w:r>
+      <w:r>
+        <w:t>$</w:t>
+      </w:r>
+      <w:proofErr w:type="gramEnd"/>
+      <w:r>
+        <w:t>. Using asmtotic notation we were able to derive the following:</w:t>
       </w:r>
     </w:p>
     <w:p>
@@ -1039,424 +1190,32 @@
     </w:p>
     <w:p>
       <w:r>
-        <w:t xml:space="preserve">  </w:t>
-      </w:r>
-      <w:proofErr w:type="spellStart"/>
-      <w:r>
-        <w:t>N_h</w:t>
-      </w:r>
-      <w:proofErr w:type="spellEnd"/>
-      <w:r>
-        <w:t xml:space="preserve"> = </w:t>
-      </w:r>
-      <w:proofErr w:type="gramStart"/>
-      <w:r>
-        <w:t>N_{</w:t>
-      </w:r>
-      <w:proofErr w:type="gramEnd"/>
-      <w:r>
-        <w:t xml:space="preserve">h-1} + </w:t>
-      </w:r>
-      <w:proofErr w:type="gramStart"/>
-      <w:r>
-        <w:t>N_{</w:t>
-      </w:r>
-      <w:proofErr w:type="gramEnd"/>
-      <w:r>
-        <w:t>h-2} + 1 \</w:t>
-      </w:r>
-      <w:proofErr w:type="gramStart"/>
-      <w:r>
-        <w:t>quad{</w:t>
-      </w:r>
-      <w:proofErr w:type="gramEnd"/>
-      <w:r>
-        <w:t xml:space="preserve">+1 for the </w:t>
-      </w:r>
-      <w:r>
-        <w:t>height</w:t>
-      </w:r>
-      <w:r>
-        <w:t xml:space="preserve"> of the root}</w:t>
-      </w:r>
-    </w:p>
-    <w:p>
-      <w:r>
-        <w:t xml:space="preserve"> \]</w:t>
-      </w:r>
-    </w:p>
-    <w:p>
-      <w:r>
-        <w:t xml:space="preserve">The above equation </w:t>
-      </w:r>
-      <w:proofErr w:type="gramStart"/>
-      <w:r>
-        <w:t>d</w:t>
-      </w:r>
-      <w:r>
-        <w:t xml:space="preserve">efines  </w:t>
-      </w:r>
-      <w:r>
-        <w:t>$</w:t>
-      </w:r>
-      <w:proofErr w:type="spellStart"/>
-      <w:proofErr w:type="gramEnd"/>
-      <w:r>
-        <w:t>N_h</w:t>
-      </w:r>
-      <w:proofErr w:type="spellEnd"/>
-      <w:r>
-        <w:t>$</w:t>
-      </w:r>
-      <w:r>
-        <w:t xml:space="preserve"> recursively by </w:t>
-      </w:r>
-      <w:proofErr w:type="gramStart"/>
-      <w:r>
-        <w:t>showing that is</w:t>
-      </w:r>
-      <w:proofErr w:type="gramEnd"/>
-      <w:r>
-        <w:t xml:space="preserve"> that it is the composition of</w:t>
-      </w:r>
-      <w:r>
-        <w:t xml:space="preserve"> its subtrees plus its connection to those subtrees. As previously discussed, an AVL tree’s height is bounded by the balancing factor which states that $|</w:t>
-      </w:r>
-      <w:proofErr w:type="spellStart"/>
-      <w:r>
-        <w:t>B_f</w:t>
-      </w:r>
-      <w:proofErr w:type="spellEnd"/>
-      <w:r>
-        <w:t>| \le 1$. Given this constraint, the left and right tree of $</w:t>
-      </w:r>
-      <w:proofErr w:type="spellStart"/>
-      <w:r>
-        <w:t>N_h</w:t>
-      </w:r>
-      <w:proofErr w:type="spellEnd"/>
-      <w:r>
-        <w:t>$ can most have a one level difference. This information allows us to define $</w:t>
-      </w:r>
-      <w:proofErr w:type="spellStart"/>
-      <w:r>
-        <w:t>N_h</w:t>
-      </w:r>
-      <w:proofErr w:type="spellEnd"/>
-      <w:r>
-        <w:t>$ recursively.</w:t>
-      </w:r>
-    </w:p>
-    <w:p>
-      <w:pPr>
-        <w:pStyle w:val="Heading6"/>
-      </w:pPr>
-      <w:r>
-        <w:t xml:space="preserve">Step </w:t>
-      </w:r>
-      <w:r>
-        <w:t>Two</w:t>
-      </w:r>
-      <w:r>
-        <w:t xml:space="preserve">: </w:t>
-      </w:r>
-      <w:r>
-        <w:t>Lower</w:t>
-      </w:r>
-      <w:r>
-        <w:t xml:space="preserve"> Bound of $</w:t>
-      </w:r>
-      <w:proofErr w:type="spellStart"/>
-      <w:r>
-        <w:t>N_h</w:t>
-      </w:r>
-      <w:proofErr w:type="spellEnd"/>
-      <w:r>
-        <w:t>$</w:t>
-      </w:r>
-    </w:p>
-    <w:p>
-      <w:r>
-        <w:t xml:space="preserve">The proofs of __and __, use a direct proof via algebraic manipulation </w:t>
-      </w:r>
-      <w:r>
-        <w:t>to</w:t>
-      </w:r>
-      <w:r>
-        <w:t xml:space="preserve"> show the lower bound of $</w:t>
-      </w:r>
-      <w:proofErr w:type="spellStart"/>
-      <w:r>
-        <w:t>N_h</w:t>
-      </w:r>
-      <w:proofErr w:type="spellEnd"/>
-      <w:r>
-        <w:t>$. Our proof took a slightly different route where we decided to use strong induction.</w:t>
-      </w:r>
-      <w:r>
-        <w:t xml:space="preserve"> Although we did not use an algebraic approach to solve for $</w:t>
-      </w:r>
-      <w:proofErr w:type="spellStart"/>
-      <w:r>
-        <w:t>N_h</w:t>
-      </w:r>
-      <w:proofErr w:type="spellEnd"/>
-      <w:r>
-        <w:t xml:space="preserve">$, the work of __ and __ allowed us </w:t>
-      </w:r>
-      <w:proofErr w:type="gramStart"/>
-      <w:r>
-        <w:t>more easily define</w:t>
-      </w:r>
-      <w:proofErr w:type="gramEnd"/>
-      <w:r>
-        <w:t xml:space="preserve"> our inductive hypothesis. Take note that in the proof we </w:t>
-      </w:r>
-      <w:proofErr w:type="gramStart"/>
-      <w:r>
-        <w:t>are able to</w:t>
-      </w:r>
-      <w:proofErr w:type="gramEnd"/>
-      <w:r>
-        <w:t xml:space="preserve"> simplify $</w:t>
-      </w:r>
-      <w:proofErr w:type="spellStart"/>
-      <w:r>
-        <w:t>N_k</w:t>
-      </w:r>
-      <w:proofErr w:type="spellEnd"/>
-      <w:r>
-        <w:t xml:space="preserve"> + </w:t>
-      </w:r>
-      <w:proofErr w:type="gramStart"/>
-      <w:r>
-        <w:t>N_{</w:t>
-      </w:r>
-      <w:proofErr w:type="gramEnd"/>
-      <w:r>
-        <w:t>k-1} + 1</w:t>
-      </w:r>
-      <w:r>
-        <w:t>$ to $</w:t>
-      </w:r>
-      <w:r>
-        <w:t xml:space="preserve"> </w:t>
-      </w:r>
-      <w:r>
-        <w:t>2</w:t>
-      </w:r>
-      <w:proofErr w:type="gramStart"/>
-      <w:r>
-        <w:t>N_{</w:t>
-      </w:r>
-      <w:proofErr w:type="gramEnd"/>
-      <w:r>
-        <w:t>k-</w:t>
-      </w:r>
-      <w:proofErr w:type="gramStart"/>
-      <w:r>
-        <w:t>1}</w:t>
-      </w:r>
-      <w:r>
-        <w:t>$</w:t>
-      </w:r>
-      <w:proofErr w:type="gramEnd"/>
-      <w:r>
-        <w:t xml:space="preserve">. We </w:t>
-      </w:r>
-      <w:proofErr w:type="gramStart"/>
-      <w:r>
-        <w:t>are able to</w:t>
-      </w:r>
-      <w:proofErr w:type="gramEnd"/>
-      <w:r>
-        <w:t xml:space="preserve"> do this because since </w:t>
-      </w:r>
-      <w:r>
-        <w:t>$</w:t>
-      </w:r>
-      <w:proofErr w:type="spellStart"/>
-      <w:r>
-        <w:t>N_k</w:t>
-      </w:r>
-      <w:proofErr w:type="spellEnd"/>
-      <w:r>
-        <w:t xml:space="preserve"> + </w:t>
-      </w:r>
-      <w:proofErr w:type="gramStart"/>
-      <w:r>
-        <w:t>N_{</w:t>
-      </w:r>
-      <w:proofErr w:type="gramEnd"/>
-      <w:r>
-        <w:t>k-1} + 1</w:t>
-      </w:r>
-      <w:r>
-        <w:t xml:space="preserve"> &gt; </w:t>
-      </w:r>
-      <w:r>
-        <w:t>2</w:t>
-      </w:r>
-      <w:proofErr w:type="gramStart"/>
-      <w:r>
-        <w:t>N_{</w:t>
-      </w:r>
-      <w:proofErr w:type="gramEnd"/>
-      <w:r>
-        <w:t>k-</w:t>
-      </w:r>
-      <w:proofErr w:type="gramStart"/>
-      <w:r>
-        <w:t>1}</w:t>
-      </w:r>
-      <w:r>
-        <w:t>$</w:t>
-      </w:r>
-      <w:proofErr w:type="gramEnd"/>
-      <w:r>
-        <w:t>.</w:t>
-      </w:r>
-      <w:r>
-        <w:t xml:space="preserve"> This step allowed us to simplify the process for solving for $</w:t>
-      </w:r>
-      <w:proofErr w:type="spellStart"/>
-      <w:r>
-        <w:t>N_h</w:t>
-      </w:r>
-      <w:proofErr w:type="spellEnd"/>
-      <w:r>
-        <w:t xml:space="preserve">$, but it is worth mentioning that ____ did not take this </w:t>
-      </w:r>
-      <w:proofErr w:type="gramStart"/>
-      <w:r>
-        <w:t>step, and</w:t>
-      </w:r>
-      <w:proofErr w:type="gramEnd"/>
-      <w:r>
-        <w:t xml:space="preserve"> was therefore able show a tighter bound via the golden ratio and the </w:t>
-      </w:r>
-      <w:r>
-        <w:t>Fibonacci</w:t>
-      </w:r>
-      <w:r>
-        <w:t xml:space="preserve"> sequence. </w:t>
-      </w:r>
-    </w:p>
-    <w:p>
-      <w:r>
-        <w:t xml:space="preserve"> </w:t>
-      </w:r>
-    </w:p>
-    <w:p>
-      <w:pPr>
-        <w:pStyle w:val="Heading6"/>
+        <w:t xml:space="preserve">H \le </w:t>
+      </w:r>
+      <w:r>
+        <w:t>\mathcal{O</w:t>
+      </w:r>
+      <w:proofErr w:type="gramStart"/>
+      <w:r>
+        <w:t>}(</w:t>
+      </w:r>
+      <w:proofErr w:type="gramEnd"/>
+      <w:r>
+        <w:t>\log n)</w:t>
+      </w:r>
+    </w:p>
+    <w:p>
+      <w:r>
+        <w:t>\]</w:t>
+      </w:r>
+    </w:p>
+    <w:p/>
+    <w:p>
+      <w:pPr>
+        <w:pStyle w:val="Heading3"/>
       </w:pPr>
       <w:r>
         <w:lastRenderedPageBreak/>
-        <w:t xml:space="preserve">Step </w:t>
-      </w:r>
-      <w:r>
-        <w:t>Three</w:t>
-      </w:r>
-      <w:r>
-        <w:t xml:space="preserve">: </w:t>
-      </w:r>
-      <w:r>
-        <w:t xml:space="preserve">Upper </w:t>
-      </w:r>
-      <w:r>
-        <w:t>Bound of $</w:t>
-      </w:r>
-      <w:r>
-        <w:t>h</w:t>
-      </w:r>
-      <w:r>
-        <w:t>$</w:t>
-      </w:r>
-    </w:p>
-    <w:p>
-      <w:r>
-        <w:t xml:space="preserve">With the strong induction proof in hand, it was now time to solve for the upper bound of $h$. We were able to show the upper bound of $h$ with simple </w:t>
-      </w:r>
-      <w:proofErr w:type="spellStart"/>
-      <w:r>
-        <w:t>algerbraic</w:t>
-      </w:r>
-      <w:proofErr w:type="spellEnd"/>
-      <w:r>
-        <w:t xml:space="preserve"> manipulation which results in $</w:t>
-      </w:r>
-      <w:r>
-        <w:t>h &lt; 2\log_2(</w:t>
-      </w:r>
-      <w:proofErr w:type="spellStart"/>
-      <w:r>
-        <w:t>N_</w:t>
-      </w:r>
-      <w:proofErr w:type="gramStart"/>
-      <w:r>
-        <w:t>h</w:t>
-      </w:r>
-      <w:proofErr w:type="spellEnd"/>
-      <w:r>
-        <w:t>)</w:t>
-      </w:r>
-      <w:r>
-        <w:t>$</w:t>
-      </w:r>
-      <w:proofErr w:type="gramEnd"/>
-      <w:r>
-        <w:t xml:space="preserve">. Using </w:t>
-      </w:r>
-      <w:proofErr w:type="spellStart"/>
-      <w:r>
-        <w:t>asmtotic</w:t>
-      </w:r>
-      <w:proofErr w:type="spellEnd"/>
-      <w:r>
-        <w:t xml:space="preserve"> notation we were able to derive the following:</w:t>
-      </w:r>
-    </w:p>
-    <w:p>
-      <w:r>
-        <w:t>\[</w:t>
-      </w:r>
-    </w:p>
-    <w:p>
-      <w:r>
-        <w:t xml:space="preserve">H \le </w:t>
-      </w:r>
-      <w:r>
-        <w:t>\</w:t>
-      </w:r>
-      <w:proofErr w:type="spellStart"/>
-      <w:r>
-        <w:t>mathcal</w:t>
-      </w:r>
-      <w:proofErr w:type="spellEnd"/>
-      <w:r>
-        <w:t>{O</w:t>
-      </w:r>
-      <w:proofErr w:type="gramStart"/>
-      <w:r>
-        <w:t>}(</w:t>
-      </w:r>
-      <w:proofErr w:type="gramEnd"/>
-      <w:r>
-        <w:t>\log n)</w:t>
-      </w:r>
-    </w:p>
-    <w:p>
-      <w:r>
-        <w:t>\]</w:t>
-      </w:r>
-    </w:p>
-    <w:p/>
-    <w:p>
-      <w:pPr>
-        <w:pStyle w:val="Heading3"/>
-      </w:pPr>
-      <w:r>
         <w:t>Big-O for Insertion, Deletion and Search</w:t>
       </w:r>
     </w:p>
@@ -1796,13 +1555,8 @@
     </w:p>
     <w:p>
       <w:r>
-        <w:t>T(n) = T_{Search}(\log(n)) + T_{</w:t>
-      </w:r>
-      <w:proofErr w:type="spellStart"/>
-      <w:r>
-        <w:t>RebalanceMetrics</w:t>
-      </w:r>
-      <w:proofErr w:type="spellEnd"/>
+        <w:t>T(n) = T_{Search}(\log(n)) + T_{RebalanceMetrics</w:t>
+      </w:r>
       <w:proofErr w:type="gramStart"/>
       <w:r>
         <w:t>}</w:t>
@@ -1815,15 +1569,7 @@
         <w:t>\log(n))</w:t>
       </w:r>
       <w:r>
-        <w:t xml:space="preserve"> = 2\</w:t>
-      </w:r>
-      <w:proofErr w:type="spellStart"/>
-      <w:r>
-        <w:t>cdot</w:t>
-      </w:r>
-      <w:proofErr w:type="spellEnd"/>
-      <w:r>
-        <w:t xml:space="preserve"> \log(n) = O(log(n))</w:t>
+        <w:t xml:space="preserve"> = 2\cdot \log(n) = O(log(n))</w:t>
       </w:r>
     </w:p>
     <w:p>
@@ -1833,102 +1579,97 @@
     </w:p>
     <w:p>
       <w:r>
+        <w:t>The above code outlines a recursive definition of our AVL insert function. We can break down this pseudo code into two phases. In the first phase, we search for a location to insert our new value. The search phase end</w:t>
+      </w:r>
+      <w:r>
+        <w:t>s</w:t>
+      </w:r>
+      <w:r>
+        <w:t xml:space="preserve"> only once we hit a leaf node, and we know this traversal will have $O(\log(n</w:t>
+      </w:r>
+      <w:proofErr w:type="gramStart"/>
+      <w:r>
+        <w:t>))$</w:t>
+      </w:r>
+      <w:proofErr w:type="gramEnd"/>
+      <w:r>
+        <w:t xml:space="preserve"> </w:t>
+      </w:r>
+      <w:proofErr w:type="gramStart"/>
+      <w:r>
+        <w:t>do</w:t>
+      </w:r>
+      <w:proofErr w:type="gramEnd"/>
+      <w:r>
+        <w:t xml:space="preserve"> to our height</w:t>
+      </w:r>
+      <w:r>
+        <w:t xml:space="preserve">. Once we hit our leaf </w:t>
+      </w:r>
+      <w:proofErr w:type="gramStart"/>
+      <w:r>
+        <w:t>node</w:t>
+      </w:r>
+      <w:proofErr w:type="gramEnd"/>
+      <w:r>
+        <w:t xml:space="preserve"> we will </w:t>
+      </w:r>
+      <w:proofErr w:type="gramStart"/>
+      <w:r>
+        <w:t>enter into</w:t>
+      </w:r>
+      <w:proofErr w:type="gramEnd"/>
+      <w:r>
+        <w:t xml:space="preserve"> phase two: `RebalanceMetrics`. In </w:t>
+      </w:r>
+      <w:r>
+        <w:t xml:space="preserve">this </w:t>
+      </w:r>
+      <w:r>
+        <w:t xml:space="preserve">phase we move back up our tree and while doing so we will update our height and check to make sure our tree is balanced. In this phase we are guaranteed to make no more than one rotation [CITE]. </w:t>
+      </w:r>
+      <w:r>
+        <w:t xml:space="preserve">Note that best case, worst case and average case for </w:t>
+      </w:r>
+      <w:r>
+        <w:t>inserting into</w:t>
+      </w:r>
+      <w:r>
+        <w:t xml:space="preserve"> AVL tree is always O(log(n)) since we </w:t>
+      </w:r>
+      <w:proofErr w:type="gramStart"/>
+      <w:r>
+        <w:t>must  traverse</w:t>
+      </w:r>
+      <w:proofErr w:type="gramEnd"/>
+      <w:r>
+        <w:t xml:space="preserve"> to the leaf node and back up again</w:t>
+      </w:r>
+      <w:r>
+        <w:t>.</w:t>
+      </w:r>
+    </w:p>
+    <w:p>
+      <w:pPr>
+        <w:ind w:firstLine="720"/>
+      </w:pPr>
+      <w:r>
+        <w:t>In our code base we used a recursive definition of an AVL insert which means each stack call contributes to our memory for a total of $O(log(n</w:t>
+      </w:r>
+      <w:proofErr w:type="gramStart"/>
+      <w:r>
+        <w:t>))$</w:t>
+      </w:r>
+      <w:proofErr w:type="gramEnd"/>
+      <w:r>
+        <w:t>. During each stack call,</w:t>
+      </w:r>
+      <w:r>
+        <w:t xml:space="preserve"> all </w:t>
+      </w:r>
+      <w:r>
         <w:lastRenderedPageBreak/>
-        <w:t>The above code outlines a recursive definition of our AVL insert function. We can break down this pseudo code into two phases. In the first phase, we search for a location to insert our new value. The search phase end</w:t>
-      </w:r>
-      <w:r>
-        <w:t>s</w:t>
-      </w:r>
-      <w:r>
-        <w:t xml:space="preserve"> only once we hit a leaf node, and we know this traversal will have $O(\log(n</w:t>
-      </w:r>
-      <w:proofErr w:type="gramStart"/>
-      <w:r>
-        <w:t>))$</w:t>
-      </w:r>
-      <w:proofErr w:type="gramEnd"/>
-      <w:r>
-        <w:t xml:space="preserve"> </w:t>
-      </w:r>
-      <w:proofErr w:type="gramStart"/>
-      <w:r>
-        <w:t>do</w:t>
-      </w:r>
-      <w:proofErr w:type="gramEnd"/>
-      <w:r>
-        <w:t xml:space="preserve"> to our height</w:t>
-      </w:r>
-      <w:r>
-        <w:t xml:space="preserve">. Once we hit our leaf </w:t>
-      </w:r>
-      <w:proofErr w:type="gramStart"/>
-      <w:r>
-        <w:t>node</w:t>
-      </w:r>
-      <w:proofErr w:type="gramEnd"/>
-      <w:r>
-        <w:t xml:space="preserve"> we will </w:t>
-      </w:r>
-      <w:proofErr w:type="gramStart"/>
-      <w:r>
-        <w:t>enter into</w:t>
-      </w:r>
-      <w:proofErr w:type="gramEnd"/>
-      <w:r>
-        <w:t xml:space="preserve"> phase two: `</w:t>
-      </w:r>
-      <w:proofErr w:type="spellStart"/>
-      <w:r>
-        <w:t>RebalanceMetrics</w:t>
-      </w:r>
-      <w:proofErr w:type="spellEnd"/>
-      <w:r>
-        <w:t xml:space="preserve">`. In </w:t>
-      </w:r>
-      <w:r>
-        <w:t xml:space="preserve">this </w:t>
-      </w:r>
-      <w:r>
-        <w:t xml:space="preserve">phase we move back up our tree and while doing so we will update our height and check to make sure our tree is balanced. In this phase we are guaranteed to make no more than one rotation [CITE]. </w:t>
-      </w:r>
-      <w:r>
-        <w:t xml:space="preserve">Note that best case, worst case and average case for </w:t>
-      </w:r>
-      <w:r>
-        <w:t>inserting into</w:t>
-      </w:r>
-      <w:r>
-        <w:t xml:space="preserve"> AVL tree is always O(log(n)) since we </w:t>
-      </w:r>
-      <w:proofErr w:type="gramStart"/>
-      <w:r>
-        <w:t>must  traverse</w:t>
-      </w:r>
-      <w:proofErr w:type="gramEnd"/>
-      <w:r>
-        <w:t xml:space="preserve"> to the leaf node and back up again</w:t>
-      </w:r>
-      <w:r>
-        <w:t>.</w:t>
-      </w:r>
-    </w:p>
-    <w:p>
-      <w:pPr>
-        <w:ind w:firstLine="720"/>
-      </w:pPr>
-      <w:r>
-        <w:t>In our code base we used a recursive definition of an AVL insert which means each stack call contributes to our memory for a total of $O(log(n</w:t>
-      </w:r>
-      <w:proofErr w:type="gramStart"/>
-      <w:r>
-        <w:t>))$</w:t>
-      </w:r>
-      <w:proofErr w:type="gramEnd"/>
-      <w:r>
-        <w:t>. During each stack call,</w:t>
-      </w:r>
-      <w:r>
-        <w:t xml:space="preserve"> all space operation </w:t>
+        <w:t xml:space="preserve">space operation </w:t>
       </w:r>
       <w:proofErr w:type="gramStart"/>
       <w:r>
@@ -2076,7 +1817,6 @@
     </w:p>
     <w:p>
       <w:r>
-        <w:lastRenderedPageBreak/>
         <w:tab/>
         <w:t>Our search definition uses an</w:t>
       </w:r>
@@ -2111,6 +1851,7 @@
         <w:pStyle w:val="Heading4"/>
       </w:pPr>
       <w:r>
+        <w:lastRenderedPageBreak/>
         <w:t>Delete</w:t>
       </w:r>
       <w:r>
@@ -2177,11 +1918,9 @@
       <w:r>
         <w:t>T_{</w:t>
       </w:r>
-      <w:proofErr w:type="spellStart"/>
       <w:r>
         <w:t>FindReplacement</w:t>
       </w:r>
-      <w:proofErr w:type="spellEnd"/>
       <w:r>
         <w:t>}(</w:t>
       </w:r>
@@ -2196,11 +1935,9 @@
       <w:r>
         <w:t>T_{</w:t>
       </w:r>
-      <w:proofErr w:type="spellStart"/>
       <w:r>
         <w:t>MetricsRotations</w:t>
       </w:r>
-      <w:proofErr w:type="spellEnd"/>
       <w:r>
         <w:t>}(</w:t>
       </w:r>
@@ -2215,15 +1952,7 @@
         <w:t>3</w:t>
       </w:r>
       <w:r>
-        <w:t>\</w:t>
-      </w:r>
-      <w:proofErr w:type="spellStart"/>
-      <w:r>
-        <w:t>cdot</w:t>
-      </w:r>
-      <w:proofErr w:type="spellEnd"/>
-      <w:r>
-        <w:t xml:space="preserve"> \log(n) = O(log(n))</w:t>
+        <w:t>\cdot \log(n) = O(log(n))</w:t>
       </w:r>
     </w:p>
     <w:p>
@@ -2271,15 +2000,7 @@
         <w:t xml:space="preserve"> phases. In the first phase, we move down the down to the node we </w:t>
       </w:r>
       <w:r>
-        <w:t xml:space="preserve">want to delete which </w:t>
-      </w:r>
-      <w:proofErr w:type="spellStart"/>
-      <w:r>
-        <w:t>undert</w:t>
-      </w:r>
-      <w:proofErr w:type="spellEnd"/>
-      <w:r>
-        <w:t xml:space="preserve"> the worst case is $O(log(n</w:t>
+        <w:t>want to delete which undert the worst case is $O(log(n</w:t>
       </w:r>
       <w:proofErr w:type="gramStart"/>
       <w:r>
@@ -2330,34 +2051,31 @@
       </w:r>
       <w:proofErr w:type="gramEnd"/>
       <w:r>
-        <w:t xml:space="preserve"> keep our BST structure. In our final phase we move back up our tree and recalculate height and perform any necessary rotations. Unlike insertion, which at most can cause two rotations, deleting can </w:t>
-      </w:r>
+        <w:t xml:space="preserve"> keep our BST structure. In our final phase we move back up our tree and recalculate height and perform any necessary rotations. Unlike insertion, which at most can cause two rotations, deleting can have a cascading effect which will cause $log(n)$ rotations</w:t>
+      </w:r>
+      <w:r>
+        <w:t xml:space="preserve">. Taken together we arrive with a worst case of log(n) which is outlines in the above equation. Unfortunately, since we </w:t>
+      </w:r>
+      <w:proofErr w:type="gramStart"/>
+      <w:r>
+        <w:t>have to</w:t>
+      </w:r>
+      <w:proofErr w:type="gramEnd"/>
+      <w:r>
+        <w:t xml:space="preserve"> always find a replacement node for our deletions, our best and average case </w:t>
+      </w:r>
+      <w:proofErr w:type="gramStart"/>
+      <w:r>
+        <w:t>will be also be</w:t>
+      </w:r>
+      <w:proofErr w:type="gramEnd"/>
+      <w:r>
+        <w:t xml:space="preserve"> $Log(n)$</w:t>
+      </w:r>
+    </w:p>
+    <w:p>
       <w:r>
         <w:lastRenderedPageBreak/>
-        <w:t>have a cascading effect which will cause $log(n)$ rotations</w:t>
-      </w:r>
-      <w:r>
-        <w:t xml:space="preserve">. Taken together we arrive with a worst case of log(n) which is outlines in the above equation. Unfortunately, since we </w:t>
-      </w:r>
-      <w:proofErr w:type="gramStart"/>
-      <w:r>
-        <w:t>have to</w:t>
-      </w:r>
-      <w:proofErr w:type="gramEnd"/>
-      <w:r>
-        <w:t xml:space="preserve"> always find a replacement node for our deletions, our best and average case </w:t>
-      </w:r>
-      <w:proofErr w:type="gramStart"/>
-      <w:r>
-        <w:t>will be also be</w:t>
-      </w:r>
-      <w:proofErr w:type="gramEnd"/>
-      <w:r>
-        <w:t xml:space="preserve"> $Log(n)$</w:t>
-      </w:r>
-    </w:p>
-    <w:p>
-      <w:r>
         <w:tab/>
         <w:t xml:space="preserve">Our definition of deletion uses recursion which means each </w:t>
       </w:r>
@@ -2461,37 +2179,24 @@
       <w:r>
         <w:t>T{</w:t>
       </w:r>
-      <w:proofErr w:type="spellStart"/>
-      <w:r>
-        <w:t>RebalanceHeight</w:t>
-      </w:r>
-      <w:proofErr w:type="spellEnd"/>
+      <w:r>
+        <w:t xml:space="preserve">RebalanceHeight </w:t>
+      </w:r>
+      <w:r>
+        <w:t>}</w:t>
+      </w:r>
+      <w:proofErr w:type="gramEnd"/>
+      <w:r>
+        <w:t>(\log(n))</w:t>
+      </w:r>
       <w:r>
         <w:t xml:space="preserve"> </w:t>
       </w:r>
       <w:r>
-        <w:t>}</w:t>
-      </w:r>
-      <w:proofErr w:type="gramEnd"/>
-      <w:r>
-        <w:t>(\log(n))</w:t>
-      </w:r>
-      <w:r>
-        <w:t xml:space="preserve"> </w:t>
-      </w:r>
-      <w:r>
         <w:t>$</w:t>
       </w:r>
       <w:r>
-        <w:t xml:space="preserve"> = 3 \</w:t>
-      </w:r>
-      <w:proofErr w:type="spellStart"/>
-      <w:r>
-        <w:t>cdot</w:t>
-      </w:r>
-      <w:proofErr w:type="spellEnd"/>
-      <w:r>
-        <w:t xml:space="preserve"> log(n) = O(log(n))</w:t>
+        <w:t xml:space="preserve"> = 3 \cdot log(n) = O(log(n))</w:t>
       </w:r>
     </w:p>
     <w:p>
@@ -2573,7 +2278,6 @@
         <w:pStyle w:val="Heading3"/>
       </w:pPr>
       <w:r>
-        <w:lastRenderedPageBreak/>
         <w:t>Experimental Design</w:t>
       </w:r>
     </w:p>
@@ -2627,7 +2331,11 @@
         <w:t>various</w:t>
       </w:r>
       <w:r>
-        <w:t xml:space="preserve"> blocking criteria. This design allowed us to have an expansive empirical analysis, and furthermore, gave us room to expand our analysis in the future. Below we will discuss each</w:t>
+        <w:t xml:space="preserve"> blocking criteria. This design allowed us to have an expansive empirical analysis, and furthermore, gave us room </w:t>
+      </w:r>
+      <w:r>
+        <w:lastRenderedPageBreak/>
+        <w:t>to expand our analysis in the future. Below we will discuss each</w:t>
       </w:r>
       <w:r>
         <w:t xml:space="preserve"> </w:t>
@@ -2752,15 +2460,7 @@
       </w:r>
       <w:proofErr w:type="gramEnd"/>
       <w:r>
-        <w:t xml:space="preserve"> BST. It should be noted that we add our value back in after deletion </w:t>
-      </w:r>
-      <w:proofErr w:type="spellStart"/>
-      <w:r>
-        <w:t>inorder</w:t>
-      </w:r>
-      <w:proofErr w:type="spellEnd"/>
-      <w:r>
-        <w:t xml:space="preserve"> to preserve our values of $n$.</w:t>
+        <w:t xml:space="preserve"> BST. It should be noted that we add our value back in after deletion inorder to preserve our values of $n$.</w:t>
       </w:r>
     </w:p>
     <w:p>
@@ -2768,7 +2468,6 @@
         <w:pStyle w:val="Heading4"/>
       </w:pPr>
       <w:r>
-        <w:lastRenderedPageBreak/>
         <w:t>Metrics:</w:t>
       </w:r>
     </w:p>
@@ -2849,6 +2548,7 @@
         </w:numPr>
       </w:pPr>
       <w:r>
+        <w:lastRenderedPageBreak/>
         <w:t>Custom: This metric was a placeholder for a metric specific to the BST in question. For our experiment, we used this place holder metric to count the number of rotations an AVL made during an operation</w:t>
       </w:r>
     </w:p>
@@ -2936,15 +2636,7 @@
         <w:t>s</w:t>
       </w:r>
       <w:r>
-        <w:t xml:space="preserve">ite </w:t>
-      </w:r>
-      <w:proofErr w:type="spellStart"/>
-      <w:r>
-        <w:t>GeekForGeeks</w:t>
-      </w:r>
-      <w:proofErr w:type="spellEnd"/>
-      <w:r>
-        <w:t xml:space="preserve"> </w:t>
+        <w:t xml:space="preserve">ite GeekForGeeks </w:t>
       </w:r>
       <w:r>
         <w:t>which we</w:t>
@@ -2953,15 +2645,7 @@
         <w:t xml:space="preserve"> then converted to C code (CITE)(CITE)(CITE). </w:t>
       </w:r>
       <w:r>
-        <w:t xml:space="preserve">Using </w:t>
-      </w:r>
-      <w:proofErr w:type="spellStart"/>
-      <w:r>
-        <w:t>GeekForGeeks</w:t>
-      </w:r>
-      <w:proofErr w:type="spellEnd"/>
-      <w:r>
-        <w:t xml:space="preserve">’ Python code </w:t>
+        <w:t xml:space="preserve">Using GeekForGeeks’ Python code </w:t>
       </w:r>
       <w:proofErr w:type="gramStart"/>
       <w:r>
@@ -2979,12 +2663,10 @@
       <w:r>
         <w:t xml:space="preserve"> converting it to </w:t>
       </w:r>
-      <w:proofErr w:type="spellStart"/>
       <w:proofErr w:type="gramStart"/>
       <w:r>
         <w:t>provided</w:t>
       </w:r>
-      <w:proofErr w:type="spellEnd"/>
       <w:proofErr w:type="gramEnd"/>
       <w:r>
         <w:t xml:space="preserve"> </w:t>
@@ -3026,11 +2708,7 @@
       </w:r>
       <w:proofErr w:type="gramEnd"/>
       <w:r>
-        <w:t xml:space="preserve"> generalize the code base. Although, our AVL and BST share a common framework, due to time we were unable to create </w:t>
-      </w:r>
-      <w:r>
-        <w:lastRenderedPageBreak/>
-        <w:t xml:space="preserve">generics for them. Having generics would make our dry and would make our implementation more modular. </w:t>
+        <w:t xml:space="preserve"> generalize the code base. Although, our AVL and BST share a common framework, due to time we were unable to create generics for them. Having generics would make our dry and would make our implementation more modular. </w:t>
       </w:r>
     </w:p>
     <w:p>
@@ -3096,49 +2774,27 @@
       </w:r>
       <w:proofErr w:type="gramEnd"/>
       <w:r>
-        <w:t xml:space="preserve"> which was then called by our main function. Each benchmarking was composed of two private functions: `</w:t>
-      </w:r>
-      <w:r>
-        <w:t>__</w:t>
-      </w:r>
-      <w:proofErr w:type="spellStart"/>
-      <w:r>
-        <w:t>get_regular_operation_time</w:t>
-      </w:r>
-      <w:proofErr w:type="spellEnd"/>
-      <w:r>
-        <w:t xml:space="preserve">`, running experiments for searching and </w:t>
-      </w:r>
-      <w:proofErr w:type="spellStart"/>
-      <w:r>
-        <w:t>delting</w:t>
-      </w:r>
-      <w:proofErr w:type="spellEnd"/>
-      <w:r>
-        <w:t xml:space="preserve"> data; and `</w:t>
-      </w:r>
-      <w:r>
-        <w:t>__</w:t>
-      </w:r>
-      <w:proofErr w:type="spellStart"/>
-      <w:r>
-        <w:t>get_insertion_time</w:t>
-      </w:r>
-      <w:proofErr w:type="spellEnd"/>
+        <w:t xml:space="preserve"> which was then called by </w:t>
+      </w:r>
+      <w:r>
+        <w:lastRenderedPageBreak/>
+        <w:t>our main function. Each benchmarking was composed of two private functions: `</w:t>
+      </w:r>
+      <w:r>
+        <w:t>__get_regular_operation_time</w:t>
+      </w:r>
+      <w:r>
+        <w:t>`, running experiments for searching and delting data; and `</w:t>
+      </w:r>
+      <w:r>
+        <w:t>__get_insertion_time</w:t>
+      </w:r>
       <w:r>
         <w:t>`, which tracked the runtime for inserting value. To run an experiment the user needs to call `make main` and then call `</w:t>
       </w:r>
       <w:proofErr w:type="gramStart"/>
       <w:r>
-        <w:t>.\</w:t>
-      </w:r>
-      <w:proofErr w:type="spellStart"/>
-      <w:r>
-        <w:t>main.out</w:t>
-      </w:r>
-      <w:proofErr w:type="spellEnd"/>
-      <w:r>
-        <w:t xml:space="preserve"> .</w:t>
+        <w:t>.\main.out .</w:t>
       </w:r>
       <w:proofErr w:type="gramEnd"/>
       <w:r>
@@ -3150,15 +2806,7 @@
       </w:r>
       <w:proofErr w:type="gramEnd"/>
       <w:r>
-        <w:t xml:space="preserve"> </w:t>
-      </w:r>
-      <w:proofErr w:type="spellStart"/>
-      <w:r>
-        <w:t>to</w:t>
-      </w:r>
-      <w:proofErr w:type="spellEnd"/>
-      <w:r>
-        <w:t xml:space="preserve"> control the experiment </w:t>
+        <w:t xml:space="preserve"> to control the experiment </w:t>
       </w:r>
       <w:proofErr w:type="gramStart"/>
       <w:r>
@@ -3226,7 +2874,6 @@
         <w:pStyle w:val="Heading3"/>
       </w:pPr>
       <w:r>
-        <w:lastRenderedPageBreak/>
         <w:t>Operation Counts Vs Function Call</w:t>
       </w:r>
     </w:p>
@@ -3359,6 +3006,7 @@
         <w:pStyle w:val="Heading3"/>
       </w:pPr>
       <w:r>
+        <w:lastRenderedPageBreak/>
         <w:t>Height Vs Number of Nodes</w:t>
       </w:r>
     </w:p>
@@ -3438,11 +3086,7 @@
         <w:t>again see</w:t>
       </w:r>
       <w:r>
-        <w:t xml:space="preserve"> a stepping </w:t>
-      </w:r>
-      <w:r>
-        <w:lastRenderedPageBreak/>
-        <w:t xml:space="preserve">pattern which represents our tree acquiring another level. </w:t>
+        <w:t xml:space="preserve"> a stepping pattern which represents our tree acquiring another level. </w:t>
       </w:r>
       <w:r>
         <w:t xml:space="preserve">We expect each step to get larger as the tree </w:t>
@@ -3526,7 +3170,11 @@
         <w:t>s</w:t>
       </w:r>
       <w:r>
-        <w:t>. The first thing to note is the AVL in order insertion column.</w:t>
+        <w:t xml:space="preserve">. The first </w:t>
+      </w:r>
+      <w:r>
+        <w:lastRenderedPageBreak/>
+        <w:t>thing to note is the AVL in order insertion column.</w:t>
       </w:r>
       <w:r>
         <w:t xml:space="preserve"> This column showed that in order insertions caused 1 rotation</w:t>
@@ -3564,15 +3212,7 @@
       </w:r>
       <w:proofErr w:type="gramEnd"/>
       <w:r>
-        <w:t xml:space="preserve">” which must be corrected with a </w:t>
-      </w:r>
-      <w:proofErr w:type="spellStart"/>
-      <w:r>
-        <w:t>coresponding</w:t>
-      </w:r>
-      <w:proofErr w:type="spellEnd"/>
-      <w:r>
-        <w:t xml:space="preserve"> rotation. Brown’s work showed that a sorted AVL tree caused a nearly 2 times increase in </w:t>
+        <w:t xml:space="preserve">” which must be corrected with a coresponding rotation. Brown’s work showed that a sorted AVL tree caused a nearly 2 times increase in </w:t>
       </w:r>
       <w:proofErr w:type="gramStart"/>
       <w:r>
@@ -3597,7 +3237,6 @@
         <w:pStyle w:val="Heading3"/>
       </w:pPr>
       <w:r>
-        <w:lastRenderedPageBreak/>
         <w:t>Linear Regression</w:t>
       </w:r>
       <w:r>
@@ -3650,23 +3289,7 @@
     </w:p>
     <w:p>
       <w:r>
-        <w:t>Operations = c_1 \</w:t>
-      </w:r>
-      <w:proofErr w:type="spellStart"/>
-      <w:r>
-        <w:t>cdot</w:t>
-      </w:r>
-      <w:proofErr w:type="spellEnd"/>
-      <w:r>
-        <w:t xml:space="preserve"> \log(n) + c_2 =22 \c </w:t>
-      </w:r>
-      <w:proofErr w:type="spellStart"/>
-      <w:r>
-        <w:t>dotlog</w:t>
-      </w:r>
-      <w:proofErr w:type="spellEnd"/>
-      <w:r>
-        <w:t>(n) + 291</w:t>
+        <w:t>Operations = c_1 \cdot \log(n) + c_2 =22 \c dotlog(n) + 291</w:t>
       </w:r>
     </w:p>
     <w:p>
@@ -3705,13 +3328,8 @@
         <w:t xml:space="preserve"> for insertion. Our results and equation can be found above and additional information</w:t>
       </w:r>
       <w:r>
-        <w:t xml:space="preserve"> for our experiment can be found in the </w:t>
-      </w:r>
-      <w:proofErr w:type="spellStart"/>
-      <w:r>
-        <w:t>appendic</w:t>
-      </w:r>
-      <w:proofErr w:type="spellEnd"/>
+        <w:t xml:space="preserve"> for our experiment can be found in the appendic</w:t>
+      </w:r>
       <w:r>
         <w:t xml:space="preserve">. </w:t>
       </w:r>
@@ -3744,13 +3362,8 @@
         <w:t xml:space="preserve">reveals how important a theoretical analysis is for any study. </w:t>
       </w:r>
       <w:r>
-        <w:t xml:space="preserve">Data for an </w:t>
-      </w:r>
-      <w:proofErr w:type="spellStart"/>
-      <w:r>
-        <w:t>empircal</w:t>
-      </w:r>
-      <w:proofErr w:type="spellEnd"/>
+        <w:t>Data for an empircal</w:t>
+      </w:r>
       <w:r>
         <w:t xml:space="preserve"> analysis </w:t>
       </w:r>
@@ -3795,7 +3408,11 @@
         <w:t xml:space="preserve">slight </w:t>
       </w:r>
       <w:r>
-        <w:t>stepping pattern in our residual plot. This stepping pattern can be explained with the height of our tree increasing for specific ranges of $n$. In summary</w:t>
+        <w:t xml:space="preserve">stepping pattern in our residual plot. This stepping pattern can be explained with the height </w:t>
+      </w:r>
+      <w:r>
+        <w:lastRenderedPageBreak/>
+        <w:t>of our tree increasing for specific ranges of $n$. In summary</w:t>
       </w:r>
       <w:r>
         <w:t xml:space="preserve">, our model shows $log(n)$ performance which algins with our theoretical analysis. </w:t>
@@ -3813,7 +3430,6 @@
         <w:pStyle w:val="Heading2"/>
       </w:pPr>
       <w:r>
-        <w:lastRenderedPageBreak/>
         <w:t>Appendix</w:t>
       </w:r>
     </w:p>
@@ -4078,16 +3694,8 @@
           <w:rPr>
             <w:rStyle w:val="Hyperlink"/>
           </w:rPr>
-          <w:t xml:space="preserve"> Tree - </w:t>
+          <w:t xml:space="preserve"> Tree - GeeksforGeeks</w:t>
         </w:r>
-        <w:proofErr w:type="spellStart"/>
-        <w:r>
-          <w:rPr>
-            <w:rStyle w:val="Hyperlink"/>
-          </w:rPr>
-          <w:t>GeeksforGeeks</w:t>
-        </w:r>
-        <w:proofErr w:type="spellEnd"/>
       </w:hyperlink>
     </w:p>
     <w:p>
@@ -4212,6 +3820,155 @@
 <file path=word/numbering.xml><?xml version="1.0" encoding="utf-8"?>
 <w:numbering xmlns:wpc="http://schemas.microsoft.com/office/word/2010/wordprocessingCanvas" xmlns:cx="http://schemas.microsoft.com/office/drawing/2014/chartex" xmlns:cx1="http://schemas.microsoft.com/office/drawing/2015/9/8/chartex" xmlns:cx2="http://schemas.microsoft.com/office/drawing/2015/10/21/chartex" xmlns:cx3="http://schemas.microsoft.com/office/drawing/2016/5/9/chartex" xmlns:cx4="http://schemas.microsoft.com/office/drawing/2016/5/10/chartex" xmlns:cx5="http://schemas.microsoft.com/office/drawing/2016/5/11/chartex" xmlns:cx6="http://schemas.microsoft.com/office/drawing/2016/5/12/chartex" xmlns:cx7="http://schemas.microsoft.com/office/drawing/2016/5/13/chartex" xmlns:cx8="http://schemas.microsoft.com/office/drawing/2016/5/14/chartex" xmlns:mc="http://schemas.openxmlformats.org/markup-compatibility/2006" xmlns:aink="http://schemas.microsoft.com/office/drawing/2016/ink" xmlns:am3d="http://schemas.microsoft.com/office/drawing/2017/model3d" xmlns:o="urn:schemas-microsoft-com:office:office" xmlns:oel="http://schemas.microsoft.com/office/2019/extlst" xmlns:r="http://schemas.openxmlformats.org/officeDocument/2006/relationships" xmlns:m="http://schemas.openxmlformats.org/officeDocument/2006/math" xmlns:v="urn:schemas-microsoft-com:vml" xmlns:wp14="http://schemas.microsoft.com/office/word/2010/wordprocessingDrawing" xmlns:wp="http://schemas.openxmlformats.org/drawingml/2006/wordprocessingDrawing" xmlns:w10="urn:schemas-microsoft-com:office:word" xmlns:w="http://schemas.openxmlformats.org/wordprocessingml/2006/main" xmlns:w14="http://schemas.microsoft.com/office/word/2010/wordml" xmlns:w15="http://schemas.microsoft.com/office/word/2012/wordml" xmlns:w16cex="http://schemas.microsoft.com/office/word/2018/wordml/cex" xmlns:w16cid="http://schemas.microsoft.com/office/word/2016/wordml/cid" xmlns:w16="http://schemas.microsoft.com/office/word/2018/wordml" xmlns:w16du="http://schemas.microsoft.com/office/word/2023/wordml/word16du" xmlns:w16sdtdh="http://schemas.microsoft.com/office/word/2020/wordml/sdtdatahash" xmlns:w16sdtfl="http://schemas.microsoft.com/office/word/2024/wordml/sdtformatlock" xmlns:w16se="http://schemas.microsoft.com/office/word/2015/wordml/symex" xmlns:wpg="http://schemas.microsoft.com/office/word/2010/wordprocessingGroup" xmlns:wpi="http://schemas.microsoft.com/office/word/2010/wordprocessingInk" xmlns:wne="http://schemas.microsoft.com/office/word/2006/wordml" xmlns:wps="http://schemas.microsoft.com/office/word/2010/wordprocessingShape" mc:Ignorable="w14 w15 w16se w16cid w16 w16cex w16sdtdh w16sdtfl w16du wp14">
   <w:abstractNum w:abstractNumId="0" w15:restartNumberingAfterBreak="0">
+    <w:nsid w:val="114A7902"/>
+    <w:multiLevelType w:val="multilevel"/>
+    <w:tmpl w:val="45A42C98"/>
+    <w:lvl w:ilvl="0">
+      <w:start w:val="1"/>
+      <w:numFmt w:val="bullet"/>
+      <w:lvlText w:val=""/>
+      <w:lvlJc w:val="left"/>
+      <w:pPr>
+        <w:tabs>
+          <w:tab w:val="num" w:pos="720"/>
+        </w:tabs>
+        <w:ind w:left="720" w:hanging="360"/>
+      </w:pPr>
+      <w:rPr>
+        <w:rFonts w:ascii="Symbol" w:hAnsi="Symbol" w:hint="default"/>
+        <w:sz w:val="20"/>
+      </w:rPr>
+    </w:lvl>
+    <w:lvl w:ilvl="1" w:tentative="1">
+      <w:start w:val="1"/>
+      <w:numFmt w:val="bullet"/>
+      <w:lvlText w:val="o"/>
+      <w:lvlJc w:val="left"/>
+      <w:pPr>
+        <w:tabs>
+          <w:tab w:val="num" w:pos="1440"/>
+        </w:tabs>
+        <w:ind w:left="1440" w:hanging="360"/>
+      </w:pPr>
+      <w:rPr>
+        <w:rFonts w:ascii="Courier New" w:hAnsi="Courier New" w:hint="default"/>
+        <w:sz w:val="20"/>
+      </w:rPr>
+    </w:lvl>
+    <w:lvl w:ilvl="2" w:tentative="1">
+      <w:start w:val="1"/>
+      <w:numFmt w:val="bullet"/>
+      <w:lvlText w:val=""/>
+      <w:lvlJc w:val="left"/>
+      <w:pPr>
+        <w:tabs>
+          <w:tab w:val="num" w:pos="2160"/>
+        </w:tabs>
+        <w:ind w:left="2160" w:hanging="360"/>
+      </w:pPr>
+      <w:rPr>
+        <w:rFonts w:ascii="Wingdings" w:hAnsi="Wingdings" w:hint="default"/>
+        <w:sz w:val="20"/>
+      </w:rPr>
+    </w:lvl>
+    <w:lvl w:ilvl="3" w:tentative="1">
+      <w:start w:val="1"/>
+      <w:numFmt w:val="bullet"/>
+      <w:lvlText w:val=""/>
+      <w:lvlJc w:val="left"/>
+      <w:pPr>
+        <w:tabs>
+          <w:tab w:val="num" w:pos="2880"/>
+        </w:tabs>
+        <w:ind w:left="2880" w:hanging="360"/>
+      </w:pPr>
+      <w:rPr>
+        <w:rFonts w:ascii="Wingdings" w:hAnsi="Wingdings" w:hint="default"/>
+        <w:sz w:val="20"/>
+      </w:rPr>
+    </w:lvl>
+    <w:lvl w:ilvl="4" w:tentative="1">
+      <w:start w:val="1"/>
+      <w:numFmt w:val="bullet"/>
+      <w:lvlText w:val=""/>
+      <w:lvlJc w:val="left"/>
+      <w:pPr>
+        <w:tabs>
+          <w:tab w:val="num" w:pos="3600"/>
+        </w:tabs>
+        <w:ind w:left="3600" w:hanging="360"/>
+      </w:pPr>
+      <w:rPr>
+        <w:rFonts w:ascii="Wingdings" w:hAnsi="Wingdings" w:hint="default"/>
+        <w:sz w:val="20"/>
+      </w:rPr>
+    </w:lvl>
+    <w:lvl w:ilvl="5" w:tentative="1">
+      <w:start w:val="1"/>
+      <w:numFmt w:val="bullet"/>
+      <w:lvlText w:val=""/>
+      <w:lvlJc w:val="left"/>
+      <w:pPr>
+        <w:tabs>
+          <w:tab w:val="num" w:pos="4320"/>
+        </w:tabs>
+        <w:ind w:left="4320" w:hanging="360"/>
+      </w:pPr>
+      <w:rPr>
+        <w:rFonts w:ascii="Wingdings" w:hAnsi="Wingdings" w:hint="default"/>
+        <w:sz w:val="20"/>
+      </w:rPr>
+    </w:lvl>
+    <w:lvl w:ilvl="6" w:tentative="1">
+      <w:start w:val="1"/>
+      <w:numFmt w:val="bullet"/>
+      <w:lvlText w:val=""/>
+      <w:lvlJc w:val="left"/>
+      <w:pPr>
+        <w:tabs>
+          <w:tab w:val="num" w:pos="5040"/>
+        </w:tabs>
+        <w:ind w:left="5040" w:hanging="360"/>
+      </w:pPr>
+      <w:rPr>
+        <w:rFonts w:ascii="Wingdings" w:hAnsi="Wingdings" w:hint="default"/>
+        <w:sz w:val="20"/>
+      </w:rPr>
+    </w:lvl>
+    <w:lvl w:ilvl="7" w:tentative="1">
+      <w:start w:val="1"/>
+      <w:numFmt w:val="bullet"/>
+      <w:lvlText w:val=""/>
+      <w:lvlJc w:val="left"/>
+      <w:pPr>
+        <w:tabs>
+          <w:tab w:val="num" w:pos="5760"/>
+        </w:tabs>
+        <w:ind w:left="5760" w:hanging="360"/>
+      </w:pPr>
+      <w:rPr>
+        <w:rFonts w:ascii="Wingdings" w:hAnsi="Wingdings" w:hint="default"/>
+        <w:sz w:val="20"/>
+      </w:rPr>
+    </w:lvl>
+    <w:lvl w:ilvl="8" w:tentative="1">
+      <w:start w:val="1"/>
+      <w:numFmt w:val="bullet"/>
+      <w:lvlText w:val=""/>
+      <w:lvlJc w:val="left"/>
+      <w:pPr>
+        <w:tabs>
+          <w:tab w:val="num" w:pos="6480"/>
+        </w:tabs>
+        <w:ind w:left="6480" w:hanging="360"/>
+      </w:pPr>
+      <w:rPr>
+        <w:rFonts w:ascii="Wingdings" w:hAnsi="Wingdings" w:hint="default"/>
+        <w:sz w:val="20"/>
+      </w:rPr>
+    </w:lvl>
+  </w:abstractNum>
+  <w:abstractNum w:abstractNumId="1" w15:restartNumberingAfterBreak="0">
     <w:nsid w:val="1A4C0467"/>
     <w:multiLevelType w:val="hybridMultilevel"/>
     <w:tmpl w:val="3536C0F4"/>
@@ -4324,7 +4081,7 @@
       </w:rPr>
     </w:lvl>
   </w:abstractNum>
-  <w:abstractNum w:abstractNumId="1" w15:restartNumberingAfterBreak="0">
+  <w:abstractNum w:abstractNumId="2" w15:restartNumberingAfterBreak="0">
     <w:nsid w:val="285F03BF"/>
     <w:multiLevelType w:val="hybridMultilevel"/>
     <w:tmpl w:val="92BCC01A"/>
@@ -4413,7 +4170,7 @@
       </w:pPr>
     </w:lvl>
   </w:abstractNum>
-  <w:abstractNum w:abstractNumId="2" w15:restartNumberingAfterBreak="0">
+  <w:abstractNum w:abstractNumId="3" w15:restartNumberingAfterBreak="0">
     <w:nsid w:val="309D401B"/>
     <w:multiLevelType w:val="hybridMultilevel"/>
     <w:tmpl w:val="C55CDD2E"/>
@@ -4502,7 +4259,156 @@
       </w:pPr>
     </w:lvl>
   </w:abstractNum>
-  <w:abstractNum w:abstractNumId="3" w15:restartNumberingAfterBreak="0">
+  <w:abstractNum w:abstractNumId="4" w15:restartNumberingAfterBreak="0">
+    <w:nsid w:val="38BD64D5"/>
+    <w:multiLevelType w:val="multilevel"/>
+    <w:tmpl w:val="392A66D6"/>
+    <w:lvl w:ilvl="0">
+      <w:start w:val="1"/>
+      <w:numFmt w:val="bullet"/>
+      <w:lvlText w:val=""/>
+      <w:lvlJc w:val="left"/>
+      <w:pPr>
+        <w:tabs>
+          <w:tab w:val="num" w:pos="720"/>
+        </w:tabs>
+        <w:ind w:left="720" w:hanging="360"/>
+      </w:pPr>
+      <w:rPr>
+        <w:rFonts w:ascii="Symbol" w:hAnsi="Symbol" w:hint="default"/>
+        <w:sz w:val="20"/>
+      </w:rPr>
+    </w:lvl>
+    <w:lvl w:ilvl="1" w:tentative="1">
+      <w:start w:val="1"/>
+      <w:numFmt w:val="bullet"/>
+      <w:lvlText w:val="o"/>
+      <w:lvlJc w:val="left"/>
+      <w:pPr>
+        <w:tabs>
+          <w:tab w:val="num" w:pos="1440"/>
+        </w:tabs>
+        <w:ind w:left="1440" w:hanging="360"/>
+      </w:pPr>
+      <w:rPr>
+        <w:rFonts w:ascii="Courier New" w:hAnsi="Courier New" w:hint="default"/>
+        <w:sz w:val="20"/>
+      </w:rPr>
+    </w:lvl>
+    <w:lvl w:ilvl="2" w:tentative="1">
+      <w:start w:val="1"/>
+      <w:numFmt w:val="bullet"/>
+      <w:lvlText w:val=""/>
+      <w:lvlJc w:val="left"/>
+      <w:pPr>
+        <w:tabs>
+          <w:tab w:val="num" w:pos="2160"/>
+        </w:tabs>
+        <w:ind w:left="2160" w:hanging="360"/>
+      </w:pPr>
+      <w:rPr>
+        <w:rFonts w:ascii="Wingdings" w:hAnsi="Wingdings" w:hint="default"/>
+        <w:sz w:val="20"/>
+      </w:rPr>
+    </w:lvl>
+    <w:lvl w:ilvl="3" w:tentative="1">
+      <w:start w:val="1"/>
+      <w:numFmt w:val="bullet"/>
+      <w:lvlText w:val=""/>
+      <w:lvlJc w:val="left"/>
+      <w:pPr>
+        <w:tabs>
+          <w:tab w:val="num" w:pos="2880"/>
+        </w:tabs>
+        <w:ind w:left="2880" w:hanging="360"/>
+      </w:pPr>
+      <w:rPr>
+        <w:rFonts w:ascii="Wingdings" w:hAnsi="Wingdings" w:hint="default"/>
+        <w:sz w:val="20"/>
+      </w:rPr>
+    </w:lvl>
+    <w:lvl w:ilvl="4" w:tentative="1">
+      <w:start w:val="1"/>
+      <w:numFmt w:val="bullet"/>
+      <w:lvlText w:val=""/>
+      <w:lvlJc w:val="left"/>
+      <w:pPr>
+        <w:tabs>
+          <w:tab w:val="num" w:pos="3600"/>
+        </w:tabs>
+        <w:ind w:left="3600" w:hanging="360"/>
+      </w:pPr>
+      <w:rPr>
+        <w:rFonts w:ascii="Wingdings" w:hAnsi="Wingdings" w:hint="default"/>
+        <w:sz w:val="20"/>
+      </w:rPr>
+    </w:lvl>
+    <w:lvl w:ilvl="5" w:tentative="1">
+      <w:start w:val="1"/>
+      <w:numFmt w:val="bullet"/>
+      <w:lvlText w:val=""/>
+      <w:lvlJc w:val="left"/>
+      <w:pPr>
+        <w:tabs>
+          <w:tab w:val="num" w:pos="4320"/>
+        </w:tabs>
+        <w:ind w:left="4320" w:hanging="360"/>
+      </w:pPr>
+      <w:rPr>
+        <w:rFonts w:ascii="Wingdings" w:hAnsi="Wingdings" w:hint="default"/>
+        <w:sz w:val="20"/>
+      </w:rPr>
+    </w:lvl>
+    <w:lvl w:ilvl="6" w:tentative="1">
+      <w:start w:val="1"/>
+      <w:numFmt w:val="bullet"/>
+      <w:lvlText w:val=""/>
+      <w:lvlJc w:val="left"/>
+      <w:pPr>
+        <w:tabs>
+          <w:tab w:val="num" w:pos="5040"/>
+        </w:tabs>
+        <w:ind w:left="5040" w:hanging="360"/>
+      </w:pPr>
+      <w:rPr>
+        <w:rFonts w:ascii="Wingdings" w:hAnsi="Wingdings" w:hint="default"/>
+        <w:sz w:val="20"/>
+      </w:rPr>
+    </w:lvl>
+    <w:lvl w:ilvl="7" w:tentative="1">
+      <w:start w:val="1"/>
+      <w:numFmt w:val="bullet"/>
+      <w:lvlText w:val=""/>
+      <w:lvlJc w:val="left"/>
+      <w:pPr>
+        <w:tabs>
+          <w:tab w:val="num" w:pos="5760"/>
+        </w:tabs>
+        <w:ind w:left="5760" w:hanging="360"/>
+      </w:pPr>
+      <w:rPr>
+        <w:rFonts w:ascii="Wingdings" w:hAnsi="Wingdings" w:hint="default"/>
+        <w:sz w:val="20"/>
+      </w:rPr>
+    </w:lvl>
+    <w:lvl w:ilvl="8" w:tentative="1">
+      <w:start w:val="1"/>
+      <w:numFmt w:val="bullet"/>
+      <w:lvlText w:val=""/>
+      <w:lvlJc w:val="left"/>
+      <w:pPr>
+        <w:tabs>
+          <w:tab w:val="num" w:pos="6480"/>
+        </w:tabs>
+        <w:ind w:left="6480" w:hanging="360"/>
+      </w:pPr>
+      <w:rPr>
+        <w:rFonts w:ascii="Wingdings" w:hAnsi="Wingdings" w:hint="default"/>
+        <w:sz w:val="20"/>
+      </w:rPr>
+    </w:lvl>
+  </w:abstractNum>
+  <w:abstractNum w:abstractNumId="5" w15:restartNumberingAfterBreak="0">
     <w:nsid w:val="416F72F8"/>
     <w:multiLevelType w:val="hybridMultilevel"/>
     <w:tmpl w:val="3EF25C68"/>
@@ -4615,7 +4521,7 @@
       </w:rPr>
     </w:lvl>
   </w:abstractNum>
-  <w:abstractNum w:abstractNumId="4" w15:restartNumberingAfterBreak="0">
+  <w:abstractNum w:abstractNumId="6" w15:restartNumberingAfterBreak="0">
     <w:nsid w:val="5284546F"/>
     <w:multiLevelType w:val="hybridMultilevel"/>
     <w:tmpl w:val="970877B8"/>
@@ -4728,7 +4634,7 @@
       </w:rPr>
     </w:lvl>
   </w:abstractNum>
-  <w:abstractNum w:abstractNumId="5" w15:restartNumberingAfterBreak="0">
+  <w:abstractNum w:abstractNumId="7" w15:restartNumberingAfterBreak="0">
     <w:nsid w:val="670F6B1D"/>
     <w:multiLevelType w:val="hybridMultilevel"/>
     <w:tmpl w:val="B9F0BE64"/>
@@ -4841,7 +4747,7 @@
       </w:rPr>
     </w:lvl>
   </w:abstractNum>
-  <w:abstractNum w:abstractNumId="6" w15:restartNumberingAfterBreak="0">
+  <w:abstractNum w:abstractNumId="8" w15:restartNumberingAfterBreak="0">
     <w:nsid w:val="6955285D"/>
     <w:multiLevelType w:val="hybridMultilevel"/>
     <w:tmpl w:val="0818D9DA"/>
@@ -4954,7 +4860,7 @@
       </w:rPr>
     </w:lvl>
   </w:abstractNum>
-  <w:abstractNum w:abstractNumId="7" w15:restartNumberingAfterBreak="0">
+  <w:abstractNum w:abstractNumId="9" w15:restartNumberingAfterBreak="0">
     <w:nsid w:val="74094F37"/>
     <w:multiLevelType w:val="multilevel"/>
     <w:tmpl w:val="52B0C074"/>
@@ -5067,7 +4973,7 @@
       </w:pPr>
     </w:lvl>
   </w:abstractNum>
-  <w:abstractNum w:abstractNumId="8" w15:restartNumberingAfterBreak="0">
+  <w:abstractNum w:abstractNumId="10" w15:restartNumberingAfterBreak="0">
     <w:nsid w:val="77F712B0"/>
     <w:multiLevelType w:val="hybridMultilevel"/>
     <w:tmpl w:val="83827752"/>
@@ -5157,31 +5063,37 @@
     </w:lvl>
   </w:abstractNum>
   <w:num w:numId="1" w16cid:durableId="717163031">
+    <w:abstractNumId w:val="2"/>
+  </w:num>
+  <w:num w:numId="2" w16cid:durableId="1432048596">
+    <w:abstractNumId w:val="9"/>
+  </w:num>
+  <w:num w:numId="3" w16cid:durableId="1801075811">
+    <w:abstractNumId w:val="3"/>
+  </w:num>
+  <w:num w:numId="4" w16cid:durableId="1838034357">
+    <w:abstractNumId w:val="10"/>
+  </w:num>
+  <w:num w:numId="5" w16cid:durableId="382758366">
+    <w:abstractNumId w:val="5"/>
+  </w:num>
+  <w:num w:numId="6" w16cid:durableId="1895241471">
+    <w:abstractNumId w:val="8"/>
+  </w:num>
+  <w:num w:numId="7" w16cid:durableId="478881895">
+    <w:abstractNumId w:val="6"/>
+  </w:num>
+  <w:num w:numId="8" w16cid:durableId="1461418296">
+    <w:abstractNumId w:val="7"/>
+  </w:num>
+  <w:num w:numId="9" w16cid:durableId="1962881188">
     <w:abstractNumId w:val="1"/>
   </w:num>
-  <w:num w:numId="2" w16cid:durableId="1432048596">
-    <w:abstractNumId w:val="7"/>
+  <w:num w:numId="10" w16cid:durableId="393431223">
+    <w:abstractNumId w:val="0"/>
   </w:num>
-  <w:num w:numId="3" w16cid:durableId="1801075811">
-    <w:abstractNumId w:val="2"/>
-  </w:num>
-  <w:num w:numId="4" w16cid:durableId="1838034357">
-    <w:abstractNumId w:val="8"/>
-  </w:num>
-  <w:num w:numId="5" w16cid:durableId="382758366">
-    <w:abstractNumId w:val="3"/>
-  </w:num>
-  <w:num w:numId="6" w16cid:durableId="1895241471">
-    <w:abstractNumId w:val="6"/>
-  </w:num>
-  <w:num w:numId="7" w16cid:durableId="478881895">
+  <w:num w:numId="11" w16cid:durableId="988244812">
     <w:abstractNumId w:val="4"/>
-  </w:num>
-  <w:num w:numId="8" w16cid:durableId="1461418296">
-    <w:abstractNumId w:val="5"/>
-  </w:num>
-  <w:num w:numId="9" w16cid:durableId="1962881188">
-    <w:abstractNumId w:val="0"/>
   </w:num>
 </w:numbering>
 </file>

</xml_diff>

<commit_message>
add search big in md
</commit_message>
<xml_diff>
--- a/AVL Trees.docx
+++ b/AVL Trees.docx
@@ -57,13 +57,8 @@
       <w:r>
         <w:t xml:space="preserve"> </w:t>
       </w:r>
-      <w:proofErr w:type="gramStart"/>
-      <w:r>
-        <w:t>have</w:t>
-      </w:r>
-      <w:proofErr w:type="gramEnd"/>
-      <w:r>
-        <w:t xml:space="preserve"> a significant flaw in that they are entirely dependent on the insertion of the data. When a binary tree is unbalanced, its performance is affected and can result in a worst-case scenario of O(n) for various operations. </w:t>
+      <w:r>
+        <w:t xml:space="preserve">have a significant flaw in that they are entirely dependent on the insertion of the data. When a binary tree is unbalanced, its performance is affected and can result in a worst-case scenario of O(n) for various operations. </w:t>
       </w:r>
     </w:p>
     <w:p>
@@ -128,23 +123,7 @@
         <w:t xml:space="preserve">: </w:t>
       </w:r>
       <w:r>
-        <w:t>Showing $h = O(\</w:t>
-      </w:r>
-      <w:proofErr w:type="gramStart"/>
-      <w:r>
-        <w:t>log((</w:t>
-      </w:r>
-      <w:proofErr w:type="gramEnd"/>
-      <w:r>
-        <w:t>n</w:t>
-      </w:r>
-      <w:proofErr w:type="gramStart"/>
-      <w:r>
-        <w:t>))$</w:t>
-      </w:r>
-      <w:proofErr w:type="gramEnd"/>
-      <w:r>
-        <w:t xml:space="preserve"> and then a</w:t>
+        <w:t>Showing $h = O(\log((n))$ and then a</w:t>
       </w:r>
       <w:r>
         <w:t>nalyzing Big(O) for insertion, deletion, and searching.</w:t>
@@ -173,18 +152,10 @@
         <w:t>/Experiment</w:t>
       </w:r>
       <w:r>
-        <w:t xml:space="preserve">: A discussion of the reports code base </w:t>
-      </w:r>
-      <w:proofErr w:type="gramStart"/>
-      <w:r>
-        <w:t>and</w:t>
-      </w:r>
-      <w:r>
-        <w:t>of</w:t>
-      </w:r>
-      <w:proofErr w:type="gramEnd"/>
-      <w:r>
-        <w:t xml:space="preserve"> our experiment</w:t>
+        <w:t>: A discussion of the reports code base and</w:t>
+      </w:r>
+      <w:r>
+        <w:t>of our experiment</w:t>
       </w:r>
       <w:r>
         <w:t>.</w:t>
@@ -236,52 +207,12 @@
         <w:tab/>
       </w:r>
       <w:r>
-        <w:t>In 1962, a pair of Soviet mathematicians, Georgy Adelson-Velsky and Evgenii Landis, sought to create a data structure that guaranteed $O(\log(n</w:t>
-      </w:r>
-      <w:proofErr w:type="gramStart"/>
-      <w:r>
-        <w:t>))$</w:t>
-      </w:r>
-      <w:proofErr w:type="gramEnd"/>
-      <w:r>
-        <w:t xml:space="preserve"> performance for deletion, search, and </w:t>
-      </w:r>
-      <w:proofErr w:type="gramStart"/>
-      <w:r>
-        <w:t>insertion[</w:t>
-      </w:r>
-      <w:proofErr w:type="gramEnd"/>
-      <w:r>
-        <w:t xml:space="preserve">1]. To reach this goal, they needed a tree that was as dense as possible. This idea of a dense tree is what can be referred to as a balanced tree. A balanced tree is a tree whose height at the root node is no larger than $log(n)$ [3]. As previously discussed, when we have this property, a BST is guaranteed to </w:t>
-      </w:r>
-      <w:proofErr w:type="gramStart"/>
-      <w:r>
-        <w:t>achieve  $</w:t>
-      </w:r>
-      <w:proofErr w:type="gramEnd"/>
-      <w:r>
-        <w:t>O(\log(n</w:t>
-      </w:r>
-      <w:proofErr w:type="gramStart"/>
-      <w:r>
-        <w:t>))$</w:t>
-      </w:r>
-      <w:proofErr w:type="gramEnd"/>
-      <w:r>
-        <w:t xml:space="preserve"> performance, but a traditional BST is not guaranteed to be balanced. To solve this issue, our Soviet mathematicians created the AVL tree, which is a self-balancing binary search tree.</w:t>
-      </w:r>
-    </w:p>
-    <w:p>
-      <w:r>
-        <w:t xml:space="preserve">Today, the AVL tree has a rich history of practical application.  For example, Linux kernel before 2.4.10 used AVL trees for tracking virtual memory areas. Linux also uses AVL trees for its peer cache tracking system. Generally, AVL trees are used in system operating kernels and other system software. AVL trees are foundational to computer science because they have characteristics that are both practical and useful. </w:t>
-      </w:r>
-      <w:proofErr w:type="gramStart"/>
-      <w:r>
-        <w:t>In particular, this</w:t>
-      </w:r>
-      <w:proofErr w:type="gramEnd"/>
-      <w:r>
-        <w:t xml:space="preserve"> data </w:t>
+        <w:t>In 1962, a pair of Soviet mathematicians, Georgy Adelson-Velsky and Evgenii Landis, sought to create a data structure that guaranteed $O(\log(n))$ performance for deletion, search, and insertion[1]. To reach this goal, they needed a tree that was as dense as possible. This idea of a dense tree is what can be referred to as a balanced tree. A balanced tree is a tree whose height at the root node is no larger than $log(n)$ [3]. As previously discussed, when we have this property, a BST is guaranteed to achieve  $O(\log(n))$ performance, but a traditional BST is not guaranteed to be balanced. To solve this issue, our Soviet mathematicians created the AVL tree, which is a self-balancing binary search tree.</w:t>
+      </w:r>
+    </w:p>
+    <w:p>
+      <w:r>
+        <w:t xml:space="preserve">Today, the AVL tree has a rich history of practical application.  For example, Linux kernel before 2.4.10 used AVL trees for tracking virtual memory areas. Linux also uses AVL trees for its peer cache tracking system. Generally, AVL trees are used in system operating kernels and other system software. AVL trees are foundational to computer science because they have characteristics that are both practical and useful. In particular, this data </w:t>
       </w:r>
       <w:r>
         <w:lastRenderedPageBreak/>
@@ -330,6 +261,9 @@
         <w:ind w:firstLine="720"/>
       </w:pPr>
       <w:r>
+        <w:rPr>
+          <w:noProof/>
+        </w:rPr>
         <w:drawing>
           <wp:inline distT="0" distB="0" distL="0" distR="0" wp14:anchorId="490D2213" wp14:editId="242DE95D">
             <wp:extent cx="5943600" cy="2067560"/>
@@ -372,23 +306,7 @@
         <w:tab/>
       </w:r>
       <w:r>
-        <w:t xml:space="preserve">Figure 1 outlines some fundamental properties of an AVL tree. Each node in an AVL tree stores its height, or simply put, the length of the longest path beneath it.  With the height of a node, we can then calculate a </w:t>
-      </w:r>
-      <w:proofErr w:type="gramStart"/>
-      <w:r>
-        <w:t>node’s  balance</w:t>
-      </w:r>
-      <w:proofErr w:type="gramEnd"/>
-      <w:r>
-        <w:t xml:space="preserve"> factor ($B_F$), which is the difference in the height of a node's left and right subtrees. When a $B_F$ is positive, our left subtree is taller, and when it is negative, our right subtree is taller. We use $B_F$ to identify imbalance within our tree, and if $|B_F| &gt; 1$ we correct for this imbalance. When an AVL tree is constrained to this property, we are guaranteed to have a height of $O(log(n</w:t>
-      </w:r>
-      <w:proofErr w:type="gramStart"/>
-      <w:r>
-        <w:t>))$</w:t>
-      </w:r>
-      <w:proofErr w:type="gramEnd"/>
-      <w:r>
-        <w:t>.  To maintain the property of $|B_F| \le 1$, an AVL tree performs left, right, left-right, and right-left rotations.</w:t>
+        <w:t>Figure 1 outlines some fundamental properties of an AVL tree. Each node in an AVL tree stores its height, or simply put, the length of the longest path beneath it.  With the height of a node, we can then calculate a node’s  balance factor ($B_F$), which is the difference in the height of a node's left and right subtrees. When a $B_F$ is positive, our left subtree is taller, and when it is negative, our right subtree is taller. We use $B_F$ to identify imbalance within our tree, and if $|B_F| &gt; 1$ we correct for this imbalance. When an AVL tree is constrained to this property, we are guaranteed to have a height of $O(log(n))$.  To maintain the property of $|B_F| \le 1$, an AVL tree performs left, right, left-right, and right-left rotations.</w:t>
       </w:r>
     </w:p>
     <w:p/>
@@ -441,13 +359,7 @@
         <w:t xml:space="preserve"> </w:t>
       </w:r>
       <w:r>
-        <w:t xml:space="preserve">LL (left-left), </w:t>
-      </w:r>
-      <w:r>
-        <w:t xml:space="preserve">and </w:t>
-      </w:r>
-      <w:r>
-        <w:t>RR (right-right)</w:t>
+        <w:t>LL (left-left), and RR (right-right)</w:t>
       </w:r>
       <w:r>
         <w:t xml:space="preserve">. In the sections below we discuss </w:t>
@@ -469,6 +381,9 @@
         <w:t>Figure 2</w:t>
       </w:r>
       <w:r>
+        <w:rPr>
+          <w:noProof/>
+        </w:rPr>
         <w:drawing>
           <wp:inline distT="0" distB="0" distL="0" distR="0" wp14:anchorId="724B94E5" wp14:editId="42E00233">
             <wp:extent cx="5306744" cy="2470244"/>
@@ -508,47 +423,7 @@
     </w:p>
     <w:p>
       <w:r>
-        <w:t xml:space="preserve">The above figure shows the process for </w:t>
-      </w:r>
-      <w:proofErr w:type="gramStart"/>
-      <w:r>
-        <w:t>a right</w:t>
-      </w:r>
-      <w:proofErr w:type="gramEnd"/>
-      <w:r>
-        <w:t xml:space="preserve"> rotation. Left and right rotations are inversely related, and thus, fundamentally, their core logic is the same. Since these rotations are logically equivalent, we will just cover </w:t>
-      </w:r>
-      <w:proofErr w:type="gramStart"/>
-      <w:r>
-        <w:t>a right</w:t>
-      </w:r>
-      <w:proofErr w:type="gramEnd"/>
-      <w:r>
-        <w:t xml:space="preserve"> rotation. For an example of a left rotation, please see the appendix (cite). </w:t>
-      </w:r>
-      <w:proofErr w:type="gramStart"/>
-      <w:r>
-        <w:t>A right</w:t>
-      </w:r>
-      <w:proofErr w:type="gramEnd"/>
-      <w:r>
-        <w:t xml:space="preserve"> rotation is triggered by a left imbalance in the </w:t>
-      </w:r>
-      <w:proofErr w:type="gramStart"/>
-      <w:r>
-        <w:t>tree .</w:t>
-      </w:r>
-      <w:proofErr w:type="gramEnd"/>
-      <w:r>
-        <w:t xml:space="preserve"> Looking at the diagram above, we find that Node 3 has a $B_F \ge 1</w:t>
-      </w:r>
-      <w:proofErr w:type="gramStart"/>
-      <w:r>
-        <w:t>$  and</w:t>
-      </w:r>
-      <w:proofErr w:type="gramEnd"/>
-      <w:r>
-        <w:t xml:space="preserve"> Node 2 has a $B_F \ge 0$. Under these conditions, we trigger the process of a right rotation. The Pseudo code above walks through this process step-by-step, but simply put, Node 2 becomes the new root node in this process, with node 3 being reassigned as its right child.</w:t>
+        <w:t>The above figure shows the process for a right rotation. Left and right rotations are inversely related, and thus, fundamentally, their core logic is the same. Since these rotations are logically equivalent, we will just cover a right rotation. For an example of a left rotation, please see the appendix (cite). A right rotation is triggered by a left imbalance in the tree . Looking at the diagram above, we find that Node 3 has a $B_F \ge 1$  and Node 2 has a $B_F \ge 0$. Under these conditions, we trigger the process of a right rotation. The Pseudo code above walks through this process step-by-step, but simply put, Node 2 becomes the new root node in this process, with node 3 being reassigned as its right child.</w:t>
       </w:r>
     </w:p>
     <w:p>
@@ -585,6 +460,9 @@
         <w:br/>
       </w:r>
       <w:r>
+        <w:rPr>
+          <w:noProof/>
+        </w:rPr>
         <w:drawing>
           <wp:inline distT="0" distB="0" distL="0" distR="0" wp14:anchorId="489B9A4F" wp14:editId="274991C4">
             <wp:extent cx="5943600" cy="2000885"/>
@@ -624,15 +502,7 @@
     </w:p>
     <w:p>
       <w:r>
-        <w:t xml:space="preserve">When we have an imbalance that has a zigzag pattern, we perform either a left-right (LR) or a right-left (RL) rotation. The diagram above outlines an LR rotation, and in the appendix, you’ll find similar logic for an RL rotation (CITE). An LR rotation is triggered by two conditions: condition one, the parent node has a $B_F&gt;1$; and condition two, the parent node’s left child has a $B_F&lt;0$. To fix this imbalance, we </w:t>
-      </w:r>
-      <w:proofErr w:type="gramStart"/>
-      <w:r>
-        <w:t>perform</w:t>
-      </w:r>
-      <w:proofErr w:type="gramEnd"/>
-      <w:r>
-        <w:t xml:space="preserve"> two steps:</w:t>
+        <w:t>When we have an imbalance that has a zigzag pattern, we perform either a left-right (LR) or a right-left (RL) rotation. The diagram above outlines an LR rotation, and in the appendix, you’ll find similar logic for an RL rotation (CITE). An LR rotation is triggered by two conditions: condition one, the parent node has a $B_F&gt;1$; and condition two, the parent node’s left child has a $B_F&lt;0$. To fix this imbalance, we perform two steps:</w:t>
       </w:r>
     </w:p>
     <w:p>
@@ -668,75 +538,116 @@
     <w:p>
       <w:r>
         <w:tab/>
-        <w:t xml:space="preserve">This </w:t>
-      </w:r>
-      <w:proofErr w:type="gramStart"/>
-      <w:r>
-        <w:t>section</w:t>
-      </w:r>
-      <w:proofErr w:type="gramEnd"/>
-      <w:r>
-        <w:t xml:space="preserve"> purpose is to perform a runtime analysis of an AVL tree. To accomplish this, our main objective will be to show that height of our AVL tree is </w:t>
-      </w:r>
-      <w:proofErr w:type="gramStart"/>
-      <w:r>
-        <w:t>bounded</w:t>
-      </w:r>
-      <w:proofErr w:type="gramEnd"/>
-      <w:r>
-        <w:t xml:space="preserve"> by $O(log(n</w:t>
-      </w:r>
-      <w:proofErr w:type="gramStart"/>
-      <w:r>
-        <w:t>))$</w:t>
-      </w:r>
-      <w:proofErr w:type="gramEnd"/>
+      </w:r>
+      <w:r>
+        <w:t xml:space="preserve">In this section we will </w:t>
+      </w:r>
+      <w:r>
+        <w:t xml:space="preserve">perform a </w:t>
+      </w:r>
+      <w:r>
+        <w:t xml:space="preserve">theoretical </w:t>
+      </w:r>
+      <w:r>
+        <w:t xml:space="preserve">runtime analysis </w:t>
+      </w:r>
+      <w:r>
+        <w:t>for</w:t>
+      </w:r>
+      <w:r>
+        <w:t xml:space="preserve"> an AVL tree. To accomplish this, our main objective will be to show that height of our AVL tree is bounded by $O(log(n))$.</w:t>
+      </w:r>
+      <w:r>
+        <w:t xml:space="preserve"> </w:t>
+      </w:r>
+      <w:r>
+        <w:t>After proving th</w:t>
+      </w:r>
+      <w:r>
+        <w:t>at our height is constrained</w:t>
+      </w:r>
+      <w:r>
+        <w:t xml:space="preserve">, we </w:t>
+      </w:r>
+      <w:r>
+        <w:t xml:space="preserve">will subsequently rely on this fact and then show that the functions search, deletion and insertion time complexities are </w:t>
+      </w:r>
+      <w:r>
+        <w:t>$O(log(n))$</w:t>
+      </w:r>
       <w:r>
         <w:t>.</w:t>
       </w:r>
+    </w:p>
+    <w:p>
+      <w:pPr>
+        <w:pStyle w:val="Heading4"/>
+      </w:pPr>
+      <w:r>
+        <w:t>Proving AVL’s Height</w:t>
+      </w:r>
+    </w:p>
+    <w:p>
+      <w:pPr>
+        <w:ind w:firstLine="720"/>
+      </w:pPr>
+      <w:r>
+        <w:t>In this section we aim to prove</w:t>
+      </w:r>
+      <w:r>
+        <w:t>,</w:t>
+      </w:r>
+      <w:r>
+        <w:t xml:space="preserve"> using strong induction</w:t>
+      </w:r>
+      <w:r>
+        <w:t>,</w:t>
+      </w:r>
+      <w:r>
+        <w:t xml:space="preserve"> that the height ($h$) of an </w:t>
+      </w:r>
+      <w:r>
+        <w:t>AVL tree</w:t>
+      </w:r>
+      <w:r>
+        <w:t xml:space="preserve"> is $O(log(n))$. We will break down this section into two sub-sections. The first section will be our proof which is a </w:t>
+      </w:r>
+      <w:r>
+        <w:t xml:space="preserve">relies on the previous work of </w:t>
+      </w:r>
       <w:r>
         <w:t xml:space="preserve"> </w:t>
       </w:r>
       <w:r>
-        <w:t xml:space="preserve">After proving this constraint, we can </w:t>
-      </w:r>
-      <w:proofErr w:type="gramStart"/>
-      <w:r>
-        <w:t>rely</w:t>
-      </w:r>
-      <w:proofErr w:type="gramEnd"/>
-      <w:r>
-        <w:t xml:space="preserve"> it and </w:t>
-      </w:r>
-      <w:proofErr w:type="gramStart"/>
-      <w:r>
-        <w:t>the</w:t>
-      </w:r>
-      <w:r>
-        <w:t>re</w:t>
-      </w:r>
-      <w:r>
-        <w:t>for</w:t>
-      </w:r>
-      <w:proofErr w:type="gramEnd"/>
-      <w:r>
-        <w:t xml:space="preserve"> easily prove $O(log(n</w:t>
-      </w:r>
-      <w:proofErr w:type="gramStart"/>
-      <w:r>
-        <w:t>))$</w:t>
-      </w:r>
-      <w:proofErr w:type="gramEnd"/>
-      <w:r>
-        <w:t xml:space="preserve"> for search, deletion and insertion.</w:t>
-      </w:r>
+        <w:t xml:space="preserve">Moshiri </w:t>
+      </w:r>
+      <w:r>
+        <w:t xml:space="preserve">and </w:t>
+      </w:r>
+      <w:r>
+        <w:t>Mount</w:t>
+      </w:r>
+      <w:r>
+        <w:t xml:space="preserve">  </w:t>
+      </w:r>
+      <w:r>
+        <w:t>(cite, cite).</w:t>
+      </w:r>
+      <w:r>
+        <w:t xml:space="preserve"> In the subsequent section, we will have a detailed discussion around our proof. </w:t>
+      </w:r>
+    </w:p>
+    <w:p>
+      <w:pPr>
+        <w:ind w:firstLine="720"/>
+      </w:pPr>
     </w:p>
     <w:p>
       <w:pPr>
         <w:pStyle w:val="Heading4"/>
       </w:pPr>
       <w:r>
-        <w:t>Proving AVL’s Height</w:t>
+        <w:t>Proof:</w:t>
       </w:r>
     </w:p>
     <w:p>
@@ -744,14 +655,6 @@
         <w:pStyle w:val="Heading4"/>
       </w:pPr>
       <w:r>
-        <w:t>Proof:</w:t>
-      </w:r>
-    </w:p>
-    <w:p>
-      <w:pPr>
-        <w:pStyle w:val="Heading4"/>
-      </w:pPr>
-      <w:r>
         <w:t>Proof Discussion:</w:t>
       </w:r>
     </w:p>
@@ -760,448 +663,341 @@
         <w:ind w:firstLine="720"/>
       </w:pPr>
       <w:r>
-        <w:t xml:space="preserve">The proof above shows that the height of an AVL tree is </w:t>
-      </w:r>
-      <w:proofErr w:type="gramStart"/>
-      <w:r>
-        <w:t>bounded</w:t>
-      </w:r>
-      <w:proofErr w:type="gramEnd"/>
-      <w:r>
-        <w:t xml:space="preserve"> to $O(\log(n</w:t>
-      </w:r>
-      <w:proofErr w:type="gramStart"/>
-      <w:r>
-        <w:t>))$</w:t>
-      </w:r>
-      <w:proofErr w:type="gramEnd"/>
+        <w:t>The proof above shows that the height of an AVL tree is bounded to $O(\log(n))$</w:t>
+      </w:r>
       <w:r>
         <w:t xml:space="preserve">. </w:t>
       </w:r>
       <w:r>
-        <w:t xml:space="preserve">We were able to come to this conclusion by combing the proofs of ____ and ___. Upon a review of </w:t>
+        <w:t xml:space="preserve">We were able to come to this conclusion by combing the proofs </w:t>
+      </w:r>
+      <w:r>
+        <w:t> </w:t>
+      </w:r>
+      <w:r>
+        <w:t xml:space="preserve">of </w:t>
+      </w:r>
+      <w:r>
+        <w:t xml:space="preserve">Goodrich, Moshiri and </w:t>
+      </w:r>
+      <w:r>
+        <w:lastRenderedPageBreak/>
+        <w:t>Mount (cite, cite, cite).</w:t>
+      </w:r>
+      <w:r>
+        <w:t xml:space="preserve">Upon a review of </w:t>
       </w:r>
       <w:r>
         <w:t>their</w:t>
       </w:r>
       <w:r>
-        <w:t xml:space="preserve"> proofs, </w:t>
-      </w:r>
-      <w:r>
-        <w:t xml:space="preserve">it was revealed that’s solving for height ($h$) was </w:t>
-      </w:r>
-      <w:proofErr w:type="gramStart"/>
-      <w:r>
-        <w:t>actually more</w:t>
-      </w:r>
-      <w:proofErr w:type="gramEnd"/>
-      <w:r>
-        <w:t xml:space="preserve"> difficult than solving for the minimum number of nodes under a specific height ($N_h$). If we can show that $N_h$ grows exponentially as the $h$ increases, we can reverse this and show that $h$ is bound by $</w:t>
+        <w:t xml:space="preserve"> proofs, it was revealed that’s solving for height ($h$) was actually more difficult than solving for the minimum number of nodes under a specific height ($N_h$). If we can show that $N_h$ grows exponentially as the $h$ increases, we can reverse this </w:t>
+      </w:r>
+      <w:r>
+        <w:t xml:space="preserve">relationship </w:t>
+      </w:r>
+      <w:r>
+        <w:t xml:space="preserve">and </w:t>
+      </w:r>
+      <w:r>
+        <w:t xml:space="preserve">thus </w:t>
+      </w:r>
+      <w:r>
+        <w:t>show $h</w:t>
+      </w:r>
+      <w:r>
+        <w:t xml:space="preserve"> = </w:t>
       </w:r>
       <w:r>
         <w:t>O(</w:t>
       </w:r>
       <w:r>
-        <w:t>\log(n</w:t>
-      </w:r>
-      <w:proofErr w:type="gramStart"/>
+        <w:t>\log(n)</w:t>
+      </w:r>
       <w:r>
         <w:t>)</w:t>
       </w:r>
       <w:r>
-        <w:t>)</w:t>
+        <w:t xml:space="preserve">$. </w:t>
+      </w:r>
+    </w:p>
+    <w:p>
+      <w:pPr>
+        <w:ind w:firstLine="720"/>
+      </w:pPr>
+      <w:r>
+        <w:t xml:space="preserve">This idea of </w:t>
+      </w:r>
+      <w:r>
+        <w:t>solving</w:t>
+      </w:r>
+      <w:r>
+        <w:t xml:space="preserve"> the lower bound $N_h$ is foundational to our proof. W</w:t>
+      </w:r>
+      <w:r>
+        <w:t xml:space="preserve">e rely on </w:t>
+      </w:r>
+      <w:r>
+        <w:t xml:space="preserve">$N_h$ </w:t>
+      </w:r>
+      <w:r>
+        <w:t xml:space="preserve">because this provides the </w:t>
+      </w:r>
+      <w:r>
+        <w:t>least</w:t>
+      </w:r>
+      <w:r>
+        <w:t xml:space="preserve"> amount of restraint on </w:t>
+      </w:r>
+      <w:r>
+        <w:t xml:space="preserve">the growth of </w:t>
+      </w:r>
+      <w:r>
+        <w:t>$h</w:t>
+      </w:r>
+      <w:r>
+        <w:t xml:space="preserve">$.  Meaning, if $N_h$ still grows exponentially then anything above this is still greater </w:t>
+      </w:r>
+      <w:r>
+        <w:t>than</w:t>
+      </w:r>
+      <w:r>
+        <w:t xml:space="preserve"> or</w:t>
+      </w:r>
+      <w:r>
+        <w:t xml:space="preserve"> equal to exponential growth. </w:t>
+      </w:r>
+      <w:r>
+        <w:t xml:space="preserve">Given the relationship between the growth of $N_h$ and the growth of $h$, </w:t>
+      </w:r>
+      <w:r>
+        <w:t>we were</w:t>
+      </w:r>
+      <w:r>
+        <w:t xml:space="preserve"> able to solve for the upper bound of $h$ in a three-step process:</w:t>
+      </w:r>
+    </w:p>
+    <w:p>
+      <w:pPr>
+        <w:pStyle w:val="Heading6"/>
+      </w:pPr>
+      <w:r>
+        <w:t xml:space="preserve">Step </w:t>
+      </w:r>
+      <w:r>
+        <w:t>One</w:t>
+      </w:r>
+      <w:r>
+        <w:t xml:space="preserve">: Define the Recursive </w:t>
+      </w:r>
+      <w:r>
+        <w:t>Relationship</w:t>
+      </w:r>
+    </w:p>
+    <w:p>
+      <w:r>
+        <w:t>\[</w:t>
+      </w:r>
+    </w:p>
+    <w:p>
+      <w:r>
+        <w:t xml:space="preserve">  N_h = N_{h-1} + N_{h-2} + 1 \quad{+1 for the height of the root}</w:t>
+      </w:r>
+    </w:p>
+    <w:p>
+      <w:r>
+        <w:t xml:space="preserve"> \]</w:t>
+      </w:r>
+    </w:p>
+    <w:p>
+      <w:r>
+        <w:t xml:space="preserve">The above equation </w:t>
+      </w:r>
+      <w:r>
+        <w:t>d</w:t>
+      </w:r>
+      <w:r>
+        <w:t xml:space="preserve">efines  </w:t>
+      </w:r>
+      <w:r>
+        <w:t>$N_h$</w:t>
+      </w:r>
+      <w:r>
+        <w:t xml:space="preserve"> recursively by showing that is that it is the composition of</w:t>
+      </w:r>
+      <w:r>
+        <w:t xml:space="preserve"> its subtrees plus</w:t>
+      </w:r>
+      <w:r>
+        <w:t xml:space="preserve"> a connecting edge to those subtrees</w:t>
+      </w:r>
+      <w:r>
+        <w:t>. As previously discussed, an AVL tree’s height is bounded by the balancing factor which states that $|B_f| \le 1$. Given this constraint, the left and right tree of $N_h$ can most have a one level difference. This information allows us to define $N_h$ recursively.</w:t>
+      </w:r>
+    </w:p>
+    <w:p>
+      <w:pPr>
+        <w:pStyle w:val="Heading6"/>
+      </w:pPr>
+      <w:r>
+        <w:t xml:space="preserve">Step Two: </w:t>
+      </w:r>
+      <w:r>
+        <w:t>Lower</w:t>
+      </w:r>
+      <w:r>
+        <w:t xml:space="preserve"> Bound of $N_h$</w:t>
+      </w:r>
+    </w:p>
+    <w:p>
+      <w:r>
+        <w:t>Moshiri</w:t>
+      </w:r>
+      <w:r>
+        <w:t xml:space="preserve">’s proof </w:t>
+      </w:r>
+      <w:r>
+        <w:t>use</w:t>
+      </w:r>
+      <w:r>
+        <w:t>s</w:t>
+      </w:r>
+      <w:r>
+        <w:t xml:space="preserve"> a direct proof via algebraic manipulation </w:t>
+      </w:r>
+      <w:r>
+        <w:t>to</w:t>
+      </w:r>
+      <w:r>
+        <w:t xml:space="preserve"> show the lower bound of $N_h$</w:t>
+      </w:r>
+      <w:r>
+        <w:t xml:space="preserve"> (cite)</w:t>
+      </w:r>
+      <w:r>
+        <w:t>. Our proof took a slightly different route where we decided to use strong induction</w:t>
+      </w:r>
+      <w:r>
+        <w:t xml:space="preserve"> like </w:t>
+      </w:r>
+      <w:r>
+        <w:t>Goodrich</w:t>
+      </w:r>
+      <w:r>
+        <w:t xml:space="preserve"> (cite)</w:t>
+      </w:r>
+      <w:r>
+        <w:t>.</w:t>
+      </w:r>
+      <w:r>
+        <w:t xml:space="preserve"> In our proof, t</w:t>
+      </w:r>
+      <w:r>
+        <w:t>ake note that we are able to simplify $</w:t>
+      </w:r>
+      <w:r>
+        <w:t>N_k + N_{k-1} + 1</w:t>
+      </w:r>
+      <w:r>
+        <w:t>$ to $</w:t>
+      </w:r>
+      <w:r>
+        <w:t xml:space="preserve"> 2N_{k-1}</w:t>
+      </w:r>
+      <w:r>
+        <w:t>$. We are able to do this because since $</w:t>
+      </w:r>
+      <w:r>
+        <w:t>N_k + N_{k-1} + 1</w:t>
+      </w:r>
+      <w:r>
+        <w:t xml:space="preserve"> &gt; </w:t>
+      </w:r>
+      <w:r>
+        <w:t>2N_{k-1}</w:t>
       </w:r>
       <w:r>
         <w:t>$</w:t>
       </w:r>
-      <w:proofErr w:type="gramEnd"/>
-      <w:r>
-        <w:t xml:space="preserve">. </w:t>
-      </w:r>
-    </w:p>
-    <w:p>
-      <w:pPr>
-        <w:ind w:firstLine="720"/>
-      </w:pPr>
-      <w:r>
-        <w:t xml:space="preserve">This idea of </w:t>
-      </w:r>
-      <w:proofErr w:type="gramStart"/>
-      <w:r>
-        <w:t>solving for</w:t>
-      </w:r>
-      <w:proofErr w:type="gramEnd"/>
-      <w:r>
-        <w:t xml:space="preserve"> the lower bound $N_h$ is foundational to our proof. W</w:t>
-      </w:r>
-      <w:r>
-        <w:t xml:space="preserve">e rely on </w:t>
-      </w:r>
-      <w:r>
-        <w:t xml:space="preserve">$N_h$ </w:t>
-      </w:r>
-      <w:r>
-        <w:t xml:space="preserve">because this provides the </w:t>
-      </w:r>
-      <w:r>
-        <w:t>least</w:t>
-      </w:r>
-      <w:r>
-        <w:t xml:space="preserve"> amount of restraint on </w:t>
-      </w:r>
-      <w:r>
-        <w:t xml:space="preserve">the growth of </w:t>
-      </w:r>
-      <w:r>
-        <w:t>$h</w:t>
-      </w:r>
-      <w:r>
-        <w:t xml:space="preserve">$.  </w:t>
-      </w:r>
+      <w:r>
+        <w:t>, and thus still allows us to solve looser lower bound of $N_h$</w:t>
+      </w:r>
+      <w:r>
+        <w:t>.</w:t>
+      </w:r>
+      <w:r>
+        <w:t xml:space="preserve"> </w:t>
+      </w:r>
+      <w:r>
+        <w:t xml:space="preserve">This step allowed us to simplify the process for solving for $N_h$, but it is worth mentioning that </w:t>
+      </w:r>
+      <w:r>
+        <w:t xml:space="preserve">Mount </w:t>
+      </w:r>
+      <w:r>
+        <w:t xml:space="preserve">did not take this step, and was therefore able show a tighter bound via the golden ratio and the </w:t>
+      </w:r>
+      <w:r>
+        <w:t>Fibonacci</w:t>
+      </w:r>
+      <w:r>
+        <w:t xml:space="preserve"> sequence. </w:t>
+      </w:r>
+    </w:p>
+    <w:p>
+      <w:r>
+        <w:t xml:space="preserve"> </w:t>
+      </w:r>
+    </w:p>
+    <w:p>
+      <w:pPr>
+        <w:pStyle w:val="Heading6"/>
+      </w:pPr>
+      <w:r>
+        <w:t>Step Three: Upper Bound of $h$</w:t>
+      </w:r>
+    </w:p>
+    <w:p>
+      <w:r>
+        <w:t xml:space="preserve">With the strong induction proof in hand, it was now time to solve for the upper bound of $h$. We were able to show the upper bound of $h$ with simple </w:t>
+      </w:r>
+      <w:r>
+        <w:t>algebraic</w:t>
+      </w:r>
+      <w:r>
+        <w:t xml:space="preserve"> manipulation which result</w:t>
+      </w:r>
+      <w:r>
+        <w:t>ed</w:t>
+      </w:r>
+      <w:r>
+        <w:t xml:space="preserve"> in $</w:t>
+      </w:r>
+      <w:r>
+        <w:t>h &lt; 2\log_2(N_h)</w:t>
+      </w:r>
+      <w:r>
+        <w:t xml:space="preserve">$. Using </w:t>
+      </w:r>
+      <w:r>
+        <w:t>asymptotic</w:t>
+      </w:r>
+      <w:r>
+        <w:t xml:space="preserve"> notation we were able to derive the following:</w:t>
+      </w:r>
+    </w:p>
+    <w:p>
+      <w:r>
+        <w:t>\[</w:t>
+      </w:r>
+    </w:p>
+    <w:p>
       <w:r>
         <w:lastRenderedPageBreak/>
-        <w:t xml:space="preserve">Meaning, if $N_h$ still grows exponentially then anything above this is still greater </w:t>
-      </w:r>
-      <w:proofErr w:type="gramStart"/>
-      <w:r>
-        <w:t>then</w:t>
-      </w:r>
-      <w:proofErr w:type="gramEnd"/>
-      <w:r>
-        <w:t xml:space="preserve"> or</w:t>
-      </w:r>
-      <w:r>
-        <w:t xml:space="preserve"> equal to exponential growth. </w:t>
-      </w:r>
-      <w:r>
-        <w:t xml:space="preserve">Given the relationship between the growth of $N_h$ and the growth of $h$, we </w:t>
-      </w:r>
-      <w:proofErr w:type="gramStart"/>
-      <w:r>
-        <w:t>where</w:t>
-      </w:r>
-      <w:proofErr w:type="gramEnd"/>
-      <w:r>
-        <w:t xml:space="preserve"> able to solve for the upper bound of $h$ in a three-step process:</w:t>
-      </w:r>
-    </w:p>
-    <w:p>
-      <w:pPr>
-        <w:pStyle w:val="Heading6"/>
-      </w:pPr>
-      <w:r>
-        <w:t xml:space="preserve">Step </w:t>
-      </w:r>
-      <w:r>
-        <w:t>One</w:t>
-      </w:r>
-      <w:r>
-        <w:t xml:space="preserve">: Define the Recursive </w:t>
-      </w:r>
-      <w:r>
-        <w:t>Relationship</w:t>
-      </w:r>
-    </w:p>
-    <w:p>
-      <w:r>
-        <w:t>\[</w:t>
-      </w:r>
-    </w:p>
-    <w:p>
-      <w:r>
-        <w:t xml:space="preserve">  N_h = </w:t>
-      </w:r>
-      <w:proofErr w:type="gramStart"/>
-      <w:r>
-        <w:t>N_{</w:t>
-      </w:r>
-      <w:proofErr w:type="gramEnd"/>
-      <w:r>
-        <w:t xml:space="preserve">h-1} + </w:t>
-      </w:r>
-      <w:proofErr w:type="gramStart"/>
-      <w:r>
-        <w:t>N_{</w:t>
-      </w:r>
-      <w:proofErr w:type="gramEnd"/>
-      <w:r>
-        <w:t>h-2} + 1 \</w:t>
-      </w:r>
-      <w:proofErr w:type="gramStart"/>
-      <w:r>
-        <w:t>quad{</w:t>
-      </w:r>
-      <w:proofErr w:type="gramEnd"/>
-      <w:r>
-        <w:t xml:space="preserve">+1 for the </w:t>
-      </w:r>
-      <w:r>
-        <w:t>height</w:t>
-      </w:r>
-      <w:r>
-        <w:t xml:space="preserve"> of the root}</w:t>
-      </w:r>
-    </w:p>
-    <w:p>
-      <w:r>
-        <w:t xml:space="preserve"> \]</w:t>
-      </w:r>
-    </w:p>
-    <w:p>
-      <w:r>
-        <w:t xml:space="preserve">The above equation </w:t>
-      </w:r>
-      <w:proofErr w:type="gramStart"/>
-      <w:r>
-        <w:t>d</w:t>
-      </w:r>
-      <w:r>
-        <w:t xml:space="preserve">efines  </w:t>
-      </w:r>
-      <w:r>
-        <w:t>$</w:t>
-      </w:r>
-      <w:proofErr w:type="gramEnd"/>
-      <w:r>
-        <w:t>N_h$</w:t>
-      </w:r>
-      <w:r>
-        <w:t xml:space="preserve"> recursively by </w:t>
-      </w:r>
-      <w:proofErr w:type="gramStart"/>
-      <w:r>
-        <w:t>showing that is</w:t>
-      </w:r>
-      <w:proofErr w:type="gramEnd"/>
-      <w:r>
-        <w:t xml:space="preserve"> that it is the composition of</w:t>
-      </w:r>
-      <w:r>
-        <w:t xml:space="preserve"> its subtrees plus its connection to those subtrees. As previously discussed, an AVL tree’s height is bounded by the balancing factor which states that $|B_f| \le 1$. Given this constraint, the left and right tree of $N_h$ can most have a one level difference. This information allows us to define $N_h$ recursively.</w:t>
-      </w:r>
-    </w:p>
-    <w:p>
-      <w:pPr>
-        <w:pStyle w:val="Heading6"/>
-      </w:pPr>
-      <w:r>
-        <w:t xml:space="preserve">Step </w:t>
-      </w:r>
-      <w:r>
-        <w:t>Two</w:t>
-      </w:r>
-      <w:r>
-        <w:t xml:space="preserve">: </w:t>
-      </w:r>
-      <w:r>
-        <w:t>Lower</w:t>
-      </w:r>
-      <w:r>
-        <w:t xml:space="preserve"> Bound of $N_h$</w:t>
-      </w:r>
-    </w:p>
-    <w:p>
-      <w:r>
-        <w:t xml:space="preserve">The proofs of __and __, use a direct proof via algebraic manipulation </w:t>
-      </w:r>
-      <w:r>
-        <w:t>to</w:t>
-      </w:r>
-      <w:r>
-        <w:t xml:space="preserve"> show the lower bound of $N_h$. Our proof took a slightly different route where we decided to use strong induction.</w:t>
-      </w:r>
-      <w:r>
-        <w:t xml:space="preserve"> Although we did not use an algebraic approach to solve for $N_h$, the work of __ and __ allowed us </w:t>
-      </w:r>
-      <w:proofErr w:type="gramStart"/>
-      <w:r>
-        <w:t>more easily define</w:t>
-      </w:r>
-      <w:proofErr w:type="gramEnd"/>
-      <w:r>
-        <w:t xml:space="preserve"> our inductive hypothesis. Take note that in the proof we </w:t>
-      </w:r>
-      <w:proofErr w:type="gramStart"/>
-      <w:r>
-        <w:t>are able to</w:t>
-      </w:r>
-      <w:proofErr w:type="gramEnd"/>
-      <w:r>
-        <w:t xml:space="preserve"> simplify $</w:t>
-      </w:r>
-      <w:r>
-        <w:t xml:space="preserve">N_k + </w:t>
-      </w:r>
-      <w:proofErr w:type="gramStart"/>
-      <w:r>
-        <w:t>N_{</w:t>
-      </w:r>
-      <w:proofErr w:type="gramEnd"/>
-      <w:r>
-        <w:t>k-1} + 1</w:t>
-      </w:r>
-      <w:r>
-        <w:t>$ to $</w:t>
-      </w:r>
-      <w:r>
-        <w:t xml:space="preserve"> </w:t>
-      </w:r>
-      <w:r>
-        <w:t>2</w:t>
-      </w:r>
-      <w:proofErr w:type="gramStart"/>
-      <w:r>
-        <w:t>N_{</w:t>
-      </w:r>
-      <w:proofErr w:type="gramEnd"/>
-      <w:r>
-        <w:t>k-</w:t>
-      </w:r>
-      <w:proofErr w:type="gramStart"/>
-      <w:r>
-        <w:t>1}</w:t>
-      </w:r>
-      <w:r>
-        <w:t>$</w:t>
-      </w:r>
-      <w:proofErr w:type="gramEnd"/>
-      <w:r>
-        <w:t xml:space="preserve">. We </w:t>
-      </w:r>
-      <w:proofErr w:type="gramStart"/>
-      <w:r>
-        <w:t>are able to</w:t>
-      </w:r>
-      <w:proofErr w:type="gramEnd"/>
-      <w:r>
-        <w:t xml:space="preserve"> do this because since </w:t>
-      </w:r>
-      <w:r>
-        <w:t>$</w:t>
-      </w:r>
-      <w:r>
-        <w:t xml:space="preserve">N_k + </w:t>
-      </w:r>
-      <w:proofErr w:type="gramStart"/>
-      <w:r>
-        <w:t>N_{</w:t>
-      </w:r>
-      <w:proofErr w:type="gramEnd"/>
-      <w:r>
-        <w:t>k-1} + 1</w:t>
-      </w:r>
-      <w:r>
-        <w:t xml:space="preserve"> &gt; </w:t>
-      </w:r>
-      <w:r>
-        <w:t>2</w:t>
-      </w:r>
-      <w:proofErr w:type="gramStart"/>
-      <w:r>
-        <w:t>N_{</w:t>
-      </w:r>
-      <w:proofErr w:type="gramEnd"/>
-      <w:r>
-        <w:t>k-</w:t>
-      </w:r>
-      <w:proofErr w:type="gramStart"/>
-      <w:r>
-        <w:t>1}</w:t>
-      </w:r>
-      <w:r>
-        <w:t>$</w:t>
-      </w:r>
-      <w:proofErr w:type="gramEnd"/>
-      <w:r>
-        <w:t>.</w:t>
-      </w:r>
-      <w:r>
-        <w:t xml:space="preserve"> This step allowed us to simplify the process for solving for $N_h$, but it is worth mentioning that ____ did not take this </w:t>
-      </w:r>
-      <w:proofErr w:type="gramStart"/>
-      <w:r>
-        <w:t>step, and</w:t>
-      </w:r>
-      <w:proofErr w:type="gramEnd"/>
-      <w:r>
-        <w:t xml:space="preserve"> was therefore able show a tighter bound via the golden ratio and the </w:t>
-      </w:r>
-      <w:r>
-        <w:t>Fibonacci</w:t>
-      </w:r>
-      <w:r>
-        <w:t xml:space="preserve"> sequence. </w:t>
-      </w:r>
-    </w:p>
-    <w:p>
-      <w:r>
-        <w:t xml:space="preserve"> </w:t>
-      </w:r>
-    </w:p>
-    <w:p>
-      <w:pPr>
-        <w:pStyle w:val="Heading6"/>
-      </w:pPr>
-      <w:r>
-        <w:t xml:space="preserve">Step </w:t>
-      </w:r>
-      <w:r>
-        <w:t>Three</w:t>
-      </w:r>
-      <w:r>
-        <w:t xml:space="preserve">: </w:t>
-      </w:r>
-      <w:r>
-        <w:t xml:space="preserve">Upper </w:t>
-      </w:r>
-      <w:r>
-        <w:t>Bound of $</w:t>
-      </w:r>
-      <w:r>
-        <w:t>h</w:t>
-      </w:r>
-      <w:r>
-        <w:t>$</w:t>
-      </w:r>
-    </w:p>
-    <w:p>
-      <w:r>
-        <w:t>With the strong induction proof in hand, it was now time to solve for the upper bound of $h$. We were able to show the upper bound of $h$ with simple algerbraic manipulation which results in $</w:t>
-      </w:r>
-      <w:r>
-        <w:t>h &lt; 2\log_2(N_</w:t>
-      </w:r>
-      <w:proofErr w:type="gramStart"/>
-      <w:r>
-        <w:t>h)</w:t>
-      </w:r>
-      <w:r>
-        <w:t>$</w:t>
-      </w:r>
-      <w:proofErr w:type="gramEnd"/>
-      <w:r>
-        <w:t>. Using asmtotic notation we were able to derive the following:</w:t>
-      </w:r>
-    </w:p>
-    <w:p>
-      <w:r>
-        <w:t>\[</w:t>
-      </w:r>
-    </w:p>
-    <w:p>
-      <w:r>
         <w:t xml:space="preserve">H \le </w:t>
       </w:r>
       <w:r>
-        <w:t>\mathcal{O</w:t>
-      </w:r>
-      <w:proofErr w:type="gramStart"/>
-      <w:r>
-        <w:t>}(</w:t>
-      </w:r>
-      <w:proofErr w:type="gramEnd"/>
-      <w:r>
-        <w:t>\log n)</w:t>
+        <w:t>\mathcal{O}(\log n)</w:t>
       </w:r>
     </w:p>
     <w:p>
@@ -1215,7 +1011,6 @@
         <w:pStyle w:val="Heading3"/>
       </w:pPr>
       <w:r>
-        <w:lastRenderedPageBreak/>
         <w:t>Big-O for Insertion, Deletion and Search</w:t>
       </w:r>
     </w:p>
@@ -1272,19 +1067,7 @@
           </w:tcPr>
           <w:p>
             <w:r>
-              <w:t>Space Complexity</w:t>
-            </w:r>
-            <w:r>
-              <w:t xml:space="preserve"> </w:t>
-            </w:r>
-            <w:r>
-              <w:t>(</w:t>
-            </w:r>
-            <w:r>
-              <w:t>recursive</w:t>
-            </w:r>
-            <w:r>
-              <w:t>)</w:t>
+              <w:t>Space Complexity (recursive)</w:t>
             </w:r>
           </w:p>
         </w:tc>
@@ -1309,13 +1092,8 @@
           </w:tcPr>
           <w:p>
             <w:r>
-              <w:t>$O(log(n</w:t>
+              <w:t>$O(log(n))$</w:t>
             </w:r>
-            <w:proofErr w:type="gramStart"/>
-            <w:r>
-              <w:t>))$</w:t>
-            </w:r>
-            <w:proofErr w:type="gramEnd"/>
           </w:p>
         </w:tc>
         <w:tc>
@@ -1324,13 +1102,8 @@
           </w:tcPr>
           <w:p>
             <w:r>
-              <w:t>$</w:t>
+              <w:t>$O(1)$</w:t>
             </w:r>
-            <w:proofErr w:type="gramStart"/>
-            <w:r>
-              <w:t>O(1)$</w:t>
-            </w:r>
-            <w:proofErr w:type="gramEnd"/>
           </w:p>
         </w:tc>
         <w:tc>
@@ -1339,13 +1112,8 @@
           </w:tcPr>
           <w:p>
             <w:r>
-              <w:t>$O(log(n</w:t>
+              <w:t>$O(log(n))$</w:t>
             </w:r>
-            <w:proofErr w:type="gramStart"/>
-            <w:r>
-              <w:t>))$</w:t>
-            </w:r>
-            <w:proofErr w:type="gramEnd"/>
           </w:p>
         </w:tc>
       </w:tr>
@@ -1369,13 +1137,8 @@
           </w:tcPr>
           <w:p>
             <w:r>
-              <w:t>$O(log(n</w:t>
+              <w:t>$O(log(n))$</w:t>
             </w:r>
-            <w:proofErr w:type="gramStart"/>
-            <w:r>
-              <w:t>))$</w:t>
-            </w:r>
-            <w:proofErr w:type="gramEnd"/>
           </w:p>
         </w:tc>
         <w:tc>
@@ -1384,13 +1147,8 @@
           </w:tcPr>
           <w:p>
             <w:r>
-              <w:t>$</w:t>
+              <w:t>$O(1)$</w:t>
             </w:r>
-            <w:proofErr w:type="gramStart"/>
-            <w:r>
-              <w:t>O(1)$</w:t>
-            </w:r>
-            <w:proofErr w:type="gramEnd"/>
           </w:p>
         </w:tc>
         <w:tc>
@@ -1399,13 +1157,8 @@
           </w:tcPr>
           <w:p>
             <w:r>
-              <w:t>$O(log(n</w:t>
+              <w:t>$O(log(n))$</w:t>
             </w:r>
-            <w:proofErr w:type="gramStart"/>
-            <w:r>
-              <w:t>))$</w:t>
-            </w:r>
-            <w:proofErr w:type="gramEnd"/>
           </w:p>
         </w:tc>
       </w:tr>
@@ -1429,13 +1182,8 @@
           </w:tcPr>
           <w:p>
             <w:r>
-              <w:t>$O(log(n</w:t>
+              <w:t>$O(log(n))$</w:t>
             </w:r>
-            <w:proofErr w:type="gramStart"/>
-            <w:r>
-              <w:t>))$</w:t>
-            </w:r>
-            <w:proofErr w:type="gramEnd"/>
           </w:p>
         </w:tc>
         <w:tc>
@@ -1444,13 +1192,8 @@
           </w:tcPr>
           <w:p>
             <w:r>
-              <w:t>$</w:t>
+              <w:t>$O(1)$</w:t>
             </w:r>
-            <w:proofErr w:type="gramStart"/>
-            <w:r>
-              <w:t>O(1)$</w:t>
-            </w:r>
-            <w:proofErr w:type="gramEnd"/>
           </w:p>
         </w:tc>
         <w:tc>
@@ -1459,13 +1202,8 @@
           </w:tcPr>
           <w:p>
             <w:r>
-              <w:t>$O(log(n</w:t>
+              <w:t>$O(log(n))$</w:t>
             </w:r>
-            <w:proofErr w:type="gramStart"/>
-            <w:r>
-              <w:t>))$</w:t>
-            </w:r>
-            <w:proofErr w:type="gramEnd"/>
           </w:p>
         </w:tc>
       </w:tr>
@@ -1481,15 +1219,7 @@
         <w:t>because</w:t>
       </w:r>
       <w:r>
-        <w:t xml:space="preserve"> an AVL tree’s height is $O(log(n</w:t>
-      </w:r>
-      <w:proofErr w:type="gramStart"/>
-      <w:r>
-        <w:t>))$</w:t>
-      </w:r>
-      <w:proofErr w:type="gramEnd"/>
-      <w:r>
-        <w:t xml:space="preserve"> which was shown in the proof section.</w:t>
+        <w:t xml:space="preserve"> an AVL tree’s is $O(log(n))$ which was shown in the proof section.</w:t>
       </w:r>
       <w:r>
         <w:t xml:space="preserve"> </w:t>
@@ -1498,7 +1228,26 @@
         <w:t xml:space="preserve"> </w:t>
       </w:r>
       <w:r>
-        <w:t>To explain and validate the above runtimes we will walk through each of the function’s pseudo code and then explain it time and space complexity.</w:t>
+        <w:t>This means the cost of traversing to a leaf node will also be $O(\log(n))$</w:t>
+      </w:r>
+    </w:p>
+    <w:p>
+      <w:pPr>
+        <w:ind w:firstLine="720"/>
+      </w:pPr>
+    </w:p>
+    <w:p>
+      <w:pPr>
+        <w:ind w:firstLine="720"/>
+      </w:pPr>
+      <w:r>
+        <w:t xml:space="preserve">To explain and validate the above runtimes we will walk through each of the function’s pseudo code and then explain </w:t>
+      </w:r>
+      <w:r>
+        <w:t>each function’s</w:t>
+      </w:r>
+      <w:r>
+        <w:t xml:space="preserve"> time and space complexity.</w:t>
       </w:r>
     </w:p>
     <w:p>
@@ -1511,6 +1260,9 @@
     </w:p>
     <w:p>
       <w:r>
+        <w:rPr>
+          <w:noProof/>
+        </w:rPr>
         <w:drawing>
           <wp:inline distT="0" distB="0" distL="0" distR="0" wp14:anchorId="61419EE9" wp14:editId="38416B04">
             <wp:extent cx="5104263" cy="2068426"/>
@@ -1555,21 +1307,7 @@
     </w:p>
     <w:p>
       <w:r>
-        <w:t>T(n) = T_{Search}(\log(n)) + T_{RebalanceMetrics</w:t>
-      </w:r>
-      <w:proofErr w:type="gramStart"/>
-      <w:r>
-        <w:t>}</w:t>
-      </w:r>
-      <w:r>
-        <w:t>}(</w:t>
-      </w:r>
-      <w:proofErr w:type="gramEnd"/>
-      <w:r>
-        <w:t>\log(n))</w:t>
-      </w:r>
-      <w:r>
-        <w:t xml:space="preserve"> = 2\cdot \log(n) = O(log(n))</w:t>
+        <w:t>T(n) = T_{Search}(\log(n)) + T_{RebalanceMetrics}}(\log(n)) = 2\cdot \log(n) = O(log(n))</w:t>
       </w:r>
     </w:p>
     <w:p>
@@ -1585,42 +1323,29 @@
         <w:t>s</w:t>
       </w:r>
       <w:r>
-        <w:t xml:space="preserve"> only once we hit a leaf node, and we know this traversal will have $O(\log(n</w:t>
-      </w:r>
-      <w:proofErr w:type="gramStart"/>
-      <w:r>
-        <w:t>))$</w:t>
-      </w:r>
-      <w:proofErr w:type="gramEnd"/>
+        <w:t xml:space="preserve"> only once we hit a leaf node, and we know this traversal will have $O(\log(n))$</w:t>
+      </w:r>
       <w:r>
         <w:t xml:space="preserve"> </w:t>
       </w:r>
-      <w:proofErr w:type="gramStart"/>
-      <w:r>
-        <w:t>do</w:t>
-      </w:r>
-      <w:proofErr w:type="gramEnd"/>
+      <w:r>
+        <w:t>due</w:t>
+      </w:r>
       <w:r>
         <w:t xml:space="preserve"> to our height</w:t>
       </w:r>
       <w:r>
         <w:t xml:space="preserve">. Once we hit our leaf </w:t>
       </w:r>
-      <w:proofErr w:type="gramStart"/>
-      <w:r>
-        <w:t>node</w:t>
-      </w:r>
-      <w:proofErr w:type="gramEnd"/>
-      <w:r>
-        <w:t xml:space="preserve"> we will </w:t>
-      </w:r>
-      <w:proofErr w:type="gramStart"/>
-      <w:r>
-        <w:t>enter into</w:t>
-      </w:r>
-      <w:proofErr w:type="gramEnd"/>
-      <w:r>
-        <w:t xml:space="preserve"> phase two: `RebalanceMetrics`. In </w:t>
+      <w:r>
+        <w:t>node,</w:t>
+      </w:r>
+      <w:r>
+        <w:t xml:space="preserve"> we will enter </w:t>
+      </w:r>
+      <w:r>
+        <w:lastRenderedPageBreak/>
+        <w:t xml:space="preserve">into phase two: `RebalanceMetrics`. In </w:t>
       </w:r>
       <w:r>
         <w:t xml:space="preserve">this </w:t>
@@ -1629,83 +1354,61 @@
         <w:t xml:space="preserve">phase we move back up our tree and while doing so we will update our height and check to make sure our tree is balanced. In this phase we are guaranteed to make no more than one rotation [CITE]. </w:t>
       </w:r>
       <w:r>
-        <w:t xml:space="preserve">Note that best case, worst case and average case for </w:t>
-      </w:r>
-      <w:r>
-        <w:t>inserting into</w:t>
-      </w:r>
-      <w:r>
-        <w:t xml:space="preserve"> AVL tree is always O(log(n)) since we </w:t>
-      </w:r>
-      <w:proofErr w:type="gramStart"/>
-      <w:r>
-        <w:t>must  traverse</w:t>
-      </w:r>
-      <w:proofErr w:type="gramEnd"/>
-      <w:r>
-        <w:t xml:space="preserve"> to the leaf node and back up again</w:t>
+        <w:t xml:space="preserve">Note that best case, worst case and average case for inserting into </w:t>
+      </w:r>
+      <w:r>
+        <w:t xml:space="preserve">an </w:t>
+      </w:r>
+      <w:r>
+        <w:t xml:space="preserve">AVL tree </w:t>
+      </w:r>
+      <w:r>
+        <w:t>are</w:t>
+      </w:r>
+      <w:r>
+        <w:t xml:space="preserve"> </w:t>
+      </w:r>
+      <w:r>
+        <w:t>$</w:t>
+      </w:r>
+      <w:r>
+        <w:t>O(log(n))</w:t>
+      </w:r>
+      <w:r>
+        <w:t>$</w:t>
+      </w:r>
+      <w:r>
+        <w:t xml:space="preserve"> since we must  traverse to the leaf node and back up again.</w:t>
+      </w:r>
+    </w:p>
+    <w:p>
+      <w:pPr>
+        <w:ind w:firstLine="720"/>
+      </w:pPr>
+      <w:r>
+        <w:t>In our code base we used a recursive definition of an AVL insert which means each stack call contributes to our memory for a total of $O(log(n))$. During each stack call,</w:t>
+      </w:r>
+      <w:r>
+        <w:t xml:space="preserve"> all space operation are $O(1)$ which means our definition of insert is $S(n) = O(log(n))$</w:t>
       </w:r>
       <w:r>
         <w:t>.</w:t>
       </w:r>
-    </w:p>
-    <w:p>
-      <w:pPr>
-        <w:ind w:firstLine="720"/>
-      </w:pPr>
-      <w:r>
-        <w:t>In our code base we used a recursive definition of an AVL insert which means each stack call contributes to our memory for a total of $O(log(n</w:t>
-      </w:r>
-      <w:proofErr w:type="gramStart"/>
-      <w:r>
-        <w:t>))$</w:t>
-      </w:r>
-      <w:proofErr w:type="gramEnd"/>
-      <w:r>
-        <w:t>. During each stack call,</w:t>
-      </w:r>
-      <w:r>
-        <w:t xml:space="preserve"> all </w:t>
-      </w:r>
-      <w:r>
-        <w:lastRenderedPageBreak/>
-        <w:t xml:space="preserve">space operation </w:t>
-      </w:r>
-      <w:proofErr w:type="gramStart"/>
-      <w:r>
-        <w:t>are</w:t>
-      </w:r>
-      <w:proofErr w:type="gramEnd"/>
-      <w:r>
-        <w:t xml:space="preserve"> $</w:t>
-      </w:r>
-      <w:proofErr w:type="gramStart"/>
-      <w:r>
-        <w:t>O(1)$</w:t>
-      </w:r>
-      <w:proofErr w:type="gramEnd"/>
-      <w:r>
-        <w:t xml:space="preserve"> which means our definition of insert is $S(n) = O(log(n</w:t>
-      </w:r>
-      <w:proofErr w:type="gramStart"/>
-      <w:r>
-        <w:t>))$</w:t>
-      </w:r>
-      <w:proofErr w:type="gramEnd"/>
-      <w:r>
-        <w:t>.</w:t>
-      </w:r>
       <w:r>
         <w:t xml:space="preserve"> </w:t>
       </w:r>
       <w:r>
-        <w:t>This recursive definition for an AVL tree is purely academic since we can define it iteratively which would have $S(n) = O(</w:t>
-      </w:r>
-      <w:proofErr w:type="gramStart"/>
-      <w:r>
-        <w:t>1)$</w:t>
-      </w:r>
-      <w:proofErr w:type="gramEnd"/>
+        <w:t xml:space="preserve">This recursive definition for an AVL tree is purely academic since we can define </w:t>
+      </w:r>
+      <w:r>
+        <w:t>function</w:t>
+      </w:r>
+      <w:r>
+        <w:t xml:space="preserve"> iteratively which would have $S(n) = O(1)$</w:t>
+      </w:r>
+      <w:r>
+        <w:t xml:space="preserve"> </w:t>
+      </w:r>
       <w:r>
         <w:t xml:space="preserve">[Cite]. </w:t>
       </w:r>
@@ -1715,14 +1418,14 @@
         <w:pStyle w:val="Heading4"/>
       </w:pPr>
       <w:r>
-        <w:t>Search</w:t>
-      </w:r>
-      <w:r>
-        <w:t>:</w:t>
-      </w:r>
-    </w:p>
-    <w:p>
-      <w:r>
+        <w:t>Search:</w:t>
+      </w:r>
+    </w:p>
+    <w:p>
+      <w:r>
+        <w:rPr>
+          <w:noProof/>
+        </w:rPr>
         <w:drawing>
           <wp:inline distT="0" distB="0" distL="0" distR="0" wp14:anchorId="77F611C6" wp14:editId="0E4E51A6">
             <wp:extent cx="5943600" cy="2314575"/>
@@ -1767,15 +1470,7 @@
     </w:p>
     <w:p>
       <w:r>
-        <w:t xml:space="preserve">T(n) = </w:t>
-      </w:r>
-      <w:proofErr w:type="gramStart"/>
-      <w:r>
-        <w:t>T_{search}(</w:t>
-      </w:r>
-      <w:proofErr w:type="gramEnd"/>
-      <w:r>
-        <w:t>\log(n))</w:t>
+        <w:t>T(n) = T_{search}(\log(n))</w:t>
       </w:r>
     </w:p>
     <w:p>
@@ -1784,66 +1479,78 @@
       </w:r>
     </w:p>
     <w:p>
+      <w:pPr>
+        <w:ind w:firstLine="720"/>
+      </w:pPr>
       <w:r>
         <w:t xml:space="preserve">The above code outlines our definition for searching an AVL tree. </w:t>
       </w:r>
       <w:r>
-        <w:t xml:space="preserve">We start off with a `while` which loops until we find </w:t>
-      </w:r>
-      <w:r>
-        <w:t>our search value. Under the assumption of the worst case, we can assume that we must traverse to the leaf node which would be $O(\log(n</w:t>
-      </w:r>
-      <w:proofErr w:type="gramStart"/>
-      <w:r>
-        <w:t>))$</w:t>
-      </w:r>
-      <w:proofErr w:type="gramEnd"/>
-      <w:r>
-        <w:t>, which defines our worst case. Looking beyond a worst-case scenario, our best-case would be $</w:t>
-      </w:r>
-      <w:proofErr w:type="gramStart"/>
-      <w:r>
-        <w:t>O(1)$</w:t>
-      </w:r>
-      <w:proofErr w:type="gramEnd"/>
-      <w:r>
-        <w:t xml:space="preserve"> which would assume we find our value in the root node. Our average case would traverse half down half the height of our tree which would still be $log(n)</w:t>
-      </w:r>
-      <w:proofErr w:type="gramStart"/>
-      <w:r>
-        <w:t>$ .</w:t>
-      </w:r>
-      <w:proofErr w:type="gramEnd"/>
+        <w:t xml:space="preserve">We start off with a </w:t>
+      </w:r>
+      <w:r>
+        <w:t>`</w:t>
+      </w:r>
+      <w:r>
+        <w:t>while`</w:t>
+      </w:r>
+      <w:r>
+        <w:t xml:space="preserve"> loop</w:t>
+      </w:r>
+      <w:r>
+        <w:t xml:space="preserve"> which </w:t>
+      </w:r>
+      <w:r>
+        <w:t xml:space="preserve">iterates </w:t>
+      </w:r>
+      <w:r>
+        <w:t xml:space="preserve">until we find </w:t>
+      </w:r>
+      <w:r>
+        <w:t>our search value. Under the assumption of the worst case, we can assume that we must traverse to the leaf node which would be $O(\log(n))$. Looking beyond a worst-case scenario, our best-case would be $O(1)$ which would assume we find our value in the root node. Our average case would traverse half down half the height of our tree which would still be $log(n)$ .</w:t>
+      </w:r>
     </w:p>
     <w:p>
       <w:r>
         <w:tab/>
-        <w:t>Our search definition uses an</w:t>
-      </w:r>
-      <w:r>
-        <w:t xml:space="preserve"> iterative solution. Our definition of searching shows us calling data within our current node. This means that our space complexity is constant resulting in $S(n) = </w:t>
-      </w:r>
-      <w:proofErr w:type="gramStart"/>
-      <w:r>
-        <w:t>O(1)$</w:t>
-      </w:r>
-      <w:proofErr w:type="gramEnd"/>
-      <w:r>
-        <w:t xml:space="preserve">. Our definition of search could be done </w:t>
+        <w:t xml:space="preserve">Our search </w:t>
+      </w:r>
+      <w:r>
+        <w:t>function</w:t>
+      </w:r>
+      <w:r>
+        <w:t xml:space="preserve"> uses an</w:t>
+      </w:r>
+      <w:r>
+        <w:t xml:space="preserve"> iterative solution. </w:t>
+      </w:r>
+      <w:r>
+        <w:t xml:space="preserve">This iterative solutions space complexity remains constant through each loop and thus </w:t>
+      </w:r>
+      <w:r>
+        <w:t>$S(n) = O(1)$</w:t>
+      </w:r>
+      <w:r>
+        <w:t xml:space="preserve">. </w:t>
+      </w:r>
+      <w:r>
+        <w:t xml:space="preserve">Our </w:t>
+      </w:r>
+      <w:r>
+        <w:t>function for</w:t>
+      </w:r>
+      <w:r>
+        <w:t xml:space="preserve"> </w:t>
+      </w:r>
+      <w:r>
+        <w:lastRenderedPageBreak/>
+        <w:t xml:space="preserve">search could be done </w:t>
       </w:r>
       <w:r>
         <w:t>recursively</w:t>
       </w:r>
       <w:r>
-        <w:t xml:space="preserve"> which would </w:t>
-      </w:r>
-      <w:proofErr w:type="gramStart"/>
-      <w:r>
-        <w:t>results</w:t>
-      </w:r>
-      <w:proofErr w:type="gramEnd"/>
-      <w:r>
-        <w:t xml:space="preserve"> in a space complexity of $S(n) = log(n)$ since each stack call would contribute to our memory footprint.</w:t>
+        <w:t xml:space="preserve"> which would results in a space complexity of $S(n) = log(n)$.</w:t>
       </w:r>
     </w:p>
     <w:p>
@@ -1851,15 +1558,14 @@
         <w:pStyle w:val="Heading4"/>
       </w:pPr>
       <w:r>
-        <w:lastRenderedPageBreak/>
-        <w:t>Delete</w:t>
-      </w:r>
-      <w:r>
-        <w:t>:</w:t>
-      </w:r>
-    </w:p>
-    <w:p>
-      <w:r>
+        <w:t>Delete:</w:t>
+      </w:r>
+    </w:p>
+    <w:p>
+      <w:r>
+        <w:rPr>
+          <w:noProof/>
+        </w:rPr>
         <w:drawing>
           <wp:inline distT="0" distB="0" distL="0" distR="0" wp14:anchorId="1FD33300" wp14:editId="0CCCA6B6">
             <wp:extent cx="5943600" cy="3514090"/>
@@ -1904,46 +1610,10 @@
     </w:p>
     <w:p>
       <w:r>
-        <w:t xml:space="preserve">T(n) = </w:t>
-      </w:r>
-      <w:proofErr w:type="gramStart"/>
-      <w:r>
-        <w:t>T_{Search}(</w:t>
-      </w:r>
-      <w:proofErr w:type="gramEnd"/>
-      <w:r>
-        <w:t xml:space="preserve">\log(n)) + </w:t>
-      </w:r>
-      <w:proofErr w:type="gramStart"/>
-      <w:r>
-        <w:t>T_{</w:t>
-      </w:r>
-      <w:r>
-        <w:t>FindReplacement</w:t>
-      </w:r>
-      <w:r>
-        <w:t>}(</w:t>
-      </w:r>
-      <w:proofErr w:type="gramEnd"/>
-      <w:r>
-        <w:t xml:space="preserve">\log(n)) </w:t>
-      </w:r>
-      <w:r>
-        <w:t xml:space="preserve">+ </w:t>
-      </w:r>
-      <w:proofErr w:type="gramStart"/>
-      <w:r>
-        <w:t>T_{</w:t>
-      </w:r>
-      <w:r>
-        <w:t>MetricsRotations</w:t>
-      </w:r>
-      <w:r>
-        <w:t>}(</w:t>
-      </w:r>
-      <w:proofErr w:type="gramEnd"/>
-      <w:r>
-        <w:t xml:space="preserve">\log(n)) </w:t>
+        <w:t xml:space="preserve">T(n) = T_{Search}(\log(n)) + </w:t>
+      </w:r>
+      <w:r>
+        <w:t xml:space="preserve">T_{FindReplacement}(\log(n)) + T_{MetricsRotations}(\log(n)) </w:t>
       </w:r>
       <w:r>
         <w:t xml:space="preserve">= </w:t>
@@ -1977,15 +1647,7 @@
         <w:t>deleting</w:t>
       </w:r>
       <w:r>
-        <w:t xml:space="preserve"> </w:t>
-      </w:r>
-      <w:proofErr w:type="gramStart"/>
-      <w:r>
-        <w:t>a value</w:t>
-      </w:r>
-      <w:proofErr w:type="gramEnd"/>
-      <w:r>
-        <w:t xml:space="preserve"> from our AVL tree. In the pseudo code we have </w:t>
+        <w:t xml:space="preserve"> a value from our AVL tree. In the pseudo code we have </w:t>
       </w:r>
       <w:r>
         <w:t>outlined</w:t>
@@ -2000,197 +1662,52 @@
         <w:t xml:space="preserve"> phases. In the first phase, we move down the down to the node we </w:t>
       </w:r>
       <w:r>
-        <w:t>want to delete which undert the worst case is $O(log(n</w:t>
-      </w:r>
-      <w:proofErr w:type="gramStart"/>
-      <w:r>
-        <w:t>))$</w:t>
-      </w:r>
-      <w:proofErr w:type="gramEnd"/>
-      <w:r>
-        <w:t xml:space="preserve">. Once we find our value to </w:t>
-      </w:r>
-      <w:proofErr w:type="gramStart"/>
-      <w:r>
-        <w:t>delete</w:t>
-      </w:r>
-      <w:proofErr w:type="gramEnd"/>
-      <w:r>
-        <w:t xml:space="preserve"> we move onto phase two which finds a replacement value for it. To find a replacement value for our node, we will find the minimum value in </w:t>
-      </w:r>
-      <w:proofErr w:type="gramStart"/>
-      <w:r>
-        <w:t>the our</w:t>
-      </w:r>
-      <w:proofErr w:type="gramEnd"/>
-      <w:r>
-        <w:t xml:space="preserve"> right-</w:t>
-      </w:r>
-      <w:proofErr w:type="gramStart"/>
-      <w:r>
-        <w:t>subtree, and</w:t>
-      </w:r>
-      <w:proofErr w:type="gramEnd"/>
-      <w:r>
-        <w:t xml:space="preserve"> move it to our deleted node’s location. This operation under a worst case contributes $O \log(n)$ to our </w:t>
-      </w:r>
-      <w:proofErr w:type="gramStart"/>
-      <w:r>
-        <w:t>runtime, and</w:t>
-      </w:r>
-      <w:proofErr w:type="gramEnd"/>
-      <w:r>
-        <w:t xml:space="preserve"> needed </w:t>
-      </w:r>
-      <w:proofErr w:type="gramStart"/>
+        <w:t xml:space="preserve">want to delete which undert the worst case is $O(log(n))$. Once we find our value to delete we move onto phase two which finds a replacement value for it. To find a replacement value for our node, we will find the minimum value in the our right-subtree, and move it to our deleted node’s location. This operation under a worst case contributes $O \log(n)$ to our runtime, and needed </w:t>
+      </w:r>
       <w:r>
         <w:t>in order</w:t>
       </w:r>
       <w:r>
-        <w:t xml:space="preserve"> to</w:t>
-      </w:r>
-      <w:proofErr w:type="gramEnd"/>
-      <w:r>
-        <w:t xml:space="preserve"> keep our BST structure. In our final phase we move back up our tree and recalculate height and perform any necessary rotations. Unlike insertion, which at most can cause two rotations, deleting can have a cascading effect which will cause $log(n)$ rotations</w:t>
-      </w:r>
-      <w:r>
-        <w:t xml:space="preserve">. Taken together we arrive with a worst case of log(n) which is outlines in the above equation. Unfortunately, since we </w:t>
-      </w:r>
-      <w:proofErr w:type="gramStart"/>
-      <w:r>
-        <w:t>have to</w:t>
-      </w:r>
-      <w:proofErr w:type="gramEnd"/>
-      <w:r>
-        <w:t xml:space="preserve"> always find a replacement node for our deletions, our best and average case </w:t>
-      </w:r>
-      <w:proofErr w:type="gramStart"/>
-      <w:r>
-        <w:t>will be also be</w:t>
-      </w:r>
-      <w:proofErr w:type="gramEnd"/>
-      <w:r>
-        <w:t xml:space="preserve"> $Log(n)$</w:t>
-      </w:r>
-    </w:p>
-    <w:p>
+        <w:t xml:space="preserve"> to keep our BST structure. In our final phase we move back up our tree and recalculate height and perform any necessary rotations. Unlike insertion, which at most can cause two rotations, deleting can have a cascading effect which will cause $log(n)$ rotations</w:t>
+      </w:r>
+      <w:r>
+        <w:t xml:space="preserve">. Taken together we arrive with a worst case of log(n) which is outlines in the above equation. Unfortunately, since we have </w:t>
+      </w:r>
       <w:r>
         <w:lastRenderedPageBreak/>
+        <w:t>to always find a replacement node for our deletions, our best and average case will be also be $Log(n)$</w:t>
+      </w:r>
+    </w:p>
+    <w:p>
+      <w:r>
         <w:tab/>
         <w:t xml:space="preserve">Our definition of deletion uses recursion which means each </w:t>
       </w:r>
       <w:r>
-        <w:t>recursive</w:t>
-      </w:r>
-      <w:r>
-        <w:t xml:space="preserve"> </w:t>
-      </w:r>
-      <w:proofErr w:type="gramStart"/>
+        <w:t xml:space="preserve">recursive </w:t>
+      </w:r>
       <w:r>
         <w:t>call</w:t>
       </w:r>
       <w:r>
         <w:t>s</w:t>
       </w:r>
-      <w:proofErr w:type="gramEnd"/>
       <w:r>
         <w:t xml:space="preserve"> will contribute to our overall memory footprint. </w:t>
       </w:r>
       <w:r>
-        <w:t>In our first phase, search, we at most make $O(log(n</w:t>
-      </w:r>
-      <w:proofErr w:type="gramStart"/>
-      <w:r>
-        <w:t>))$</w:t>
-      </w:r>
-      <w:proofErr w:type="gramEnd"/>
-      <w:r>
-        <w:t xml:space="preserve"> and each variable in that recursive call are constant. Our next phase we find a replace and delete the node. This phase happens once and finding a </w:t>
-      </w:r>
-      <w:proofErr w:type="gramStart"/>
-      <w:r>
-        <w:t>replacements</w:t>
-      </w:r>
-      <w:proofErr w:type="gramEnd"/>
-      <w:r>
-        <w:t xml:space="preserve"> can take </w:t>
-      </w:r>
-      <w:r>
-        <w:t>$O(log(n</w:t>
-      </w:r>
-      <w:proofErr w:type="gramStart"/>
-      <w:r>
-        <w:t>))$</w:t>
-      </w:r>
-      <w:proofErr w:type="gramEnd"/>
-      <w:r>
-        <w:t xml:space="preserve"> since we must find a leaf. Finally, in our last phase we move back up the tree and adjust height and make any necessary rotations. This final phase can take up to $O(log(n</w:t>
-      </w:r>
-      <w:proofErr w:type="gramStart"/>
-      <w:r>
-        <w:t>))$</w:t>
-      </w:r>
-      <w:proofErr w:type="gramEnd"/>
-      <w:r>
-        <w:t xml:space="preserve">. </w:t>
-      </w:r>
-      <w:r>
-        <w:t xml:space="preserve">Combining this </w:t>
-      </w:r>
-      <w:proofErr w:type="gramStart"/>
-      <w:r>
-        <w:t>information</w:t>
-      </w:r>
-      <w:proofErr w:type="gramEnd"/>
-      <w:r>
-        <w:t xml:space="preserve"> we arrive at the following</w:t>
-      </w:r>
-    </w:p>
-    <w:p>
-      <w:r>
-        <w:t xml:space="preserve"> $S(n) = T{search}(\log(n</w:t>
-      </w:r>
-      <w:proofErr w:type="gramStart"/>
-      <w:r>
-        <w:t>))+</w:t>
-      </w:r>
-      <w:proofErr w:type="gramEnd"/>
-      <w:r>
-        <w:t xml:space="preserve">  </w:t>
-      </w:r>
-      <w:r>
-        <w:t>T{search}(\log(n)</w:t>
-      </w:r>
-      <w:proofErr w:type="gramStart"/>
-      <w:r>
-        <w:t>)</w:t>
-      </w:r>
-      <w:r>
-        <w:t xml:space="preserve"> </w:t>
-      </w:r>
-      <w:r>
-        <w:t>))+</w:t>
-      </w:r>
-      <w:proofErr w:type="gramEnd"/>
-      <w:r>
-        <w:t xml:space="preserve">  </w:t>
-      </w:r>
-      <w:proofErr w:type="gramStart"/>
-      <w:r>
-        <w:t>T{</w:t>
-      </w:r>
-      <w:r>
-        <w:t xml:space="preserve">RebalanceHeight </w:t>
-      </w:r>
-      <w:r>
-        <w:t>}</w:t>
-      </w:r>
-      <w:proofErr w:type="gramEnd"/>
-      <w:r>
-        <w:t>(\log(n))</w:t>
-      </w:r>
-      <w:r>
-        <w:t xml:space="preserve"> </w:t>
+        <w:t xml:space="preserve">In our first phase, search, we at most make $O(log(n))$ and each variable in that recursive call are constant. Our next phase we find a replace and delete the node. This phase happens once and finding a replacements can take $O(log(n))$ since we must find a leaf. Finally, in our last phase we move back up the tree and adjust height and make any necessary rotations. This final phase can take up to $O(log(n))$. </w:t>
+      </w:r>
+      <w:r>
+        <w:t>Combining this information we arrive at the following</w:t>
+      </w:r>
+    </w:p>
+    <w:p>
+      <w:r>
+        <w:t xml:space="preserve"> $S(n) = T{search}(\log(n))+  T{search}(\log(n))</w:t>
+      </w:r>
+      <w:r>
+        <w:t xml:space="preserve"> ))+  T{RebalanceHeight }(\log(n)) </w:t>
       </w:r>
       <w:r>
         <w:t>$</w:t>
@@ -2204,31 +1721,7 @@
         <w:t>It should be noted that this is a recursive definition of deletion</w:t>
       </w:r>
       <w:r>
-        <w:t xml:space="preserve">, but there </w:t>
-      </w:r>
-      <w:proofErr w:type="gramStart"/>
-      <w:r>
-        <w:t>are</w:t>
-      </w:r>
-      <w:proofErr w:type="gramEnd"/>
-      <w:r>
-        <w:t xml:space="preserve"> iterative </w:t>
-      </w:r>
-      <w:proofErr w:type="gramStart"/>
-      <w:r>
-        <w:t>solution</w:t>
-      </w:r>
-      <w:proofErr w:type="gramEnd"/>
-      <w:r>
-        <w:t xml:space="preserve">. If we were to use an iterative solution we would have $S(n) = </w:t>
-      </w:r>
-      <w:proofErr w:type="gramStart"/>
-      <w:r>
-        <w:t>O(1)$</w:t>
-      </w:r>
-      <w:proofErr w:type="gramEnd"/>
-      <w:r>
-        <w:t>. To achieve this space complexity, we would need to implement parent pointers for each node, so that we could traverse backwards [6].</w:t>
+        <w:t>, but there are iterative solution. If we were to use an iterative solution we would have $S(n) = O(1)$. To achieve this space complexity, we would need to implement parent pointers for each node, so that we could traverse backwards [6].</w:t>
       </w:r>
     </w:p>
     <w:p>
@@ -2264,13 +1757,8 @@
       <w:r>
         <w:t xml:space="preserve"> that our initial plan might have been overzealous and thus we scaled back to AVL and traditional BSTs. </w:t>
       </w:r>
-      <w:proofErr w:type="gramStart"/>
-      <w:r>
-        <w:t>With this in mind, you</w:t>
-      </w:r>
-      <w:proofErr w:type="gramEnd"/>
-      <w:r>
-        <w:t xml:space="preserve"> will notice that our code follows a reusable template that can be adapted for future projects and experiments. </w:t>
+      <w:r>
+        <w:t xml:space="preserve">With this in mind, you will notice that our code follows a reusable template that can be adapted for future projects and experiments. </w:t>
       </w:r>
     </w:p>
     <w:p>
@@ -2286,6 +1774,9 @@
         <w:jc w:val="center"/>
       </w:pPr>
       <w:r>
+        <w:rPr>
+          <w:noProof/>
+        </w:rPr>
         <w:drawing>
           <wp:inline distT="0" distB="0" distL="0" distR="0" wp14:anchorId="5709E2F4" wp14:editId="32B17AF2">
             <wp:extent cx="4599296" cy="1937502"/>
@@ -2325,28 +1816,17 @@
     </w:p>
     <w:p>
       <w:r>
+        <w:lastRenderedPageBreak/>
         <w:t xml:space="preserve">The figure above shows our entire experimental design for this report. As you can see, we were able to perform a significant number of trials across </w:t>
       </w:r>
       <w:r>
         <w:t>various</w:t>
       </w:r>
       <w:r>
-        <w:t xml:space="preserve"> blocking criteria. This design allowed us to have an expansive empirical analysis, and furthermore, gave us room </w:t>
-      </w:r>
-      <w:r>
-        <w:lastRenderedPageBreak/>
-        <w:t>to expand our analysis in the future. Below we will discuss each</w:t>
-      </w:r>
-      <w:r>
-        <w:t xml:space="preserve"> </w:t>
-      </w:r>
-      <w:proofErr w:type="gramStart"/>
-      <w:r>
-        <w:t>block</w:t>
-      </w:r>
-      <w:proofErr w:type="gramEnd"/>
-      <w:r>
-        <w:t xml:space="preserve"> criteria and why we made these decisions.</w:t>
+        <w:t xml:space="preserve"> blocking criteria. This design allowed us to have an expansive empirical analysis, and furthermore, gave us room to expand our analysis in the future. Below we will discuss each</w:t>
+      </w:r>
+      <w:r>
+        <w:t xml:space="preserve"> block criteria and why we made these decisions.</w:t>
       </w:r>
     </w:p>
     <w:p>
@@ -2381,24 +1861,11 @@
         <w:t xml:space="preserve">For this project we ran each tree across two datasets. One dataset was completely randomized with numbers between 0 to 100 million. The other dataset </w:t>
       </w:r>
       <w:r>
-        <w:t xml:space="preserve">contained the same datapoints as our randomized </w:t>
-      </w:r>
-      <w:proofErr w:type="gramStart"/>
-      <w:r>
-        <w:t>dataset</w:t>
-      </w:r>
-      <w:proofErr w:type="gramEnd"/>
-      <w:r>
-        <w:t xml:space="preserve"> but it was in </w:t>
-      </w:r>
-      <w:proofErr w:type="gramStart"/>
-      <w:r>
-        <w:t xml:space="preserve">sorted </w:t>
+        <w:t xml:space="preserve">contained the same datapoints as our randomized dataset but it was in sorted </w:t>
       </w:r>
       <w:r>
         <w:t>order</w:t>
       </w:r>
-      <w:proofErr w:type="gramEnd"/>
       <w:r>
         <w:t>. We chose these two types of data sets because it would highlight the benefits of a self-balancing tree when compared to a traditional binary search tree.</w:t>
       </w:r>
@@ -2420,15 +1887,7 @@
         </w:numPr>
       </w:pPr>
       <w:r>
-        <w:t xml:space="preserve">Insert: this operation </w:t>
-      </w:r>
-      <w:proofErr w:type="gramStart"/>
-      <w:r>
-        <w:t>add</w:t>
-      </w:r>
-      <w:proofErr w:type="gramEnd"/>
-      <w:r>
-        <w:t xml:space="preserve"> to the BST. </w:t>
+        <w:t xml:space="preserve">Insert: this operation add to the BST. </w:t>
       </w:r>
     </w:p>
     <w:p>
@@ -2452,15 +1911,7 @@
         </w:numPr>
       </w:pPr>
       <w:r>
-        <w:t xml:space="preserve">Delete: This operation deletes a value from </w:t>
-      </w:r>
-      <w:proofErr w:type="gramStart"/>
-      <w:r>
-        <w:t>out</w:t>
-      </w:r>
-      <w:proofErr w:type="gramEnd"/>
-      <w:r>
-        <w:t xml:space="preserve"> BST. It should be noted that we add our value back in after deletion inorder to preserve our values of $n$.</w:t>
+        <w:t>Delete: This operation deletes a value from out BST. It should be noted that we add our value back in after deletion inorder to preserve our values of $n$.</w:t>
       </w:r>
     </w:p>
     <w:p>
@@ -2480,37 +1931,7 @@
         </w:numPr>
       </w:pPr>
       <w:r>
-        <w:t xml:space="preserve">Time: our time variable end up being our most tricky variable to measure. We noticed during our initial experimentation that random noise </w:t>
-      </w:r>
-      <w:r>
-        <w:t>ended up</w:t>
-      </w:r>
-      <w:r>
-        <w:t xml:space="preserve"> being the dominating factor for our time variable. To diminish the effect of random noise, we ran each experiment in a batch of 1,000 and then took the average result. Given that each run was independent and our residuals were randomly distributed this diminished the effects of noise. We </w:t>
-      </w:r>
-      <w:proofErr w:type="gramStart"/>
-      <w:r>
-        <w:t>did  not</w:t>
-      </w:r>
-      <w:proofErr w:type="gramEnd"/>
-      <w:r>
-        <w:t xml:space="preserve"> take the average result for our insertion operation. Insertion, by </w:t>
-      </w:r>
-      <w:proofErr w:type="gramStart"/>
-      <w:r>
-        <w:t>it</w:t>
-      </w:r>
-      <w:proofErr w:type="gramEnd"/>
-      <w:r>
-        <w:t xml:space="preserve"> varied nature, is not independent meaning that $n$ is dependent on $n-</w:t>
-      </w:r>
-      <w:proofErr w:type="gramStart"/>
-      <w:r>
-        <w:t>1}$</w:t>
-      </w:r>
-      <w:proofErr w:type="gramEnd"/>
-      <w:r>
-        <w:t xml:space="preserve">. We therefore took the sum of inserting a 1,000 data points at a time, which admittedly is not perfect solution. </w:t>
+        <w:t xml:space="preserve">Time: our time variable end up being our most tricky variable to measure. We noticed during our initial experimentation that random noise ended up being the dominating factor for our time variable. To diminish the effect of random noise, we ran each experiment in a batch of 1,000 and then took the average result. Given that each run was independent and our residuals were randomly distributed this diminished the effects of noise. We did  not take the average result for our insertion operation. Insertion, by it varied nature, is not independent meaning that $n$ is dependent on $n-1}$. We therefore took the sum of inserting a 1,000 data points at a time, which admittedly is not perfect solution. </w:t>
       </w:r>
     </w:p>
     <w:p>
@@ -2522,15 +1943,11 @@
         </w:numPr>
       </w:pPr>
       <w:r>
-        <w:t xml:space="preserve">Operation Count: for each tree we tracked the total number of </w:t>
-      </w:r>
-      <w:proofErr w:type="gramStart"/>
-      <w:r>
-        <w:t>operation</w:t>
-      </w:r>
-      <w:proofErr w:type="gramEnd"/>
-      <w:r>
-        <w:t xml:space="preserve"> performed during each operation. To count operations is tricky and can be considered subjective. Therefor this metric is great for comparing varying </w:t>
+        <w:t xml:space="preserve">Operation Count: for each tree we tracked the total number of operation performed during each operation. To count operations is tricky and can be considered </w:t>
+      </w:r>
+      <w:r>
+        <w:lastRenderedPageBreak/>
+        <w:t xml:space="preserve">subjective. Therefor this metric is great for comparing varying </w:t>
       </w:r>
       <w:r>
         <w:t>levels</w:t>
@@ -2548,7 +1965,6 @@
         </w:numPr>
       </w:pPr>
       <w:r>
-        <w:lastRenderedPageBreak/>
         <w:t>Custom: This metric was a placeholder for a metric specific to the BST in question. For our experiment, we used this place holder metric to count the number of rotations an AVL made during an operation</w:t>
       </w:r>
     </w:p>
@@ -2583,15 +1999,7 @@
         <w:t xml:space="preserve"> accommodate our experimental design, we really needed</w:t>
       </w:r>
       <w:r>
-        <w:t xml:space="preserve"> a robust code base that was able to </w:t>
-      </w:r>
-      <w:proofErr w:type="gramStart"/>
-      <w:r>
-        <w:t>accommodate for</w:t>
-      </w:r>
-      <w:proofErr w:type="gramEnd"/>
-      <w:r>
-        <w:t xml:space="preserve"> all our metrics</w:t>
+        <w:t xml:space="preserve"> a robust code base that was able to accommodate for all our metrics</w:t>
       </w:r>
       <w:r>
         <w:t xml:space="preserve">. </w:t>
@@ -2645,39 +2053,7 @@
         <w:t xml:space="preserve"> then converted to C code (CITE)(CITE)(CITE). </w:t>
       </w:r>
       <w:r>
-        <w:t xml:space="preserve">Using GeekForGeeks’ Python code </w:t>
-      </w:r>
-      <w:proofErr w:type="gramStart"/>
-      <w:r>
-        <w:t>provide</w:t>
-      </w:r>
-      <w:proofErr w:type="gramEnd"/>
-      <w:r>
-        <w:t xml:space="preserve"> starting point and then the </w:t>
-      </w:r>
-      <w:proofErr w:type="gramStart"/>
-      <w:r>
-        <w:t>act  of</w:t>
-      </w:r>
-      <w:proofErr w:type="gramEnd"/>
-      <w:r>
-        <w:t xml:space="preserve"> converting it to </w:t>
-      </w:r>
-      <w:proofErr w:type="gramStart"/>
-      <w:r>
-        <w:t>provided</w:t>
-      </w:r>
-      <w:proofErr w:type="gramEnd"/>
-      <w:r>
-        <w:t xml:space="preserve"> </w:t>
-      </w:r>
-      <w:proofErr w:type="gramStart"/>
-      <w:r>
-        <w:t>a valuable</w:t>
-      </w:r>
-      <w:proofErr w:type="gramEnd"/>
-      <w:r>
-        <w:t xml:space="preserve"> learning experience. </w:t>
+        <w:t xml:space="preserve">Using GeekForGeeks’ Python code provide starting point and then the act  of converting it to provided a valuable learning experience. </w:t>
       </w:r>
       <w:r>
         <w:t xml:space="preserve">While converting python to C, we took this opportunity to create a standard framework between our </w:t>
@@ -2692,23 +2068,7 @@
     <w:p>
       <w:r>
         <w:tab/>
-        <w:t>Each binary search contained two public structs, node and index, and four public functions, create index, search, insert and delete. Having this common framework allowed us to easily re-</w:t>
-      </w:r>
-      <w:proofErr w:type="gramStart"/>
-      <w:r>
-        <w:t>uses</w:t>
-      </w:r>
-      <w:proofErr w:type="gramEnd"/>
-      <w:r>
-        <w:t xml:space="preserve"> out benchmarking code across different implementations. Currently our tree structure needs to be refactored </w:t>
-      </w:r>
-      <w:proofErr w:type="gramStart"/>
-      <w:r>
-        <w:t>in order to</w:t>
-      </w:r>
-      <w:proofErr w:type="gramEnd"/>
-      <w:r>
-        <w:t xml:space="preserve"> generalize the code base. Although, our AVL and BST share a common framework, due to time we were unable to create generics for them. Having generics would make our dry and would make our implementation more modular. </w:t>
+        <w:t xml:space="preserve">Each binary search contained two public structs, node and index, and four public functions, create index, search, insert and delete. Having this common framework allowed us to easily re-uses out benchmarking code across different implementations. Currently our tree structure needs to be refactored in order to generalize the code base. Although, our AVL and BST share a common framework, due to time we were unable to create generics for them. Having generics would make our dry and would make our implementation more modular. </w:t>
       </w:r>
     </w:p>
     <w:p>
@@ -2724,6 +2084,9 @@
         <w:jc w:val="center"/>
       </w:pPr>
       <w:r>
+        <w:rPr>
+          <w:noProof/>
+        </w:rPr>
         <w:drawing>
           <wp:inline distT="0" distB="0" distL="0" distR="0" wp14:anchorId="16F70DDB" wp14:editId="0DC0804D">
             <wp:extent cx="3514299" cy="1640006"/>
@@ -2766,19 +2129,8 @@
         <w:ind w:firstLine="360"/>
       </w:pPr>
       <w:r>
-        <w:t xml:space="preserve">Our benchmarking library housed all our logic for tracking and benchmarking the experiments. Each tree was given its own </w:t>
-      </w:r>
-      <w:proofErr w:type="gramStart"/>
-      <w:r>
-        <w:t>benchmarking  script</w:t>
-      </w:r>
-      <w:proofErr w:type="gramEnd"/>
-      <w:r>
-        <w:t xml:space="preserve"> which was then called by </w:t>
-      </w:r>
-      <w:r>
         <w:lastRenderedPageBreak/>
-        <w:t>our main function. Each benchmarking was composed of two private functions: `</w:t>
+        <w:t>Our benchmarking library housed all our logic for tracking and benchmarking the experiments. Each tree was given its own benchmarking  script which was then called by our main function. Each benchmarking was composed of two private functions: `</w:t>
       </w:r>
       <w:r>
         <w:t>__get_regular_operation_time</w:t>
@@ -2790,31 +2142,7 @@
         <w:t>__get_insertion_time</w:t>
       </w:r>
       <w:r>
-        <w:t>`, which tracked the runtime for inserting value. To run an experiment the user needs to call `make main` and then call `</w:t>
-      </w:r>
-      <w:proofErr w:type="gramStart"/>
-      <w:r>
-        <w:t>.\main.out .</w:t>
-      </w:r>
-      <w:proofErr w:type="gramEnd"/>
-      <w:r>
-        <w:t xml:space="preserve"> If the user </w:t>
-      </w:r>
-      <w:proofErr w:type="gramStart"/>
-      <w:r>
-        <w:t>desires to</w:t>
-      </w:r>
-      <w:proofErr w:type="gramEnd"/>
-      <w:r>
-        <w:t xml:space="preserve"> to control the experiment </w:t>
-      </w:r>
-      <w:proofErr w:type="gramStart"/>
-      <w:r>
-        <w:t>run</w:t>
-      </w:r>
-      <w:proofErr w:type="gramEnd"/>
-      <w:r>
-        <w:t xml:space="preserve"> they can all pass in additional keyword arguments (see figure above).</w:t>
+        <w:t>`, which tracked the runtime for inserting value. To run an experiment the user needs to call `make main` and then call `.\main.out . If the user desires to to control the experiment run they can all pass in additional keyword arguments (see figure above).</w:t>
       </w:r>
     </w:p>
     <w:p>
@@ -2839,34 +2167,10 @@
         <w:t>review</w:t>
       </w:r>
       <w:r>
-        <w:t xml:space="preserve"> the results from the experiment </w:t>
-      </w:r>
-      <w:proofErr w:type="gramStart"/>
-      <w:r>
-        <w:t>describe</w:t>
-      </w:r>
-      <w:proofErr w:type="gramEnd"/>
-      <w:r>
-        <w:t xml:space="preserve"> in the previous section. </w:t>
-      </w:r>
-      <w:r>
-        <w:t xml:space="preserve">Our goal in this analysis is to validate our theoretical analysis by showing how the data describes </w:t>
-      </w:r>
-      <w:proofErr w:type="gramStart"/>
-      <w:r>
-        <w:t>it</w:t>
-      </w:r>
-      <w:proofErr w:type="gramEnd"/>
-      <w:r>
-        <w:t xml:space="preserve"> run time. Mostly this will be a descriptive analysis where we look at various types of graphs and describe what we </w:t>
-      </w:r>
-      <w:proofErr w:type="gramStart"/>
-      <w:r>
-        <w:t>are seeing</w:t>
-      </w:r>
-      <w:proofErr w:type="gramEnd"/>
-      <w:r>
-        <w:t xml:space="preserve"> in the results. To conclude this section, Will perform a predictive exercise where we see if we can’t effectively regress tree size on operation.</w:t>
+        <w:t xml:space="preserve"> the results from the experiment describe in the previous section. </w:t>
+      </w:r>
+      <w:r>
+        <w:t>Our goal in this analysis is to validate our theoretical analysis by showing how the data describes it run time. Mostly this will be a descriptive analysis where we look at various types of graphs and describe what we are seeing in the results. To conclude this section, Will perform a predictive exercise where we see if we can’t effectively regress tree size on operation.</w:t>
       </w:r>
     </w:p>
     <w:p>
@@ -2879,6 +2183,9 @@
     </w:p>
     <w:p>
       <w:r>
+        <w:rPr>
+          <w:noProof/>
+        </w:rPr>
         <w:drawing>
           <wp:inline distT="0" distB="0" distL="0" distR="0" wp14:anchorId="2C1B57D4" wp14:editId="43F0491E">
             <wp:extent cx="6423858" cy="1910686"/>
@@ -2975,21 +2282,17 @@
         </w:tabs>
       </w:pPr>
       <w:r>
-        <w:t xml:space="preserve">Our first observation of note </w:t>
-      </w:r>
-      <w:proofErr w:type="gramStart"/>
-      <w:r>
-        <w:t>are</w:t>
-      </w:r>
-      <w:proofErr w:type="gramEnd"/>
-      <w:r>
-        <w:t xml:space="preserve"> the noticeable step in our `in order dataset lines`.  We are not exactly sure why we are seeing this stepping pattern, </w:t>
+        <w:t xml:space="preserve">Our first observation of note are the noticeable step in our `in order dataset lines`.  We are not exactly sure why we are seeing this stepping pattern, </w:t>
       </w:r>
       <w:r>
         <w:t xml:space="preserve">but we hypothesize that in order insertion causes leaf node levels to be more uniform. </w:t>
       </w:r>
       <w:r>
-        <w:t xml:space="preserve">Another insight comes from the noise in the `delete random line`. This noise is expected since deletion can cause cascading changes, but nonetheless the trend still looks logarithmic. </w:t>
+        <w:t xml:space="preserve">Another insight comes from the noise in the `delete random line`. This noise is expected since deletion can cause cascading </w:t>
+      </w:r>
+      <w:r>
+        <w:lastRenderedPageBreak/>
+        <w:t xml:space="preserve">changes, but nonetheless the trend still looks logarithmic. </w:t>
       </w:r>
       <w:r>
         <w:t>To summarize, these results show and validate $</w:t>
@@ -3006,12 +2309,14 @@
         <w:pStyle w:val="Heading3"/>
       </w:pPr>
       <w:r>
-        <w:lastRenderedPageBreak/>
         <w:t>Height Vs Number of Nodes</w:t>
       </w:r>
     </w:p>
     <w:p>
       <w:r>
+        <w:rPr>
+          <w:noProof/>
+        </w:rPr>
         <w:drawing>
           <wp:inline distT="0" distB="0" distL="0" distR="0" wp14:anchorId="4AF67EED" wp14:editId="7FFA657D">
             <wp:extent cx="5943600" cy="2362835"/>
@@ -3060,15 +2365,7 @@
         <w:t>corresponds to</w:t>
       </w:r>
       <w:r>
-        <w:t xml:space="preserve"> the number of nodes in in an AVL tree ($n$). Previously, our proof showed that $h=O(log(n</w:t>
-      </w:r>
-      <w:proofErr w:type="gramStart"/>
-      <w:r>
-        <w:t>))$</w:t>
-      </w:r>
-      <w:proofErr w:type="gramEnd"/>
-      <w:r>
-        <w:t xml:space="preserve">, and once again our results </w:t>
+        <w:t xml:space="preserve"> the number of nodes in in an AVL tree ($n$). Previously, our proof showed that $h=O(log(n))$, and once again our results </w:t>
       </w:r>
       <w:r>
         <w:t xml:space="preserve">clearly validate our initial conclusion. </w:t>
@@ -3089,15 +2386,7 @@
         <w:t xml:space="preserve"> a stepping pattern which represents our tree acquiring another level. </w:t>
       </w:r>
       <w:r>
-        <w:t xml:space="preserve">We expect each step to get larger as the tree </w:t>
-      </w:r>
-      <w:proofErr w:type="gramStart"/>
-      <w:r>
-        <w:t>grow</w:t>
-      </w:r>
-      <w:proofErr w:type="gramEnd"/>
-      <w:r>
-        <w:t xml:space="preserve"> by a factor of ~$2^n$. Another notable pattern comes from the significant height difference between a randomly built AVL tree and an in order built AVL tree. This algins to Brown’s findings, which noted that in order insertion produced a tree which was over 2 times faster than a randomly built tree [CITE].</w:t>
+        <w:t>We expect each step to get larger as the tree grow by a factor of ~$2^n$. Another notable pattern comes from the significant height difference between a randomly built AVL tree and an in order built AVL tree. This algins to Brown’s findings, which noted that in order insertion produced a tree which was over 2 times faster than a randomly built tree [CITE].</w:t>
       </w:r>
     </w:p>
     <w:p>
@@ -3118,6 +2407,9 @@
         <w:jc w:val="center"/>
       </w:pPr>
       <w:r>
+        <w:rPr>
+          <w:noProof/>
+        </w:rPr>
         <w:drawing>
           <wp:inline distT="0" distB="0" distL="0" distR="0" wp14:anchorId="212C95D8" wp14:editId="197408D8">
             <wp:extent cx="4524233" cy="2233598"/>
@@ -3157,6 +2449,7 @@
     </w:p>
     <w:p>
       <w:r>
+        <w:lastRenderedPageBreak/>
         <w:tab/>
         <w:t xml:space="preserve">The graph above describes the number of rotations </w:t>
       </w:r>
@@ -3170,11 +2463,7 @@
         <w:t>s</w:t>
       </w:r>
       <w:r>
-        <w:t xml:space="preserve">. The first </w:t>
-      </w:r>
-      <w:r>
-        <w:lastRenderedPageBreak/>
-        <w:t>thing to note is the AVL in order insertion column.</w:t>
+        <w:t>. The first thing to note is the AVL in order insertion column.</w:t>
       </w:r>
       <w:r>
         <w:t xml:space="preserve"> This column showed that in order insertions caused 1 rotation</w:t>
@@ -3203,32 +2492,11 @@
       <w:r>
         <w:t>“</w:t>
       </w:r>
-      <w:proofErr w:type="gramStart"/>
       <w:r>
         <w:t>link</w:t>
       </w:r>
       <w:r>
-        <w:t>ed-list</w:t>
-      </w:r>
-      <w:proofErr w:type="gramEnd"/>
-      <w:r>
-        <w:t xml:space="preserve">” which must be corrected with a coresponding rotation. Brown’s work showed that a sorted AVL tree caused a nearly 2 times increase in </w:t>
-      </w:r>
-      <w:proofErr w:type="gramStart"/>
-      <w:r>
-        <w:t>the  number</w:t>
-      </w:r>
-      <w:proofErr w:type="gramEnd"/>
-      <w:r>
-        <w:t xml:space="preserve"> of rotations when compared to </w:t>
-      </w:r>
-      <w:proofErr w:type="gramStart"/>
-      <w:r>
-        <w:t>an</w:t>
-      </w:r>
-      <w:proofErr w:type="gramEnd"/>
-      <w:r>
-        <w:t xml:space="preserve"> randomly built AVL tree, and our results confirm his findings. </w:t>
+        <w:t xml:space="preserve">ed-list” which must be corrected with a coresponding rotation. Brown’s work showed that a sorted AVL tree caused a nearly 2 times increase in the  number of rotations when compared to an randomly built AVL tree, and our results confirm his findings. </w:t>
       </w:r>
     </w:p>
     <w:p/>
@@ -3237,14 +2505,14 @@
         <w:pStyle w:val="Heading3"/>
       </w:pPr>
       <w:r>
-        <w:t>Linear Regression</w:t>
-      </w:r>
-      <w:r>
-        <w:t>:</w:t>
-      </w:r>
-    </w:p>
-    <w:p>
-      <w:r>
+        <w:t>Linear Regression:</w:t>
+      </w:r>
+    </w:p>
+    <w:p>
+      <w:r>
+        <w:rPr>
+          <w:noProof/>
+        </w:rPr>
         <w:drawing>
           <wp:inline distT="0" distB="0" distL="0" distR="0" wp14:anchorId="5587EB1C" wp14:editId="26916635">
             <wp:extent cx="5943600" cy="1463675"/>
@@ -3317,15 +2585,7 @@
         <w:t xml:space="preserve"> to perform a simple linear regression. </w:t>
       </w:r>
       <w:r>
-        <w:t>The goal of this analysis is to regress the number operations against $\log(n)$, and hopefully by doing so revealing $O(log(n</w:t>
-      </w:r>
-      <w:proofErr w:type="gramStart"/>
-      <w:r>
-        <w:t>))$</w:t>
-      </w:r>
-      <w:proofErr w:type="gramEnd"/>
-      <w:r>
-        <w:t xml:space="preserve"> for insertion. Our results and equation can be found above and additional information</w:t>
+        <w:t>The goal of this analysis is to regress the number operations against $\log(n)$, and hopefully by doing so revealing $O(log(n))$ for insertion. Our results and equation can be found above and additional information</w:t>
       </w:r>
       <w:r>
         <w:t xml:space="preserve"> for our experiment can be found in the appendic</w:t>
@@ -3339,27 +2599,13 @@
         <w:ind w:firstLine="720"/>
       </w:pPr>
       <w:r>
-        <w:t xml:space="preserve">Our experiment was able to produce </w:t>
-      </w:r>
-      <w:proofErr w:type="gramStart"/>
-      <w:r>
-        <w:t>an  $</w:t>
-      </w:r>
-      <w:proofErr w:type="gramEnd"/>
-      <w:r>
-        <w:t>R^2$ value of 5</w:t>
+        <w:t>Our experiment was able to produce an  $R^2$ value of 5</w:t>
       </w:r>
       <w:r>
         <w:t>2</w:t>
       </w:r>
       <w:r>
-        <w:t xml:space="preserve">%. Our </w:t>
-      </w:r>
-      <w:r>
-        <w:t xml:space="preserve">$R^2$ </w:t>
-      </w:r>
-      <w:r>
-        <w:t xml:space="preserve">reveals how important a theoretical analysis is for any study. </w:t>
+        <w:t xml:space="preserve">%. Our $R^2$ reveals how important a theoretical analysis is for any study. </w:t>
       </w:r>
       <w:r>
         <w:t>Data for an empircal</w:t>
@@ -3368,18 +2614,10 @@
         <w:t xml:space="preserve"> analysis </w:t>
       </w:r>
       <w:r>
-        <w:t xml:space="preserve">can </w:t>
-      </w:r>
-      <w:proofErr w:type="gramStart"/>
-      <w:r>
-        <w:t xml:space="preserve">be </w:t>
-      </w:r>
-      <w:r>
-        <w:t xml:space="preserve"> very</w:t>
-      </w:r>
-      <w:proofErr w:type="gramEnd"/>
-      <w:r>
-        <w:t xml:space="preserve"> noisy and this noise can make results </w:t>
+        <w:t xml:space="preserve">can be </w:t>
+      </w:r>
+      <w:r>
+        <w:t xml:space="preserve"> very noisy and this noise can make results </w:t>
       </w:r>
       <w:r>
         <w:t>ambiguou</w:t>
@@ -3402,17 +2640,17 @@
         <w:t xml:space="preserve"> residual plot shows homoscedasticity and normally distributed residuals. </w:t>
       </w:r>
       <w:r>
-        <w:t xml:space="preserve">The only violation of BLUE would be the linearity assumption. The linearity assumption may be broken since we can see a </w:t>
+        <w:t xml:space="preserve">The only violation of BLUE would be </w:t>
+      </w:r>
+      <w:r>
+        <w:lastRenderedPageBreak/>
+        <w:t xml:space="preserve">the linearity assumption. The linearity assumption may be broken since we can see a </w:t>
       </w:r>
       <w:r>
         <w:t xml:space="preserve">slight </w:t>
       </w:r>
       <w:r>
-        <w:t xml:space="preserve">stepping pattern in our residual plot. This stepping pattern can be explained with the height </w:t>
-      </w:r>
-      <w:r>
-        <w:lastRenderedPageBreak/>
-        <w:t>of our tree increasing for specific ranges of $n$. In summary</w:t>
+        <w:t>stepping pattern in our residual plot. This stepping pattern can be explained with the height of our tree increasing for specific ranges of $n$. In summary</w:t>
       </w:r>
       <w:r>
         <w:t xml:space="preserve">, our model shows $log(n)$ performance which algins with our theoretical analysis. </w:t>
@@ -3443,6 +2681,9 @@
     </w:p>
     <w:p>
       <w:r>
+        <w:rPr>
+          <w:noProof/>
+        </w:rPr>
         <w:drawing>
           <wp:inline distT="0" distB="0" distL="0" distR="0" wp14:anchorId="3C4775B8" wp14:editId="47D20149">
             <wp:extent cx="5943600" cy="2827655"/>
@@ -3490,6 +2731,9 @@
     </w:p>
     <w:p>
       <w:r>
+        <w:rPr>
+          <w:noProof/>
+        </w:rPr>
         <w:drawing>
           <wp:inline distT="0" distB="0" distL="0" distR="0" wp14:anchorId="2B0C561E" wp14:editId="04E9E05A">
             <wp:extent cx="5943600" cy="2065655"/>
@@ -3534,6 +2778,9 @@
     </w:p>
     <w:p>
       <w:r>
+        <w:rPr>
+          <w:noProof/>
+        </w:rPr>
         <w:lastRenderedPageBreak/>
         <w:drawing>
           <wp:inline distT="0" distB="0" distL="0" distR="0" wp14:anchorId="52C08C06" wp14:editId="0D8963D4">
@@ -3591,49 +2838,7 @@
           <w:rPr>
             <w:rStyle w:val="Hyperlink"/>
           </w:rPr>
-          <w:t>https://www.cs.roches</w:t>
-        </w:r>
-        <w:r>
-          <w:rPr>
-            <w:rStyle w:val="Hyperlink"/>
-          </w:rPr>
-          <w:t>t</w:t>
-        </w:r>
-        <w:r>
-          <w:rPr>
-            <w:rStyle w:val="Hyperlink"/>
-          </w:rPr>
-          <w:t>e</w:t>
-        </w:r>
-        <w:r>
-          <w:rPr>
-            <w:rStyle w:val="Hyperlink"/>
-          </w:rPr>
-          <w:t>r.edu/~hbeadle/csc162/_static</w:t>
-        </w:r>
-        <w:r>
-          <w:rPr>
-            <w:rStyle w:val="Hyperlink"/>
-          </w:rPr>
-          <w:t>/</w:t>
-        </w:r>
-        <w:r>
-          <w:rPr>
-            <w:rStyle w:val="Hyperlink"/>
-          </w:rPr>
-          <w:t>lect</w:t>
-        </w:r>
-        <w:r>
-          <w:rPr>
-            <w:rStyle w:val="Hyperlink"/>
-          </w:rPr>
-          <w:t>u</w:t>
-        </w:r>
-        <w:r>
-          <w:rPr>
-            <w:rStyle w:val="Hyperlink"/>
-          </w:rPr>
-          <w:t>res/ds_history.pdf</w:t>
+          <w:t>https://www.cs.rochester.edu/~hbeadle/csc162/_static/lectures/ds_history.pdf</w:t>
         </w:r>
       </w:hyperlink>
     </w:p>
@@ -3650,19 +2855,7 @@
           <w:rPr>
             <w:rStyle w:val="Hyperlink"/>
           </w:rPr>
-          <w:t>https://www.c</w:t>
-        </w:r>
-        <w:r>
-          <w:rPr>
-            <w:rStyle w:val="Hyperlink"/>
-          </w:rPr>
-          <w:t>s</w:t>
-        </w:r>
-        <w:r>
-          <w:rPr>
-            <w:rStyle w:val="Hyperlink"/>
-          </w:rPr>
-          <w:t>.umd.edu/class/fall2021/cmsc132-030X/labs/Week15/AdvancedTrees.pdf</w:t>
+          <w:t>https://www.cs.umd.edu/class/fall2021/cmsc132-030X/labs/Week15/AdvancedTrees.pdf</w:t>
         </w:r>
       </w:hyperlink>
       <w:r>
@@ -3682,19 +2875,7 @@
           <w:rPr>
             <w:rStyle w:val="Hyperlink"/>
           </w:rPr>
-          <w:t>Balanced Binar</w:t>
-        </w:r>
-        <w:r>
-          <w:rPr>
-            <w:rStyle w:val="Hyperlink"/>
-          </w:rPr>
-          <w:t>y</w:t>
-        </w:r>
-        <w:r>
-          <w:rPr>
-            <w:rStyle w:val="Hyperlink"/>
-          </w:rPr>
-          <w:t xml:space="preserve"> Tree - GeeksforGeeks</w:t>
+          <w:t>Balanced Binary Tree - GeeksforGeeks</w:t>
         </w:r>
       </w:hyperlink>
     </w:p>
@@ -3740,8 +2921,42 @@
           <w:numId w:val="4"/>
         </w:numPr>
       </w:pPr>
-      <w:r>
-        <w:t>https://www.geeksforgeeks.org/dsa/avl-trees-containing-a-parent-node-pointer/</w:t>
+      <w:hyperlink r:id="rId25" w:history="1">
+        <w:r>
+          <w:rPr>
+            <w:rStyle w:val="Hyperlink"/>
+          </w:rPr>
+          <w:t>https://www.geeksforgeeks.org/dsa/avl-trees-containing-a-parent-node-pointer/</w:t>
+        </w:r>
+      </w:hyperlink>
+    </w:p>
+    <w:p>
+      <w:pPr>
+        <w:pStyle w:val="ListParagraph"/>
+        <w:numPr>
+          <w:ilvl w:val="0"/>
+          <w:numId w:val="4"/>
+        </w:numPr>
+      </w:pPr>
+      <w:hyperlink r:id="rId26" w:history="1">
+        <w:r>
+          <w:rPr>
+            <w:rStyle w:val="Hyperlink"/>
+          </w:rPr>
+          <w:t>https://www.cs.umd.edu/class/fall2019/cmsc420-0201/Lects/lect05-avl.pdf</w:t>
+        </w:r>
+      </w:hyperlink>
+    </w:p>
+    <w:p>
+      <w:pPr>
+        <w:pStyle w:val="ListParagraph"/>
+        <w:numPr>
+          <w:ilvl w:val="0"/>
+          <w:numId w:val="4"/>
+        </w:numPr>
+      </w:pPr>
+      <w:r>
+        <w:t>https://www.youtube.com/watch?v=hUzRX1LzGXI</w:t>
       </w:r>
     </w:p>
     <w:p/>

</xml_diff>

<commit_message>
conclusion in word 50% done
</commit_message>
<xml_diff>
--- a/AVL Trees.docx
+++ b/AVL Trees.docx
@@ -57,8 +57,13 @@
       <w:r>
         <w:t xml:space="preserve"> </w:t>
       </w:r>
-      <w:r>
-        <w:t xml:space="preserve">have a significant flaw in that they are entirely dependent on the insertion of the data. When a binary tree is unbalanced, its performance is affected and can result in a worst-case scenario of O(n) for various operations. </w:t>
+      <w:proofErr w:type="gramStart"/>
+      <w:r>
+        <w:t>have</w:t>
+      </w:r>
+      <w:proofErr w:type="gramEnd"/>
+      <w:r>
+        <w:t xml:space="preserve"> a significant flaw in that they are entirely dependent on the insertion of the data. When a binary tree is unbalanced, its performance is affected and can result in a worst-case scenario of O(n) for various operations. </w:t>
       </w:r>
     </w:p>
     <w:p>
@@ -123,7 +128,23 @@
         <w:t xml:space="preserve">: </w:t>
       </w:r>
       <w:r>
-        <w:t>Showing $h = O(\log((n))$ and then a</w:t>
+        <w:t>Showing $h = O(\</w:t>
+      </w:r>
+      <w:proofErr w:type="gramStart"/>
+      <w:r>
+        <w:t>log((</w:t>
+      </w:r>
+      <w:proofErr w:type="gramEnd"/>
+      <w:r>
+        <w:t>n</w:t>
+      </w:r>
+      <w:proofErr w:type="gramStart"/>
+      <w:r>
+        <w:t>))$</w:t>
+      </w:r>
+      <w:proofErr w:type="gramEnd"/>
+      <w:r>
+        <w:t xml:space="preserve"> and then a</w:t>
       </w:r>
       <w:r>
         <w:t>nalyzing Big(O) for insertion, deletion, and searching.</w:t>
@@ -152,10 +173,20 @@
         <w:t>/Experiment</w:t>
       </w:r>
       <w:r>
-        <w:t>: A discussion of the reports code base and</w:t>
-      </w:r>
-      <w:r>
-        <w:t>of our experiment</w:t>
+        <w:t xml:space="preserve">: A discussion of the reports code base </w:t>
+      </w:r>
+      <w:proofErr w:type="spellStart"/>
+      <w:proofErr w:type="gramStart"/>
+      <w:r>
+        <w:t>and</w:t>
+      </w:r>
+      <w:r>
+        <w:t>of</w:t>
+      </w:r>
+      <w:proofErr w:type="spellEnd"/>
+      <w:proofErr w:type="gramEnd"/>
+      <w:r>
+        <w:t xml:space="preserve"> our experiment</w:t>
       </w:r>
       <w:r>
         <w:t>.</w:t>
@@ -207,12 +238,60 @@
         <w:tab/>
       </w:r>
       <w:r>
-        <w:t>In 1962, a pair of Soviet mathematicians, Georgy Adelson-Velsky and Evgenii Landis, sought to create a data structure that guaranteed $O(\log(n))$ performance for deletion, search, and insertion[1]. To reach this goal, they needed a tree that was as dense as possible. This idea of a dense tree is what can be referred to as a balanced tree. A balanced tree is a tree whose height at the root node is no larger than $log(n)$ [3]. As previously discussed, when we have this property, a BST is guaranteed to achieve  $O(\log(n))$ performance, but a traditional BST is not guaranteed to be balanced. To solve this issue, our Soviet mathematicians created the AVL tree, which is a self-balancing binary search tree.</w:t>
-      </w:r>
-    </w:p>
-    <w:p>
-      <w:r>
-        <w:t xml:space="preserve">Today, the AVL tree has a rich history of practical application.  For example, Linux kernel before 2.4.10 used AVL trees for tracking virtual memory areas. Linux also uses AVL trees for its peer cache tracking system. Generally, AVL trees are used in system operating kernels and other system software. AVL trees are foundational to computer science because they have characteristics that are both practical and useful. In particular, this data </w:t>
+        <w:t>In 1962, a pair of Soviet mathematicians, Georgy Adelson-</w:t>
+      </w:r>
+      <w:proofErr w:type="spellStart"/>
+      <w:r>
+        <w:t>Velsky</w:t>
+      </w:r>
+      <w:proofErr w:type="spellEnd"/>
+      <w:r>
+        <w:t xml:space="preserve"> and Evgenii Landis, sought to create a data structure that guaranteed $O(\log(n</w:t>
+      </w:r>
+      <w:proofErr w:type="gramStart"/>
+      <w:r>
+        <w:t>))$</w:t>
+      </w:r>
+      <w:proofErr w:type="gramEnd"/>
+      <w:r>
+        <w:t xml:space="preserve"> performance for deletion, search, and </w:t>
+      </w:r>
+      <w:proofErr w:type="gramStart"/>
+      <w:r>
+        <w:t>insertion[</w:t>
+      </w:r>
+      <w:proofErr w:type="gramEnd"/>
+      <w:r>
+        <w:t xml:space="preserve">1]. To reach this goal, they needed a tree that was as dense as possible. This idea of a dense tree is what can be referred to as a balanced tree. A balanced tree is a tree whose height at the root node is no larger than $log(n)$ [3]. As previously discussed, when we have this property, a BST is guaranteed to </w:t>
+      </w:r>
+      <w:proofErr w:type="gramStart"/>
+      <w:r>
+        <w:t>achieve  $</w:t>
+      </w:r>
+      <w:proofErr w:type="gramEnd"/>
+      <w:r>
+        <w:t>O(\log(n</w:t>
+      </w:r>
+      <w:proofErr w:type="gramStart"/>
+      <w:r>
+        <w:t>))$</w:t>
+      </w:r>
+      <w:proofErr w:type="gramEnd"/>
+      <w:r>
+        <w:t xml:space="preserve"> performance, but a traditional BST is not guaranteed to be balanced. To solve this issue, our Soviet mathematicians created the AVL tree, which is a self-balancing binary search tree.</w:t>
+      </w:r>
+    </w:p>
+    <w:p>
+      <w:r>
+        <w:t xml:space="preserve">Today, the AVL tree has a rich history of practical application.  For example, Linux kernel before 2.4.10 used AVL trees for tracking virtual memory areas. Linux also uses AVL trees for its peer cache tracking system. Generally, AVL trees are used in system operating kernels and other system software. AVL trees are foundational to computer science because they have characteristics that are both practical and useful. </w:t>
+      </w:r>
+      <w:proofErr w:type="gramStart"/>
+      <w:r>
+        <w:t>In particular, this</w:t>
+      </w:r>
+      <w:proofErr w:type="gramEnd"/>
+      <w:r>
+        <w:t xml:space="preserve"> data </w:t>
       </w:r>
       <w:r>
         <w:lastRenderedPageBreak/>
@@ -306,7 +385,23 @@
         <w:tab/>
       </w:r>
       <w:r>
-        <w:t>Figure 1 outlines some fundamental properties of an AVL tree. Each node in an AVL tree stores its height, or simply put, the length of the longest path beneath it.  With the height of a node, we can then calculate a node’s  balance factor ($B_F$), which is the difference in the height of a node's left and right subtrees. When a $B_F$ is positive, our left subtree is taller, and when it is negative, our right subtree is taller. We use $B_F$ to identify imbalance within our tree, and if $|B_F| &gt; 1$ we correct for this imbalance. When an AVL tree is constrained to this property, we are guaranteed to have a height of $O(log(n))$.  To maintain the property of $|B_F| \le 1$, an AVL tree performs left, right, left-right, and right-left rotations.</w:t>
+        <w:t xml:space="preserve">Figure 1 outlines some fundamental properties of an AVL tree. Each node in an AVL tree stores its height, or simply put, the length of the longest path beneath it.  With the height of a node, we can then calculate a </w:t>
+      </w:r>
+      <w:proofErr w:type="gramStart"/>
+      <w:r>
+        <w:t>node’s  balance</w:t>
+      </w:r>
+      <w:proofErr w:type="gramEnd"/>
+      <w:r>
+        <w:t xml:space="preserve"> factor ($B_F$), which is the difference in the height of a node's left and right subtrees. When a $B_F$ is positive, our left subtree is taller, and when it is negative, our right subtree is taller. We use $B_F$ to identify imbalance within our tree, and if $|B_F| &gt; 1$ we correct for this imbalance. When an AVL tree is constrained to this property, we are guaranteed to have a height of $O(log(n</w:t>
+      </w:r>
+      <w:proofErr w:type="gramStart"/>
+      <w:r>
+        <w:t>))$</w:t>
+      </w:r>
+      <w:proofErr w:type="gramEnd"/>
+      <w:r>
+        <w:t>.  To maintain the property of $|B_F| \le 1$, an AVL tree performs left, right, left-right, and right-left rotations.</w:t>
       </w:r>
     </w:p>
     <w:p/>
@@ -423,7 +518,63 @@
     </w:p>
     <w:p>
       <w:r>
-        <w:t>The above figure shows the process for a right rotation. Left and right rotations are inversely related, and thus, fundamentally, their core logic is the same. Since these rotations are logically equivalent, we will just cover a right rotation. For an example of a left rotation, please see the appendix (cite). A right rotation is triggered by a left imbalance in the tree . Looking at the diagram above, we find that Node 3 has a $B_F \ge 1$  and Node 2 has a $B_F \ge 0$. Under these conditions, we trigger the process of a right rotation. The Pseudo code above walks through this process step-by-step, but simply put, Node 2 becomes the new root node in this process, with node 3 being reassigned as its right child.</w:t>
+        <w:t xml:space="preserve">The above figure shows the process for </w:t>
+      </w:r>
+      <w:proofErr w:type="gramStart"/>
+      <w:r>
+        <w:t>a right</w:t>
+      </w:r>
+      <w:proofErr w:type="gramEnd"/>
+      <w:r>
+        <w:t xml:space="preserve"> rotation. Left and right rotations are inversely related, and thus, fundamentally, their core logic is the same. Since these rotations are logically equivalent, we will just cover </w:t>
+      </w:r>
+      <w:proofErr w:type="gramStart"/>
+      <w:r>
+        <w:t>a right</w:t>
+      </w:r>
+      <w:proofErr w:type="gramEnd"/>
+      <w:r>
+        <w:t xml:space="preserve"> rotation. For an example of a left rotation, please see the appendix (cite). </w:t>
+      </w:r>
+      <w:proofErr w:type="gramStart"/>
+      <w:r>
+        <w:t>A right</w:t>
+      </w:r>
+      <w:proofErr w:type="gramEnd"/>
+      <w:r>
+        <w:t xml:space="preserve"> rotation is triggered by a left imbalance in the </w:t>
+      </w:r>
+      <w:proofErr w:type="gramStart"/>
+      <w:r>
+        <w:t>tree .</w:t>
+      </w:r>
+      <w:proofErr w:type="gramEnd"/>
+      <w:r>
+        <w:t xml:space="preserve"> Looking at the diagram above, we find that Node 3 has a $B_F \</w:t>
+      </w:r>
+      <w:proofErr w:type="spellStart"/>
+      <w:r>
+        <w:t>ge</w:t>
+      </w:r>
+      <w:proofErr w:type="spellEnd"/>
+      <w:r>
+        <w:t xml:space="preserve"> 1</w:t>
+      </w:r>
+      <w:proofErr w:type="gramStart"/>
+      <w:r>
+        <w:t>$  and</w:t>
+      </w:r>
+      <w:proofErr w:type="gramEnd"/>
+      <w:r>
+        <w:t xml:space="preserve"> Node 2 has a $B_F \</w:t>
+      </w:r>
+      <w:proofErr w:type="spellStart"/>
+      <w:r>
+        <w:t>ge</w:t>
+      </w:r>
+      <w:proofErr w:type="spellEnd"/>
+      <w:r>
+        <w:t xml:space="preserve"> 0$. Under these conditions, we trigger the process of a right rotation. The Pseudo code above walks through this process step-by-step, but simply put, Node 2 becomes the new root node in this process, with node 3 being reassigned as its right child.</w:t>
       </w:r>
     </w:p>
     <w:p>
@@ -502,7 +653,15 @@
     </w:p>
     <w:p>
       <w:r>
-        <w:t>When we have an imbalance that has a zigzag pattern, we perform either a left-right (LR) or a right-left (RL) rotation. The diagram above outlines an LR rotation, and in the appendix, you’ll find similar logic for an RL rotation (CITE). An LR rotation is triggered by two conditions: condition one, the parent node has a $B_F&gt;1$; and condition two, the parent node’s left child has a $B_F&lt;0$. To fix this imbalance, we perform two steps:</w:t>
+        <w:t xml:space="preserve">When we have an imbalance that has a zigzag pattern, we perform either a left-right (LR) or a right-left (RL) rotation. The diagram above outlines an LR rotation, and in the appendix, you’ll find similar logic for an RL rotation (CITE). An LR rotation is triggered by two conditions: condition one, the parent node has a $B_F&gt;1$; and condition two, the parent node’s left child has a $B_F&lt;0$. To fix this imbalance, we </w:t>
+      </w:r>
+      <w:proofErr w:type="gramStart"/>
+      <w:r>
+        <w:t>perform</w:t>
+      </w:r>
+      <w:proofErr w:type="gramEnd"/>
+      <w:r>
+        <w:t xml:space="preserve"> two steps:</w:t>
       </w:r>
     </w:p>
     <w:p>
@@ -555,7 +714,23 @@
         <w:t>for</w:t>
       </w:r>
       <w:r>
-        <w:t xml:space="preserve"> an AVL tree. To accomplish this, our main objective will be to show that height of our AVL tree is bounded by $O(log(n))$.</w:t>
+        <w:t xml:space="preserve"> an AVL tree. To accomplish this, our main objective will be to show that height of our AVL tree is </w:t>
+      </w:r>
+      <w:proofErr w:type="gramStart"/>
+      <w:r>
+        <w:t>bounded</w:t>
+      </w:r>
+      <w:proofErr w:type="gramEnd"/>
+      <w:r>
+        <w:t xml:space="preserve"> by $O(log(n</w:t>
+      </w:r>
+      <w:proofErr w:type="gramStart"/>
+      <w:r>
+        <w:t>))$</w:t>
+      </w:r>
+      <w:proofErr w:type="gramEnd"/>
+      <w:r>
+        <w:t>.</w:t>
       </w:r>
       <w:r>
         <w:t xml:space="preserve"> </w:t>
@@ -573,8 +748,13 @@
         <w:t xml:space="preserve">will subsequently rely on this fact and then show that the functions search, deletion and insertion time complexities are </w:t>
       </w:r>
       <w:r>
-        <w:t>$O(log(n))$</w:t>
-      </w:r>
+        <w:t>$O(log(n</w:t>
+      </w:r>
+      <w:proofErr w:type="gramStart"/>
+      <w:r>
+        <w:t>))$</w:t>
+      </w:r>
+      <w:proofErr w:type="gramEnd"/>
       <w:r>
         <w:t>.</w:t>
       </w:r>
@@ -610,20 +790,42 @@
         <w:t>AVL tree</w:t>
       </w:r>
       <w:r>
-        <w:t xml:space="preserve"> is $O(log(n))$. We will break down this section into two sub-sections. The first section will be our proof which is a </w:t>
-      </w:r>
-      <w:r>
-        <w:t xml:space="preserve">relies on the previous work of </w:t>
+        <w:t xml:space="preserve"> is $O(log(n</w:t>
+      </w:r>
+      <w:proofErr w:type="gramStart"/>
+      <w:r>
+        <w:t>))$</w:t>
+      </w:r>
+      <w:proofErr w:type="gramEnd"/>
+      <w:r>
+        <w:t xml:space="preserve">. We will break down this section into two sub-sections. The first section will be our proof which is a </w:t>
+      </w:r>
+      <w:proofErr w:type="gramStart"/>
+      <w:r>
+        <w:t>relies</w:t>
+      </w:r>
+      <w:proofErr w:type="gramEnd"/>
+      <w:r>
+        <w:t xml:space="preserve"> on the previous work </w:t>
+      </w:r>
+      <w:proofErr w:type="gramStart"/>
+      <w:r>
+        <w:t xml:space="preserve">of </w:t>
       </w:r>
       <w:r>
         <w:t xml:space="preserve"> </w:t>
       </w:r>
       <w:r>
-        <w:t xml:space="preserve">Moshiri </w:t>
+        <w:t>Moshiri</w:t>
+      </w:r>
+      <w:proofErr w:type="gramEnd"/>
+      <w:r>
+        <w:t xml:space="preserve"> </w:t>
       </w:r>
       <w:r>
         <w:t xml:space="preserve">and </w:t>
       </w:r>
+      <w:proofErr w:type="gramStart"/>
       <w:r>
         <w:t>Mount</w:t>
       </w:r>
@@ -631,7 +833,11 @@
         <w:t xml:space="preserve">  </w:t>
       </w:r>
       <w:r>
-        <w:t>(cite, cite).</w:t>
+        <w:t>(</w:t>
+      </w:r>
+      <w:proofErr w:type="gramEnd"/>
+      <w:r>
+        <w:t>cite, cite).</w:t>
       </w:r>
       <w:r>
         <w:t xml:space="preserve"> In the subsequent section, we will have a detailed discussion around our proof. </w:t>
@@ -663,8 +869,21 @@
         <w:ind w:firstLine="720"/>
       </w:pPr>
       <w:r>
-        <w:t>The proof above shows that the height of an AVL tree is bounded to $O(\log(n))$</w:t>
-      </w:r>
+        <w:t xml:space="preserve">The proof above shows that the height of an AVL tree is </w:t>
+      </w:r>
+      <w:proofErr w:type="gramStart"/>
+      <w:r>
+        <w:t>bounded</w:t>
+      </w:r>
+      <w:proofErr w:type="gramEnd"/>
+      <w:r>
+        <w:t xml:space="preserve"> to $O(\log(n</w:t>
+      </w:r>
+      <w:proofErr w:type="gramStart"/>
+      <w:r>
+        <w:t>))$</w:t>
+      </w:r>
+      <w:proofErr w:type="gramEnd"/>
       <w:r>
         <w:t xml:space="preserve">. </w:t>
       </w:r>
@@ -691,7 +910,23 @@
         <w:t>their</w:t>
       </w:r>
       <w:r>
-        <w:t xml:space="preserve"> proofs, it was revealed that’s solving for height ($h$) was actually more difficult than solving for the minimum number of nodes under a specific height ($N_h$). If we can show that $N_h$ grows exponentially as the $h$ increases, we can reverse this </w:t>
+        <w:t xml:space="preserve"> proofs, it was revealed that’s solving for height ($h$) was actually more difficult than solving for the minimum number of nodes under a specific height ($</w:t>
+      </w:r>
+      <w:proofErr w:type="spellStart"/>
+      <w:r>
+        <w:t>N_h</w:t>
+      </w:r>
+      <w:proofErr w:type="spellEnd"/>
+      <w:r>
+        <w:t>$). If we can show that $</w:t>
+      </w:r>
+      <w:proofErr w:type="spellStart"/>
+      <w:r>
+        <w:t>N_h</w:t>
+      </w:r>
+      <w:proofErr w:type="spellEnd"/>
+      <w:r>
+        <w:t xml:space="preserve">$ grows exponentially as the $h$ increases, we can reverse this </w:t>
       </w:r>
       <w:r>
         <w:t xml:space="preserve">relationship </w:t>
@@ -712,13 +947,21 @@
         <w:t>O(</w:t>
       </w:r>
       <w:r>
-        <w:t>\log(n)</w:t>
-      </w:r>
+        <w:t>\log(n</w:t>
+      </w:r>
+      <w:proofErr w:type="gramStart"/>
       <w:r>
         <w:t>)</w:t>
       </w:r>
       <w:r>
-        <w:t xml:space="preserve">$. </w:t>
+        <w:t>)</w:t>
+      </w:r>
+      <w:r>
+        <w:t>$</w:t>
+      </w:r>
+      <w:proofErr w:type="gramEnd"/>
+      <w:r>
+        <w:t xml:space="preserve">. </w:t>
       </w:r>
     </w:p>
     <w:p>
@@ -732,13 +975,29 @@
         <w:t>solving</w:t>
       </w:r>
       <w:r>
-        <w:t xml:space="preserve"> the lower bound $N_h$ is foundational to our proof. W</w:t>
+        <w:t xml:space="preserve"> the lower bound $</w:t>
+      </w:r>
+      <w:proofErr w:type="spellStart"/>
+      <w:r>
+        <w:t>N_h</w:t>
+      </w:r>
+      <w:proofErr w:type="spellEnd"/>
+      <w:r>
+        <w:t>$ is foundational to our proof. W</w:t>
       </w:r>
       <w:r>
         <w:t xml:space="preserve">e rely on </w:t>
       </w:r>
       <w:r>
-        <w:t xml:space="preserve">$N_h$ </w:t>
+        <w:t>$</w:t>
+      </w:r>
+      <w:proofErr w:type="spellStart"/>
+      <w:r>
+        <w:t>N_h</w:t>
+      </w:r>
+      <w:proofErr w:type="spellEnd"/>
+      <w:r>
+        <w:t xml:space="preserve">$ </w:t>
       </w:r>
       <w:r>
         <w:t xml:space="preserve">because this provides the </w:t>
@@ -756,7 +1015,15 @@
         <w:t>$h</w:t>
       </w:r>
       <w:r>
-        <w:t xml:space="preserve">$.  Meaning, if $N_h$ still grows exponentially then anything above this is still greater </w:t>
+        <w:t>$.  Meaning, if $</w:t>
+      </w:r>
+      <w:proofErr w:type="spellStart"/>
+      <w:r>
+        <w:t>N_h</w:t>
+      </w:r>
+      <w:proofErr w:type="spellEnd"/>
+      <w:r>
+        <w:t xml:space="preserve">$ still grows exponentially then anything above this is still greater </w:t>
       </w:r>
       <w:r>
         <w:t>than</w:t>
@@ -768,7 +1035,15 @@
         <w:t xml:space="preserve"> equal to exponential growth. </w:t>
       </w:r>
       <w:r>
-        <w:t xml:space="preserve">Given the relationship between the growth of $N_h$ and the growth of $h$, </w:t>
+        <w:t>Given the relationship between the growth of $</w:t>
+      </w:r>
+      <w:proofErr w:type="spellStart"/>
+      <w:r>
+        <w:t>N_h</w:t>
+      </w:r>
+      <w:proofErr w:type="spellEnd"/>
+      <w:r>
+        <w:t xml:space="preserve">$ and the growth of $h$, </w:t>
       </w:r>
       <w:r>
         <w:t>we were</w:t>
@@ -801,7 +1076,39 @@
     </w:p>
     <w:p>
       <w:r>
-        <w:t xml:space="preserve">  N_h = N_{h-1} + N_{h-2} + 1 \quad{+1 for the height of the root}</w:t>
+        <w:t xml:space="preserve">  </w:t>
+      </w:r>
+      <w:proofErr w:type="spellStart"/>
+      <w:r>
+        <w:t>N_h</w:t>
+      </w:r>
+      <w:proofErr w:type="spellEnd"/>
+      <w:r>
+        <w:t xml:space="preserve"> = </w:t>
+      </w:r>
+      <w:proofErr w:type="gramStart"/>
+      <w:r>
+        <w:t>N_{</w:t>
+      </w:r>
+      <w:proofErr w:type="gramEnd"/>
+      <w:r>
+        <w:t xml:space="preserve">h-1} + </w:t>
+      </w:r>
+      <w:proofErr w:type="gramStart"/>
+      <w:r>
+        <w:t>N_{</w:t>
+      </w:r>
+      <w:proofErr w:type="gramEnd"/>
+      <w:r>
+        <w:t>h-2} + 1 \</w:t>
+      </w:r>
+      <w:proofErr w:type="gramStart"/>
+      <w:r>
+        <w:t>quad{</w:t>
+      </w:r>
+      <w:proofErr w:type="gramEnd"/>
+      <w:r>
+        <w:t>+1 for the height of the root}</w:t>
       </w:r>
     </w:p>
     <w:p>
@@ -813,6 +1120,7 @@
       <w:r>
         <w:t xml:space="preserve">The above equation </w:t>
       </w:r>
+      <w:proofErr w:type="gramStart"/>
       <w:r>
         <w:t>d</w:t>
       </w:r>
@@ -820,7 +1128,16 @@
         <w:t xml:space="preserve">efines  </w:t>
       </w:r>
       <w:r>
-        <w:t>$N_h$</w:t>
+        <w:t>$</w:t>
+      </w:r>
+      <w:proofErr w:type="spellStart"/>
+      <w:proofErr w:type="gramEnd"/>
+      <w:r>
+        <w:t>N_h</w:t>
+      </w:r>
+      <w:proofErr w:type="spellEnd"/>
+      <w:r>
+        <w:t>$</w:t>
       </w:r>
       <w:r>
         <w:t xml:space="preserve"> recursively by showing that is that it is the composition of</w:t>
@@ -832,7 +1149,31 @@
         <w:t xml:space="preserve"> a connecting edge to those subtrees</w:t>
       </w:r>
       <w:r>
-        <w:t>. As previously discussed, an AVL tree’s height is bounded by the balancing factor which states that $|B_f| \le 1$. Given this constraint, the left and right tree of $N_h$ can most have a one level difference. This information allows us to define $N_h$ recursively.</w:t>
+        <w:t>. As previously discussed, an AVL tree’s height is bounded by the balancing factor which states that $|</w:t>
+      </w:r>
+      <w:proofErr w:type="spellStart"/>
+      <w:r>
+        <w:t>B_f</w:t>
+      </w:r>
+      <w:proofErr w:type="spellEnd"/>
+      <w:r>
+        <w:t>| \le 1$. Given this constraint, the left and right tree of $</w:t>
+      </w:r>
+      <w:proofErr w:type="spellStart"/>
+      <w:r>
+        <w:t>N_h</w:t>
+      </w:r>
+      <w:proofErr w:type="spellEnd"/>
+      <w:r>
+        <w:t>$ can most have a one level difference. This information allows us to define $</w:t>
+      </w:r>
+      <w:proofErr w:type="spellStart"/>
+      <w:r>
+        <w:t>N_h</w:t>
+      </w:r>
+      <w:proofErr w:type="spellEnd"/>
+      <w:r>
+        <w:t>$ recursively.</w:t>
       </w:r>
     </w:p>
     <w:p>
@@ -846,7 +1187,15 @@
         <w:t>Lower</w:t>
       </w:r>
       <w:r>
-        <w:t xml:space="preserve"> Bound of $N_h$</w:t>
+        <w:t xml:space="preserve"> Bound of $</w:t>
+      </w:r>
+      <w:proofErr w:type="spellStart"/>
+      <w:r>
+        <w:t>N_h</w:t>
+      </w:r>
+      <w:proofErr w:type="spellEnd"/>
+      <w:r>
+        <w:t>$</w:t>
       </w:r>
     </w:p>
     <w:p>
@@ -863,13 +1212,29 @@
         <w:t>s</w:t>
       </w:r>
       <w:r>
-        <w:t xml:space="preserve"> a direct proof via algebraic manipulation </w:t>
+        <w:t xml:space="preserve"> </w:t>
+      </w:r>
+      <w:proofErr w:type="gramStart"/>
+      <w:r>
+        <w:t>a direct</w:t>
+      </w:r>
+      <w:proofErr w:type="gramEnd"/>
+      <w:r>
+        <w:t xml:space="preserve"> proof via algebraic manipulation </w:t>
       </w:r>
       <w:r>
         <w:t>to</w:t>
       </w:r>
       <w:r>
-        <w:t xml:space="preserve"> show the lower bound of $N_h$</w:t>
+        <w:t xml:space="preserve"> show the lower bound of $</w:t>
+      </w:r>
+      <w:proofErr w:type="spellStart"/>
+      <w:r>
+        <w:t>N_h</w:t>
+      </w:r>
+      <w:proofErr w:type="spellEnd"/>
+      <w:r>
+        <w:t>$</w:t>
       </w:r>
       <w:r>
         <w:t xml:space="preserve"> (cite)</w:t>
@@ -893,34 +1258,113 @@
         <w:t xml:space="preserve"> In our proof, t</w:t>
       </w:r>
       <w:r>
-        <w:t>ake note that we are able to simplify $</w:t>
-      </w:r>
-      <w:r>
-        <w:t>N_k + N_{k-1} + 1</w:t>
+        <w:t xml:space="preserve">ake note that we </w:t>
+      </w:r>
+      <w:proofErr w:type="gramStart"/>
+      <w:r>
+        <w:t>are able to</w:t>
+      </w:r>
+      <w:proofErr w:type="gramEnd"/>
+      <w:r>
+        <w:t xml:space="preserve"> simplify $</w:t>
+      </w:r>
+      <w:proofErr w:type="spellStart"/>
+      <w:r>
+        <w:t>N_k</w:t>
+      </w:r>
+      <w:proofErr w:type="spellEnd"/>
+      <w:r>
+        <w:t xml:space="preserve"> + </w:t>
+      </w:r>
+      <w:proofErr w:type="gramStart"/>
+      <w:r>
+        <w:t>N_{</w:t>
+      </w:r>
+      <w:proofErr w:type="gramEnd"/>
+      <w:r>
+        <w:t>k-1} + 1</w:t>
       </w:r>
       <w:r>
         <w:t>$ to $</w:t>
       </w:r>
       <w:r>
-        <w:t xml:space="preserve"> 2N_{k-1}</w:t>
-      </w:r>
-      <w:r>
-        <w:t>$. We are able to do this because since $</w:t>
-      </w:r>
-      <w:r>
-        <w:t>N_k + N_{k-1} + 1</w:t>
+        <w:t xml:space="preserve"> 2</w:t>
+      </w:r>
+      <w:proofErr w:type="gramStart"/>
+      <w:r>
+        <w:t>N_{</w:t>
+      </w:r>
+      <w:proofErr w:type="gramEnd"/>
+      <w:r>
+        <w:t>k-</w:t>
+      </w:r>
+      <w:proofErr w:type="gramStart"/>
+      <w:r>
+        <w:t>1}</w:t>
+      </w:r>
+      <w:r>
+        <w:t>$</w:t>
+      </w:r>
+      <w:proofErr w:type="gramEnd"/>
+      <w:r>
+        <w:t xml:space="preserve">. We </w:t>
+      </w:r>
+      <w:proofErr w:type="gramStart"/>
+      <w:r>
+        <w:t>are able to</w:t>
+      </w:r>
+      <w:proofErr w:type="gramEnd"/>
+      <w:r>
+        <w:t xml:space="preserve"> do this because since $</w:t>
+      </w:r>
+      <w:proofErr w:type="spellStart"/>
+      <w:r>
+        <w:t>N_k</w:t>
+      </w:r>
+      <w:proofErr w:type="spellEnd"/>
+      <w:r>
+        <w:t xml:space="preserve"> + </w:t>
+      </w:r>
+      <w:proofErr w:type="gramStart"/>
+      <w:r>
+        <w:t>N_{</w:t>
+      </w:r>
+      <w:proofErr w:type="gramEnd"/>
+      <w:r>
+        <w:t>k-1} + 1</w:t>
       </w:r>
       <w:r>
         <w:t xml:space="preserve"> &gt; </w:t>
       </w:r>
       <w:r>
-        <w:t>2N_{k-1}</w:t>
+        <w:t>2</w:t>
+      </w:r>
+      <w:proofErr w:type="gramStart"/>
+      <w:r>
+        <w:t>N_{</w:t>
+      </w:r>
+      <w:proofErr w:type="gramEnd"/>
+      <w:r>
+        <w:t>k-</w:t>
+      </w:r>
+      <w:proofErr w:type="gramStart"/>
+      <w:r>
+        <w:t>1}</w:t>
       </w:r>
       <w:r>
         <w:t>$</w:t>
       </w:r>
-      <w:r>
-        <w:t>, and thus still allows us to solve looser lower bound of $N_h$</w:t>
+      <w:proofErr w:type="gramEnd"/>
+      <w:r>
+        <w:t>, and thus still allows us to solve looser lower bound of $</w:t>
+      </w:r>
+      <w:proofErr w:type="spellStart"/>
+      <w:r>
+        <w:t>N_h</w:t>
+      </w:r>
+      <w:proofErr w:type="spellEnd"/>
+      <w:r>
+        <w:t>$</w:t>
       </w:r>
       <w:r>
         <w:t>.</w:t>
@@ -929,13 +1373,29 @@
         <w:t xml:space="preserve"> </w:t>
       </w:r>
       <w:r>
-        <w:t xml:space="preserve">This step allowed us to simplify the process for solving for $N_h$, but it is worth mentioning that </w:t>
+        <w:t>This step allowed us to simplify the process for solving for $</w:t>
+      </w:r>
+      <w:proofErr w:type="spellStart"/>
+      <w:r>
+        <w:t>N_h</w:t>
+      </w:r>
+      <w:proofErr w:type="spellEnd"/>
+      <w:r>
+        <w:t xml:space="preserve">$, but it is worth mentioning that </w:t>
       </w:r>
       <w:r>
         <w:t xml:space="preserve">Mount </w:t>
       </w:r>
       <w:r>
-        <w:t xml:space="preserve">did not take this step, and was therefore able show a tighter bound via the golden ratio and the </w:t>
+        <w:t xml:space="preserve">did not take this </w:t>
+      </w:r>
+      <w:proofErr w:type="gramStart"/>
+      <w:r>
+        <w:t>step, and</w:t>
+      </w:r>
+      <w:proofErr w:type="gramEnd"/>
+      <w:r>
+        <w:t xml:space="preserve"> was therefore able show a tighter bound via the golden ratio and the </w:t>
       </w:r>
       <w:r>
         <w:t>Fibonacci</w:t>
@@ -974,16 +1434,40 @@
         <w:t xml:space="preserve"> in $</w:t>
       </w:r>
       <w:r>
-        <w:t>h &lt; 2\log_2(N_h)</w:t>
-      </w:r>
-      <w:r>
-        <w:t xml:space="preserve">$. Using </w:t>
+        <w:t>h &lt; 2\log_2(</w:t>
+      </w:r>
+      <w:proofErr w:type="spellStart"/>
+      <w:r>
+        <w:t>N_</w:t>
+      </w:r>
+      <w:proofErr w:type="gramStart"/>
+      <w:r>
+        <w:t>h</w:t>
+      </w:r>
+      <w:proofErr w:type="spellEnd"/>
+      <w:r>
+        <w:t>)</w:t>
+      </w:r>
+      <w:r>
+        <w:t>$</w:t>
+      </w:r>
+      <w:proofErr w:type="gramEnd"/>
+      <w:r>
+        <w:t xml:space="preserve">. Using </w:t>
       </w:r>
       <w:r>
         <w:t>asymptotic</w:t>
       </w:r>
       <w:r>
-        <w:t xml:space="preserve"> notation we were able to derive the following:</w:t>
+        <w:t xml:space="preserve"> </w:t>
+      </w:r>
+      <w:proofErr w:type="gramStart"/>
+      <w:r>
+        <w:t>notation</w:t>
+      </w:r>
+      <w:proofErr w:type="gramEnd"/>
+      <w:r>
+        <w:t xml:space="preserve"> we were able to derive the following:</w:t>
       </w:r>
     </w:p>
     <w:p>
@@ -997,7 +1481,23 @@
         <w:t xml:space="preserve">H \le </w:t>
       </w:r>
       <w:r>
-        <w:t>\mathcal{O}(\log n)</w:t>
+        <w:t>\</w:t>
+      </w:r>
+      <w:proofErr w:type="spellStart"/>
+      <w:r>
+        <w:t>mathcal</w:t>
+      </w:r>
+      <w:proofErr w:type="spellEnd"/>
+      <w:r>
+        <w:t>{O</w:t>
+      </w:r>
+      <w:proofErr w:type="gramStart"/>
+      <w:r>
+        <w:t>}(</w:t>
+      </w:r>
+      <w:proofErr w:type="gramEnd"/>
+      <w:r>
+        <w:t>\log n)</w:t>
       </w:r>
     </w:p>
     <w:p>
@@ -1092,8 +1592,13 @@
           </w:tcPr>
           <w:p>
             <w:r>
-              <w:t>$O(log(n))$</w:t>
+              <w:t>$O(log(n</w:t>
             </w:r>
+            <w:proofErr w:type="gramStart"/>
+            <w:r>
+              <w:t>))$</w:t>
+            </w:r>
+            <w:proofErr w:type="gramEnd"/>
           </w:p>
         </w:tc>
         <w:tc>
@@ -1102,8 +1607,13 @@
           </w:tcPr>
           <w:p>
             <w:r>
-              <w:t>$O(1)$</w:t>
+              <w:t>$</w:t>
             </w:r>
+            <w:proofErr w:type="gramStart"/>
+            <w:r>
+              <w:t>O(1)$</w:t>
+            </w:r>
+            <w:proofErr w:type="gramEnd"/>
           </w:p>
         </w:tc>
         <w:tc>
@@ -1112,8 +1622,13 @@
           </w:tcPr>
           <w:p>
             <w:r>
-              <w:t>$O(log(n))$</w:t>
+              <w:t>$O(log(n</w:t>
             </w:r>
+            <w:proofErr w:type="gramStart"/>
+            <w:r>
+              <w:t>))$</w:t>
+            </w:r>
+            <w:proofErr w:type="gramEnd"/>
           </w:p>
         </w:tc>
       </w:tr>
@@ -1137,8 +1652,13 @@
           </w:tcPr>
           <w:p>
             <w:r>
-              <w:t>$O(log(n))$</w:t>
+              <w:t>$O(log(n</w:t>
             </w:r>
+            <w:proofErr w:type="gramStart"/>
+            <w:r>
+              <w:t>))$</w:t>
+            </w:r>
+            <w:proofErr w:type="gramEnd"/>
           </w:p>
         </w:tc>
         <w:tc>
@@ -1147,8 +1667,13 @@
           </w:tcPr>
           <w:p>
             <w:r>
-              <w:t>$O(1)$</w:t>
+              <w:t>$</w:t>
             </w:r>
+            <w:proofErr w:type="gramStart"/>
+            <w:r>
+              <w:t>O(1)$</w:t>
+            </w:r>
+            <w:proofErr w:type="gramEnd"/>
           </w:p>
         </w:tc>
         <w:tc>
@@ -1157,8 +1682,13 @@
           </w:tcPr>
           <w:p>
             <w:r>
-              <w:t>$O(log(n))$</w:t>
+              <w:t>$O(log(n</w:t>
             </w:r>
+            <w:proofErr w:type="gramStart"/>
+            <w:r>
+              <w:t>))$</w:t>
+            </w:r>
+            <w:proofErr w:type="gramEnd"/>
           </w:p>
         </w:tc>
       </w:tr>
@@ -1182,8 +1712,13 @@
           </w:tcPr>
           <w:p>
             <w:r>
-              <w:t>$O(log(n))$</w:t>
+              <w:t>$O(log(n</w:t>
             </w:r>
+            <w:proofErr w:type="gramStart"/>
+            <w:r>
+              <w:t>))$</w:t>
+            </w:r>
+            <w:proofErr w:type="gramEnd"/>
           </w:p>
         </w:tc>
         <w:tc>
@@ -1192,8 +1727,13 @@
           </w:tcPr>
           <w:p>
             <w:r>
-              <w:t>$O(1)$</w:t>
+              <w:t>$</w:t>
             </w:r>
+            <w:proofErr w:type="gramStart"/>
+            <w:r>
+              <w:t>O(1)$</w:t>
+            </w:r>
+            <w:proofErr w:type="gramEnd"/>
           </w:p>
         </w:tc>
         <w:tc>
@@ -1202,8 +1742,13 @@
           </w:tcPr>
           <w:p>
             <w:r>
-              <w:t>$O(log(n))$</w:t>
+              <w:t>$O(log(n</w:t>
             </w:r>
+            <w:proofErr w:type="gramStart"/>
+            <w:r>
+              <w:t>))$</w:t>
+            </w:r>
+            <w:proofErr w:type="gramEnd"/>
           </w:p>
         </w:tc>
       </w:tr>
@@ -1219,7 +1764,15 @@
         <w:t>because</w:t>
       </w:r>
       <w:r>
-        <w:t xml:space="preserve"> an AVL tree’s is $O(log(n))$ which was shown in the proof section.</w:t>
+        <w:t xml:space="preserve"> an AVL tree’s is $O(log(n</w:t>
+      </w:r>
+      <w:proofErr w:type="gramStart"/>
+      <w:r>
+        <w:t>))$</w:t>
+      </w:r>
+      <w:proofErr w:type="gramEnd"/>
+      <w:r>
+        <w:t xml:space="preserve"> which was shown in the proof section.</w:t>
       </w:r>
       <w:r>
         <w:t xml:space="preserve"> </w:t>
@@ -1228,8 +1781,13 @@
         <w:t xml:space="preserve"> </w:t>
       </w:r>
       <w:r>
-        <w:t>This means the cost of traversing to a leaf node will also be $O(\log(n))$</w:t>
-      </w:r>
+        <w:t>This means the cost of traversing to a leaf node will also be $O(\log(n</w:t>
+      </w:r>
+      <w:proofErr w:type="gramStart"/>
+      <w:r>
+        <w:t>))$</w:t>
+      </w:r>
+      <w:proofErr w:type="gramEnd"/>
     </w:p>
     <w:p>
       <w:pPr>
@@ -1307,7 +1865,28 @@
     </w:p>
     <w:p>
       <w:r>
-        <w:t>T(n) = T_{Search}(\log(n)) + T_{RebalanceMetrics}}(\log(n)) = 2\cdot \log(n) = O(log(n))</w:t>
+        <w:t>T(n) = T_{Search}(\log(n)) + T_{</w:t>
+      </w:r>
+      <w:proofErr w:type="spellStart"/>
+      <w:r>
+        <w:t>RebalanceMetrics</w:t>
+      </w:r>
+      <w:proofErr w:type="spellEnd"/>
+      <w:proofErr w:type="gramStart"/>
+      <w:r>
+        <w:t>}}(</w:t>
+      </w:r>
+      <w:proofErr w:type="gramEnd"/>
+      <w:r>
+        <w:t>\log(n)) = 2\</w:t>
+      </w:r>
+      <w:proofErr w:type="spellStart"/>
+      <w:r>
+        <w:t>cdot</w:t>
+      </w:r>
+      <w:proofErr w:type="spellEnd"/>
+      <w:r>
+        <w:t xml:space="preserve"> \log(n) = O(log(n))</w:t>
       </w:r>
     </w:p>
     <w:p>
@@ -1323,8 +1902,13 @@
         <w:t>s</w:t>
       </w:r>
       <w:r>
-        <w:t xml:space="preserve"> only once we hit a leaf node, and we know this traversal will have $O(\log(n))$</w:t>
-      </w:r>
+        <w:t xml:space="preserve"> only once we hit a leaf node, and we know this traversal will have $O(\log(n</w:t>
+      </w:r>
+      <w:proofErr w:type="gramStart"/>
+      <w:r>
+        <w:t>))$</w:t>
+      </w:r>
+      <w:proofErr w:type="gramEnd"/>
       <w:r>
         <w:t xml:space="preserve"> </w:t>
       </w:r>
@@ -1341,11 +1925,27 @@
         <w:t>node,</w:t>
       </w:r>
       <w:r>
-        <w:t xml:space="preserve"> we will enter </w:t>
+        <w:t xml:space="preserve"> we will </w:t>
+      </w:r>
+      <w:proofErr w:type="gramStart"/>
+      <w:r>
+        <w:t xml:space="preserve">enter </w:t>
       </w:r>
       <w:r>
         <w:lastRenderedPageBreak/>
-        <w:t xml:space="preserve">into phase two: `RebalanceMetrics`. In </w:t>
+        <w:t>into</w:t>
+      </w:r>
+      <w:proofErr w:type="gramEnd"/>
+      <w:r>
+        <w:t xml:space="preserve"> phase two: `</w:t>
+      </w:r>
+      <w:proofErr w:type="spellStart"/>
+      <w:r>
+        <w:t>RebalanceMetrics</w:t>
+      </w:r>
+      <w:proofErr w:type="spellEnd"/>
+      <w:r>
+        <w:t xml:space="preserve">`. In </w:t>
       </w:r>
       <w:r>
         <w:t xml:space="preserve">this </w:t>
@@ -1372,13 +1972,26 @@
         <w:t>$</w:t>
       </w:r>
       <w:r>
-        <w:t>O(log(n))</w:t>
+        <w:t>O(log(n</w:t>
+      </w:r>
+      <w:proofErr w:type="gramStart"/>
+      <w:r>
+        <w:t>))</w:t>
       </w:r>
       <w:r>
         <w:t>$</w:t>
       </w:r>
-      <w:r>
-        <w:t xml:space="preserve"> since we must  traverse to the leaf node and back up again.</w:t>
+      <w:proofErr w:type="gramEnd"/>
+      <w:r>
+        <w:t xml:space="preserve"> since we </w:t>
+      </w:r>
+      <w:proofErr w:type="gramStart"/>
+      <w:r>
+        <w:t>must  traverse</w:t>
+      </w:r>
+      <w:proofErr w:type="gramEnd"/>
+      <w:r>
+        <w:t xml:space="preserve"> to the leaf node and back up again.</w:t>
       </w:r>
     </w:p>
     <w:p>
@@ -1386,11 +1999,40 @@
         <w:ind w:firstLine="720"/>
       </w:pPr>
       <w:r>
-        <w:t>In our code base we used a recursive definition of an AVL insert which means each stack call contributes to our memory for a total of $O(log(n))$. During each stack call,</w:t>
-      </w:r>
-      <w:r>
-        <w:t xml:space="preserve"> all space operation are $O(1)$ which means our definition of insert is $S(n) = O(log(n))$</w:t>
-      </w:r>
+        <w:t>In our code base we used a recursive definition of an AVL insert which means each stack call contributes to our memory for a total of $O(log(n</w:t>
+      </w:r>
+      <w:proofErr w:type="gramStart"/>
+      <w:r>
+        <w:t>))$</w:t>
+      </w:r>
+      <w:proofErr w:type="gramEnd"/>
+      <w:r>
+        <w:t>. During each stack call,</w:t>
+      </w:r>
+      <w:r>
+        <w:t xml:space="preserve"> all space operation </w:t>
+      </w:r>
+      <w:proofErr w:type="gramStart"/>
+      <w:r>
+        <w:t>are</w:t>
+      </w:r>
+      <w:proofErr w:type="gramEnd"/>
+      <w:r>
+        <w:t xml:space="preserve"> $</w:t>
+      </w:r>
+      <w:proofErr w:type="gramStart"/>
+      <w:r>
+        <w:t>O(1)$</w:t>
+      </w:r>
+      <w:proofErr w:type="gramEnd"/>
+      <w:r>
+        <w:t xml:space="preserve"> which means our definition of insert is $S(n) = O(log(n</w:t>
+      </w:r>
+      <w:proofErr w:type="gramStart"/>
+      <w:r>
+        <w:t>))$</w:t>
+      </w:r>
+      <w:proofErr w:type="gramEnd"/>
       <w:r>
         <w:t>.</w:t>
       </w:r>
@@ -1404,8 +2046,13 @@
         <w:t>function</w:t>
       </w:r>
       <w:r>
-        <w:t xml:space="preserve"> iteratively which would have $S(n) = O(1)$</w:t>
-      </w:r>
+        <w:t xml:space="preserve"> iteratively which would have $S(n) = </w:t>
+      </w:r>
+      <w:proofErr w:type="gramStart"/>
+      <w:r>
+        <w:t>O(1)$</w:t>
+      </w:r>
+      <w:proofErr w:type="gramEnd"/>
       <w:r>
         <w:t xml:space="preserve"> </w:t>
       </w:r>
@@ -1470,7 +2117,15 @@
     </w:p>
     <w:p>
       <w:r>
-        <w:t>T(n) = T_{search}(\log(n))</w:t>
+        <w:t xml:space="preserve">T(n) = </w:t>
+      </w:r>
+      <w:proofErr w:type="gramStart"/>
+      <w:r>
+        <w:t>T_{search}(</w:t>
+      </w:r>
+      <w:proofErr w:type="gramEnd"/>
+      <w:r>
+        <w:t>\log(n))</w:t>
       </w:r>
     </w:p>
     <w:p>
@@ -1507,8 +2162,29 @@
         <w:t xml:space="preserve">until we find </w:t>
       </w:r>
       <w:r>
-        <w:t>our search value. Under the assumption of the worst case, we can assume that we must traverse to the leaf node which would be $O(\log(n))$. Looking beyond a worst-case scenario, our best-case would be $O(1)$ which would assume we find our value in the root node. Our average case would traverse half down half the height of our tree which would still be $log(n)$ .</w:t>
-      </w:r>
+        <w:t>our search value. Under the assumption of the worst case, we can assume that we must traverse to the leaf node which would be $O(\log(n</w:t>
+      </w:r>
+      <w:proofErr w:type="gramStart"/>
+      <w:r>
+        <w:t>))$</w:t>
+      </w:r>
+      <w:proofErr w:type="gramEnd"/>
+      <w:r>
+        <w:t>. Looking beyond a worst-case scenario, our best-case would be $</w:t>
+      </w:r>
+      <w:proofErr w:type="gramStart"/>
+      <w:r>
+        <w:t>O(1)$</w:t>
+      </w:r>
+      <w:proofErr w:type="gramEnd"/>
+      <w:r>
+        <w:t xml:space="preserve"> which would assume we find our value in the root node. Our average case would traverse half down half the height of our tree which would still be $log(n)</w:t>
+      </w:r>
+      <w:proofErr w:type="gramStart"/>
+      <w:r>
+        <w:t>$ .</w:t>
+      </w:r>
+      <w:proofErr w:type="gramEnd"/>
     </w:p>
     <w:p>
       <w:r>
@@ -1528,8 +2204,13 @@
         <w:t xml:space="preserve">This iterative solutions space complexity remains constant through each loop and thus </w:t>
       </w:r>
       <w:r>
-        <w:t>$S(n) = O(1)$</w:t>
-      </w:r>
+        <w:t xml:space="preserve">$S(n) = </w:t>
+      </w:r>
+      <w:proofErr w:type="gramStart"/>
+      <w:r>
+        <w:t>O(1)$</w:t>
+      </w:r>
+      <w:proofErr w:type="gramEnd"/>
       <w:r>
         <w:t xml:space="preserve">. </w:t>
       </w:r>
@@ -1550,7 +2231,15 @@
         <w:t>recursively</w:t>
       </w:r>
       <w:r>
-        <w:t xml:space="preserve"> which would results in a space complexity of $S(n) = log(n)$.</w:t>
+        <w:t xml:space="preserve"> which would </w:t>
+      </w:r>
+      <w:proofErr w:type="gramStart"/>
+      <w:r>
+        <w:t>results</w:t>
+      </w:r>
+      <w:proofErr w:type="gramEnd"/>
+      <w:r>
+        <w:t xml:space="preserve"> in a space complexity of $S(n) = log(n)$.</w:t>
       </w:r>
     </w:p>
     <w:p>
@@ -1610,19 +2299,55 @@
     </w:p>
     <w:p>
       <w:r>
-        <w:t xml:space="preserve">T(n) = T_{Search}(\log(n)) + </w:t>
-      </w:r>
-      <w:r>
-        <w:t xml:space="preserve">T_{FindReplacement}(\log(n)) + T_{MetricsRotations}(\log(n)) </w:t>
-      </w:r>
-      <w:r>
-        <w:t xml:space="preserve">= </w:t>
-      </w:r>
-      <w:r>
-        <w:t>3</w:t>
-      </w:r>
-      <w:r>
-        <w:t>\cdot \log(n) = O(log(n))</w:t>
+        <w:t xml:space="preserve">T(n) = </w:t>
+      </w:r>
+      <w:proofErr w:type="gramStart"/>
+      <w:r>
+        <w:t>T_{Search}(</w:t>
+      </w:r>
+      <w:proofErr w:type="gramEnd"/>
+      <w:r>
+        <w:t xml:space="preserve">\log(n)) + </w:t>
+      </w:r>
+      <w:proofErr w:type="gramStart"/>
+      <w:r>
+        <w:t>T_{</w:t>
+      </w:r>
+      <w:proofErr w:type="spellStart"/>
+      <w:r>
+        <w:t>FindReplacement</w:t>
+      </w:r>
+      <w:proofErr w:type="spellEnd"/>
+      <w:r>
+        <w:t>}(</w:t>
+      </w:r>
+      <w:proofErr w:type="gramEnd"/>
+      <w:r>
+        <w:t xml:space="preserve">\log(n)) + </w:t>
+      </w:r>
+      <w:proofErr w:type="gramStart"/>
+      <w:r>
+        <w:t>T_{</w:t>
+      </w:r>
+      <w:proofErr w:type="spellStart"/>
+      <w:r>
+        <w:t>MetricsRotations</w:t>
+      </w:r>
+      <w:proofErr w:type="spellEnd"/>
+      <w:r>
+        <w:t>}(</w:t>
+      </w:r>
+      <w:proofErr w:type="gramEnd"/>
+      <w:r>
+        <w:t>\log(n)) = 3\</w:t>
+      </w:r>
+      <w:proofErr w:type="spellStart"/>
+      <w:r>
+        <w:t>cdot</w:t>
+      </w:r>
+      <w:proofErr w:type="spellEnd"/>
+      <w:r>
+        <w:t xml:space="preserve"> \log(n) = O(log(n))</w:t>
       </w:r>
     </w:p>
     <w:p>
@@ -1631,112 +2356,100 @@
       </w:r>
     </w:p>
     <w:p>
+      <w:r>
+        <w:t xml:space="preserve">The above code outlines our process for deleting a value from an AVL tree. To accomplish this goal, our code iterates through three distinct phases. In the first phase, we move down to the node we want to delete, which under the worst-case, would be $O(log(n)) = O(h)$. Once we find the value to delete, we move into phase two. The goal of phase two is to find a replacement value for our deleted node. To find a replacement value, we will find the minimum value in the deleted node's right subtree. After finding this node, we move it to the deleted node’s location. This operation, under a worst-case scenario, contributes $O \log(n)$ to our runtime. In our third and final phase, we move back up our tree, while recalculating height and performing any necessary rotations. Unlike insertion, which at most can cause two rotations, deleting can have a cascading effect, which will cause $log(n)$ rotations. Taken together, we arrive at a worst-case scenario </w:t>
+      </w:r>
+      <w:proofErr w:type="gramStart"/>
+      <w:r>
+        <w:t>of  $</w:t>
+      </w:r>
+      <w:proofErr w:type="gramEnd"/>
+      <w:r>
+        <w:t>O(log(n</w:t>
+      </w:r>
+      <w:proofErr w:type="gramStart"/>
+      <w:r>
+        <w:t>))$</w:t>
+      </w:r>
+      <w:proofErr w:type="gramEnd"/>
+      <w:r>
+        <w:t xml:space="preserve">, which </w:t>
+      </w:r>
+      <w:r>
+        <w:lastRenderedPageBreak/>
+        <w:t>is outlined in the equation above. Since we must always find a replacement node in this process, which is $O(log(n</w:t>
+      </w:r>
+      <w:proofErr w:type="gramStart"/>
+      <w:r>
+        <w:t>))$</w:t>
+      </w:r>
+      <w:proofErr w:type="gramEnd"/>
+      <w:r>
+        <w:t xml:space="preserve"> deep, our best and average case will also be $\log(n)$.</w:t>
+      </w:r>
+    </w:p>
+    <w:p>
+      <w:r>
+        <w:t>               Our definition of deletion uses recursion, which means each recursive call contributes to our overall memory footprint. Each individual recursive call uses $</w:t>
+      </w:r>
+      <w:proofErr w:type="gramStart"/>
+      <w:r>
+        <w:t>O(1)$</w:t>
+      </w:r>
+      <w:proofErr w:type="gramEnd"/>
+      <w:r>
+        <w:t xml:space="preserve"> space, and thus we need only to account for the total stack depth, which is:</w:t>
+      </w:r>
+    </w:p>
+    <w:p>
+      <w:r>
+        <w:t>\[</w:t>
+      </w:r>
+    </w:p>
+    <w:p>
+      <w:r>
+        <w:t xml:space="preserve">S(n) = </w:t>
+      </w:r>
+      <w:proofErr w:type="spellStart"/>
+      <w:r>
+        <w:t>StackDepth</w:t>
+      </w:r>
+      <w:proofErr w:type="spellEnd"/>
+      <w:r>
+        <w:t xml:space="preserve"> = O(log(n))</w:t>
+      </w:r>
+    </w:p>
+    <w:p>
+      <w:r>
+        <w:t>\]</w:t>
+      </w:r>
+    </w:p>
+    <w:p>
+      <w:r>
+        <w:t xml:space="preserve">It should be noted that this is a recursive definition for deletion, but there are iterative solutions. If we were to use an iterative solution, we would have $S(n) = </w:t>
+      </w:r>
+      <w:proofErr w:type="gramStart"/>
+      <w:r>
+        <w:t>O(1)$</w:t>
+      </w:r>
+      <w:proofErr w:type="gramEnd"/>
+      <w:r>
+        <w:t>. To achieve this space complexity, we would need to implement parent pointers for each node, so that we could traverse backwards [6].</w:t>
+      </w:r>
+    </w:p>
+    <w:p>
+      <w:pPr>
+        <w:pStyle w:val="Heading2"/>
+      </w:pPr>
+      <w:r>
+        <w:t>Implementation/Experimental Design</w:t>
+      </w:r>
+    </w:p>
+    <w:p>
       <w:pPr>
         <w:ind w:firstLine="720"/>
       </w:pPr>
       <w:r>
-        <w:t xml:space="preserve">The above code </w:t>
-      </w:r>
-      <w:r>
-        <w:t>outlines</w:t>
-      </w:r>
-      <w:r>
-        <w:t xml:space="preserve"> our process for </w:t>
-      </w:r>
-      <w:r>
-        <w:t>deleting</w:t>
-      </w:r>
-      <w:r>
-        <w:t xml:space="preserve"> a value from our AVL tree. In the pseudo code we have </w:t>
-      </w:r>
-      <w:r>
-        <w:t>outlined</w:t>
-      </w:r>
-      <w:r>
-        <w:t xml:space="preserve"> this process into </w:t>
-      </w:r>
-      <w:r>
-        <w:t>four</w:t>
-      </w:r>
-      <w:r>
-        <w:t xml:space="preserve"> phases. In the first phase, we move down the down to the node we </w:t>
-      </w:r>
-      <w:r>
-        <w:t xml:space="preserve">want to delete which undert the worst case is $O(log(n))$. Once we find our value to delete we move onto phase two which finds a replacement value for it. To find a replacement value for our node, we will find the minimum value in the our right-subtree, and move it to our deleted node’s location. This operation under a worst case contributes $O \log(n)$ to our runtime, and needed </w:t>
-      </w:r>
-      <w:r>
-        <w:t>in order</w:t>
-      </w:r>
-      <w:r>
-        <w:t xml:space="preserve"> to keep our BST structure. In our final phase we move back up our tree and recalculate height and perform any necessary rotations. Unlike insertion, which at most can cause two rotations, deleting can have a cascading effect which will cause $log(n)$ rotations</w:t>
-      </w:r>
-      <w:r>
-        <w:t xml:space="preserve">. Taken together we arrive with a worst case of log(n) which is outlines in the above equation. Unfortunately, since we have </w:t>
-      </w:r>
-      <w:r>
-        <w:lastRenderedPageBreak/>
-        <w:t>to always find a replacement node for our deletions, our best and average case will be also be $Log(n)$</w:t>
-      </w:r>
-    </w:p>
-    <w:p>
-      <w:r>
-        <w:tab/>
-        <w:t xml:space="preserve">Our definition of deletion uses recursion which means each </w:t>
-      </w:r>
-      <w:r>
-        <w:t xml:space="preserve">recursive </w:t>
-      </w:r>
-      <w:r>
-        <w:t>call</w:t>
-      </w:r>
-      <w:r>
-        <w:t>s</w:t>
-      </w:r>
-      <w:r>
-        <w:t xml:space="preserve"> will contribute to our overall memory footprint. </w:t>
-      </w:r>
-      <w:r>
-        <w:t xml:space="preserve">In our first phase, search, we at most make $O(log(n))$ and each variable in that recursive call are constant. Our next phase we find a replace and delete the node. This phase happens once and finding a replacements can take $O(log(n))$ since we must find a leaf. Finally, in our last phase we move back up the tree and adjust height and make any necessary rotations. This final phase can take up to $O(log(n))$. </w:t>
-      </w:r>
-      <w:r>
-        <w:t>Combining this information we arrive at the following</w:t>
-      </w:r>
-    </w:p>
-    <w:p>
-      <w:r>
-        <w:t xml:space="preserve"> $S(n) = T{search}(\log(n))+  T{search}(\log(n))</w:t>
-      </w:r>
-      <w:r>
-        <w:t xml:space="preserve"> ))+  T{RebalanceHeight }(\log(n)) </w:t>
-      </w:r>
-      <w:r>
-        <w:t>$</w:t>
-      </w:r>
-      <w:r>
-        <w:t xml:space="preserve"> = 3 \cdot log(n) = O(log(n))</w:t>
-      </w:r>
-    </w:p>
-    <w:p>
-      <w:r>
-        <w:t>It should be noted that this is a recursive definition of deletion</w:t>
-      </w:r>
-      <w:r>
-        <w:t>, but there are iterative solution. If we were to use an iterative solution we would have $S(n) = O(1)$. To achieve this space complexity, we would need to implement parent pointers for each node, so that we could traverse backwards [6].</w:t>
-      </w:r>
-    </w:p>
-    <w:p>
-      <w:pPr>
-        <w:pStyle w:val="Heading2"/>
-      </w:pPr>
-      <w:r>
-        <w:t>Implementation/Experimental Design</w:t>
-      </w:r>
-    </w:p>
-    <w:p>
-      <w:pPr>
-        <w:ind w:firstLine="720"/>
-      </w:pPr>
-      <w:r>
         <w:t>This section</w:t>
       </w:r>
       <w:r>
@@ -1757,8 +2470,13 @@
       <w:r>
         <w:t xml:space="preserve"> that our initial plan might have been overzealous and thus we scaled back to AVL and traditional BSTs. </w:t>
       </w:r>
-      <w:r>
-        <w:t xml:space="preserve">With this in mind, you will notice that our code follows a reusable template that can be adapted for future projects and experiments. </w:t>
+      <w:proofErr w:type="gramStart"/>
+      <w:r>
+        <w:t>With this in mind, you</w:t>
+      </w:r>
+      <w:proofErr w:type="gramEnd"/>
+      <w:r>
+        <w:t xml:space="preserve"> will notice that our code follows a reusable template that can be adapted for future projects and experiments. </w:t>
       </w:r>
     </w:p>
     <w:p>
@@ -1816,17 +2534,26 @@
     </w:p>
     <w:p>
       <w:r>
+        <w:t xml:space="preserve">The figure above shows our entire experimental design for this report. As you can see, we were able to perform a significant number of trials across </w:t>
+      </w:r>
+      <w:r>
+        <w:t>various</w:t>
+      </w:r>
+      <w:r>
+        <w:t xml:space="preserve"> blocking criteria. This </w:t>
+      </w:r>
+      <w:r>
         <w:lastRenderedPageBreak/>
-        <w:t xml:space="preserve">The figure above shows our entire experimental design for this report. As you can see, we were able to perform a significant number of trials across </w:t>
-      </w:r>
-      <w:r>
-        <w:t>various</w:t>
-      </w:r>
-      <w:r>
-        <w:t xml:space="preserve"> blocking criteria. This design allowed us to have an expansive empirical analysis, and furthermore, gave us room to expand our analysis in the future. Below we will discuss each</w:t>
-      </w:r>
-      <w:r>
-        <w:t xml:space="preserve"> block criteria and why we made these decisions.</w:t>
+        <w:t>design allowed us to have an expansive empirical analysis, and furthermore, gave us room to expand our analysis in the future. Below we will discuss each</w:t>
+      </w:r>
+      <w:r>
+        <w:t xml:space="preserve"> block</w:t>
+      </w:r>
+      <w:r>
+        <w:t>ing</w:t>
+      </w:r>
+      <w:r>
+        <w:t>.</w:t>
       </w:r>
     </w:p>
     <w:p>
@@ -1842,7 +2569,28 @@
         <w:ind w:left="720"/>
       </w:pPr>
       <w:r>
-        <w:t>Originally for this project, our plan was to compare several different types of BSTs, but a week into the project we quickly realized that it was a little overzealous. Instead of comparing several different BSTs we ended up comparing an AVL to a traditional binary search tree. We decided to include a traditional BST because it would complement and highlight the benefits of an AVL tree.</w:t>
+        <w:t>Originally for this project, our plan was to compare several different types of BSTs,</w:t>
+      </w:r>
+      <w:r>
+        <w:t xml:space="preserve"> but as mentioned this was ambitious</w:t>
+      </w:r>
+      <w:r>
+        <w:t>. Instead of comparing several different BSTs we ended up comparing an AVL to a traditional binary search tree. We decided to include a traditional BST</w:t>
+      </w:r>
+      <w:r>
+        <w:t xml:space="preserve"> since </w:t>
+      </w:r>
+      <w:r>
+        <w:t>it would complement and highlight the benefits of an AVL tree.</w:t>
+      </w:r>
+      <w:r>
+        <w:t xml:space="preserve"> The BST tree</w:t>
+      </w:r>
+      <w:r>
+        <w:t>’s</w:t>
+      </w:r>
+      <w:r>
+        <w:t xml:space="preserve"> results can be found in the appendix. </w:t>
       </w:r>
     </w:p>
     <w:p>
@@ -1858,10 +2606,39 @@
         <w:ind w:left="720"/>
       </w:pPr>
       <w:r>
-        <w:t xml:space="preserve">For this project we ran each tree across two datasets. One dataset was completely randomized with numbers between 0 to 100 million. The other dataset </w:t>
-      </w:r>
-      <w:r>
-        <w:t xml:space="preserve">contained the same datapoints as our randomized dataset but it was in sorted </w:t>
+        <w:t>For this project</w:t>
+      </w:r>
+      <w:r>
+        <w:t>,</w:t>
+      </w:r>
+      <w:r>
+        <w:t xml:space="preserve"> we ran each tree across two datasets. One dataset was completely randomized with numbers between 0 to 100 million. </w:t>
+      </w:r>
+      <w:proofErr w:type="gramStart"/>
+      <w:r>
+        <w:t>The other dataset</w:t>
+      </w:r>
+      <w:r>
+        <w:t>,</w:t>
+      </w:r>
+      <w:proofErr w:type="gramEnd"/>
+      <w:r>
+        <w:t xml:space="preserve"> </w:t>
+      </w:r>
+      <w:r>
+        <w:t>contained the same datapoints as our randomized dataset</w:t>
+      </w:r>
+      <w:r>
+        <w:t>,</w:t>
+      </w:r>
+      <w:r>
+        <w:t xml:space="preserve"> but </w:t>
+      </w:r>
+      <w:r>
+        <w:t xml:space="preserve">in </w:t>
+      </w:r>
+      <w:r>
+        <w:t xml:space="preserve">sorted </w:t>
       </w:r>
       <w:r>
         <w:t>order</w:t>
@@ -1875,7 +2652,24 @@
         <w:pStyle w:val="Heading4"/>
       </w:pPr>
       <w:r>
-        <w:t>Operations:</w:t>
+        <w:t>Function</w:t>
+      </w:r>
+      <w:r>
+        <w:t>:</w:t>
+      </w:r>
+    </w:p>
+    <w:p>
+      <w:pPr>
+        <w:ind w:left="360"/>
+      </w:pPr>
+      <w:r>
+        <w:t xml:space="preserve">We covered three foundational </w:t>
+      </w:r>
+      <w:r>
+        <w:t>functions</w:t>
+      </w:r>
+      <w:r>
+        <w:t xml:space="preserve"> for a BST: </w:t>
       </w:r>
     </w:p>
     <w:p>
@@ -1887,7 +2681,15 @@
         </w:numPr>
       </w:pPr>
       <w:r>
-        <w:t xml:space="preserve">Insert: this operation add to the BST. </w:t>
+        <w:t xml:space="preserve">Insert: this operation </w:t>
+      </w:r>
+      <w:proofErr w:type="gramStart"/>
+      <w:r>
+        <w:t>add</w:t>
+      </w:r>
+      <w:proofErr w:type="gramEnd"/>
+      <w:r>
+        <w:t xml:space="preserve"> to the BST. </w:t>
       </w:r>
     </w:p>
     <w:p>
@@ -1911,7 +2713,26 @@
         </w:numPr>
       </w:pPr>
       <w:r>
-        <w:t>Delete: This operation deletes a value from out BST. It should be noted that we add our value back in after deletion inorder to preserve our values of $n$.</w:t>
+        <w:t xml:space="preserve">Delete: This operation deletes a value from </w:t>
+      </w:r>
+      <w:proofErr w:type="gramStart"/>
+      <w:r>
+        <w:t>out</w:t>
+      </w:r>
+      <w:proofErr w:type="gramEnd"/>
+      <w:r>
+        <w:t xml:space="preserve"> BST. It should be noted that we add our value back in after deletion </w:t>
+      </w:r>
+      <w:proofErr w:type="gramStart"/>
+      <w:r>
+        <w:t>in order</w:t>
+      </w:r>
+      <w:r>
+        <w:t xml:space="preserve"> to</w:t>
+      </w:r>
+      <w:proofErr w:type="gramEnd"/>
+      <w:r>
+        <w:t xml:space="preserve"> preserve our values of $n$.</w:t>
       </w:r>
     </w:p>
     <w:p>
@@ -1920,6 +2741,11 @@
       </w:pPr>
       <w:r>
         <w:t>Metrics:</w:t>
+      </w:r>
+    </w:p>
+    <w:p>
+      <w:r>
+        <w:t>We tracked three types of metrics for our experiment</w:t>
       </w:r>
     </w:p>
     <w:p>
@@ -1931,7 +2757,119 @@
         </w:numPr>
       </w:pPr>
       <w:r>
-        <w:t xml:space="preserve">Time: our time variable end up being our most tricky variable to measure. We noticed during our initial experimentation that random noise ended up being the dominating factor for our time variable. To diminish the effect of random noise, we ran each experiment in a batch of 1,000 and then took the average result. Given that each run was independent and our residuals were randomly distributed this diminished the effects of noise. We did  not take the average result for our insertion operation. Insertion, by it varied nature, is not independent meaning that $n$ is dependent on $n-1}$. We therefore took the sum of inserting a 1,000 data points at a time, which admittedly is not perfect solution. </w:t>
+        <w:t xml:space="preserve">Time: our time variable end up being our most tricky variable to measure. We noticed during our initial experimentation that random noise ended up being the dominating factor for our time variable. To diminish the effect of random noise, we ran each experiment in a </w:t>
+      </w:r>
+      <w:r>
+        <w:t>batch</w:t>
+      </w:r>
+      <w:r>
+        <w:t xml:space="preserve"> of </w:t>
+      </w:r>
+      <w:proofErr w:type="gramStart"/>
+      <w:r>
+        <w:t>1,000</w:t>
+      </w:r>
+      <w:r>
+        <w:t>,</w:t>
+      </w:r>
+      <w:r>
+        <w:t xml:space="preserve"> and</w:t>
+      </w:r>
+      <w:proofErr w:type="gramEnd"/>
+      <w:r>
+        <w:t xml:space="preserve"> then took the average result. Given that each run was independent and our residuals were randomly distributed this </w:t>
+      </w:r>
+      <w:r>
+        <w:t xml:space="preserve">should </w:t>
+      </w:r>
+      <w:r>
+        <w:t xml:space="preserve">diminish the effects of noise. We </w:t>
+      </w:r>
+      <w:r>
+        <w:t>did not</w:t>
+      </w:r>
+      <w:r>
+        <w:t xml:space="preserve"> take the average result for insertion </w:t>
+      </w:r>
+      <w:r>
+        <w:t xml:space="preserve">since </w:t>
+      </w:r>
+      <w:r>
+        <w:t xml:space="preserve">there will be autocorrelation between every </w:t>
+      </w:r>
+      <w:r>
+        <w:t>$</w:t>
+      </w:r>
+      <w:proofErr w:type="spellStart"/>
+      <w:r>
+        <w:t>n$</w:t>
+      </w:r>
+      <w:r>
+        <w:t>th</w:t>
+      </w:r>
+      <w:proofErr w:type="spellEnd"/>
+      <w:r>
+        <w:t xml:space="preserve"> value inserted</w:t>
+      </w:r>
+      <w:r>
+        <w:t>;</w:t>
+      </w:r>
+      <w:r>
+        <w:t xml:space="preserve"> meaning</w:t>
+      </w:r>
+      <w:r>
+        <w:t>,</w:t>
+      </w:r>
+      <w:r>
+        <w:t xml:space="preserve"> </w:t>
+      </w:r>
+      <w:proofErr w:type="gramStart"/>
+      <w:r>
+        <w:t xml:space="preserve">that </w:t>
+      </w:r>
+      <w:r>
+        <w:t xml:space="preserve"> </w:t>
+      </w:r>
+      <w:r>
+        <w:t>$</w:t>
+      </w:r>
+      <w:proofErr w:type="spellStart"/>
+      <w:proofErr w:type="gramEnd"/>
+      <w:r>
+        <w:t>n$</w:t>
+      </w:r>
+      <w:r>
+        <w:t>th</w:t>
+      </w:r>
+      <w:proofErr w:type="spellEnd"/>
+      <w:r>
+        <w:t xml:space="preserve"> value inserted</w:t>
+      </w:r>
+      <w:r>
+        <w:t xml:space="preserve"> into </w:t>
+      </w:r>
+      <w:r>
+        <w:t>our</w:t>
+      </w:r>
+      <w:r>
+        <w:t xml:space="preserve"> tree will be dependent</w:t>
+      </w:r>
+      <w:r>
+        <w:t xml:space="preserve"> on $n-1$</w:t>
+      </w:r>
+      <w:r>
+        <w:t>, $n-2$ and so on</w:t>
+      </w:r>
+      <w:r>
+        <w:t xml:space="preserve">. We therefore took the sum of inserting </w:t>
+      </w:r>
+      <w:proofErr w:type="gramStart"/>
+      <w:r>
+        <w:t>a 1,000</w:t>
+      </w:r>
+      <w:proofErr w:type="gramEnd"/>
+      <w:r>
+        <w:t xml:space="preserve"> data points at a time. </w:t>
       </w:r>
     </w:p>
     <w:p>
@@ -1943,17 +2881,59 @@
         </w:numPr>
       </w:pPr>
       <w:r>
-        <w:t xml:space="preserve">Operation Count: for each tree we tracked the total number of operation performed during each operation. To count operations is tricky and can be considered </w:t>
+        <w:t xml:space="preserve">Operation Count: for each tree we tracked the total number of </w:t>
+      </w:r>
+      <w:r>
+        <w:t>operations</w:t>
+      </w:r>
+      <w:r>
+        <w:t xml:space="preserve"> performed during each </w:t>
+      </w:r>
+      <w:r>
+        <w:t>function call</w:t>
+      </w:r>
+      <w:r>
+        <w:t xml:space="preserve">. </w:t>
+      </w:r>
+      <w:r>
+        <w:t>C</w:t>
+      </w:r>
+      <w:r>
+        <w:t>ount</w:t>
+      </w:r>
+      <w:r>
+        <w:t>ing</w:t>
+      </w:r>
+      <w:r>
+        <w:t xml:space="preserve"> operations is tricky and can be </w:t>
       </w:r>
       <w:r>
         <w:lastRenderedPageBreak/>
-        <w:t xml:space="preserve">subjective. Therefor this metric is great for comparing varying </w:t>
+        <w:t xml:space="preserve">considered subjective. Therefor this metric is great for comparing varying </w:t>
       </w:r>
       <w:r>
         <w:t>levels</w:t>
       </w:r>
       <w:r>
-        <w:t xml:space="preserve"> on $n$ across a BST, but shouldn’t be used to compare different $BST$’s. </w:t>
+        <w:t xml:space="preserve"> on $n$ across </w:t>
+      </w:r>
+      <w:r>
+        <w:t>the same</w:t>
+      </w:r>
+      <w:r>
+        <w:t xml:space="preserve"> BST,</w:t>
+      </w:r>
+      <w:r>
+        <w:t xml:space="preserve"> and</w:t>
+      </w:r>
+      <w:r>
+        <w:t xml:space="preserve"> shouldn’t be used to compare different </w:t>
+      </w:r>
+      <w:r>
+        <w:t xml:space="preserve">types </w:t>
+      </w:r>
+      <w:r>
+        <w:t xml:space="preserve">$BST$’s. </w:t>
       </w:r>
     </w:p>
     <w:p>
@@ -1965,7 +2945,16 @@
         </w:numPr>
       </w:pPr>
       <w:r>
-        <w:t>Custom: This metric was a placeholder for a metric specific to the BST in question. For our experiment, we used this place holder metric to count the number of rotations an AVL made during an operation</w:t>
+        <w:t xml:space="preserve">Custom: This metric was a placeholder for a metric specific to the BST in question. For our experiment, we used this place holder metric to count the number of rotations an AVL </w:t>
+      </w:r>
+      <w:r>
+        <w:t xml:space="preserve">tree </w:t>
+      </w:r>
+      <w:r>
+        <w:t>made during a</w:t>
+      </w:r>
+      <w:r>
+        <w:t xml:space="preserve"> function call.</w:t>
       </w:r>
     </w:p>
     <w:p>
@@ -1977,7 +2966,10 @@
         </w:numPr>
       </w:pPr>
       <w:r>
-        <w:t>Height: for this metric we tracked the height of the root node for each BST across each metric.</w:t>
+        <w:t>Height</w:t>
+      </w:r>
+      <w:r>
+        <w:t>: for this metric we tracked the height of the root node for each BST across each metric.</w:t>
       </w:r>
     </w:p>
     <w:p>
@@ -1999,7 +2991,13 @@
         <w:t xml:space="preserve"> accommodate our experimental design, we really needed</w:t>
       </w:r>
       <w:r>
-        <w:t xml:space="preserve"> a robust code base that was able to accommodate for all our metrics</w:t>
+        <w:t xml:space="preserve"> a robust code base that was able to </w:t>
+      </w:r>
+      <w:r>
+        <w:t>accommodate</w:t>
+      </w:r>
+      <w:r>
+        <w:t xml:space="preserve"> all our metrics</w:t>
       </w:r>
       <w:r>
         <w:t xml:space="preserve">. </w:t>
@@ -2011,7 +3009,7 @@
         <w:t>feat and</w:t>
       </w:r>
       <w:r>
-        <w:t xml:space="preserve"> took careful planning and plenty of rework in the end. To really understand our code base, we will break discuss our two main modules: trees, and benchmarking.</w:t>
+        <w:t xml:space="preserve"> took careful planning and plenty of rework in the end. To really understand our code base, we will discuss our two main modules: trees, and benchmarking.</w:t>
       </w:r>
     </w:p>
     <w:p>
@@ -2044,7 +3042,15 @@
         <w:t>s</w:t>
       </w:r>
       <w:r>
-        <w:t xml:space="preserve">ite GeekForGeeks </w:t>
+        <w:t xml:space="preserve">ite </w:t>
+      </w:r>
+      <w:proofErr w:type="spellStart"/>
+      <w:r>
+        <w:t>GeekForGeeks</w:t>
+      </w:r>
+      <w:proofErr w:type="spellEnd"/>
+      <w:r>
+        <w:t xml:space="preserve"> </w:t>
       </w:r>
       <w:r>
         <w:t>which we</w:t>
@@ -2053,22 +3059,86 @@
         <w:t xml:space="preserve"> then converted to C code (CITE)(CITE)(CITE). </w:t>
       </w:r>
       <w:r>
-        <w:t xml:space="preserve">Using GeekForGeeks’ Python code provide starting point and then the act  of converting it to provided a valuable learning experience. </w:t>
-      </w:r>
-      <w:r>
-        <w:t xml:space="preserve">While converting python to C, we took this opportunity to create a standard framework between our </w:t>
+        <w:t xml:space="preserve">Using </w:t>
+      </w:r>
+      <w:proofErr w:type="spellStart"/>
+      <w:r>
+        <w:t>GeekForGeeks</w:t>
+      </w:r>
+      <w:proofErr w:type="spellEnd"/>
+      <w:r>
+        <w:t>’ Python code provide</w:t>
+      </w:r>
+      <w:r>
+        <w:t>d a</w:t>
+      </w:r>
+      <w:r>
+        <w:t xml:space="preserve"> starting point </w:t>
+      </w:r>
+      <w:r>
+        <w:t xml:space="preserve">for this report </w:t>
+      </w:r>
+      <w:r>
+        <w:t xml:space="preserve">and provided a valuable learning experience. </w:t>
+      </w:r>
+      <w:r>
+        <w:t xml:space="preserve">While converting </w:t>
+      </w:r>
+      <w:r>
+        <w:t>P</w:t>
+      </w:r>
+      <w:r>
+        <w:t xml:space="preserve">ython to C, we took this opportunity to create a standard framework between our </w:t>
       </w:r>
       <w:r>
         <w:t>different</w:t>
       </w:r>
       <w:r>
-        <w:t xml:space="preserve"> BST.</w:t>
+        <w:t xml:space="preserve"> types of</w:t>
+      </w:r>
+      <w:r>
+        <w:t xml:space="preserve"> BST</w:t>
+      </w:r>
+      <w:r>
+        <w:t>s</w:t>
+      </w:r>
+      <w:r>
+        <w:t>.</w:t>
       </w:r>
     </w:p>
     <w:p>
       <w:r>
         <w:tab/>
-        <w:t xml:space="preserve">Each binary search contained two public structs, node and index, and four public functions, create index, search, insert and delete. Having this common framework allowed us to easily re-uses out benchmarking code across different implementations. Currently our tree structure needs to be refactored in order to generalize the code base. Although, our AVL and BST share a common framework, due to time we were unable to create generics for them. Having generics would make our dry and would make our implementation more modular. </w:t>
+        <w:t>Each binary search contained two public structs, node and index, and four public functions, create index, search, insert and delete. Having this common framework allowed us to easily re-use ou</w:t>
+      </w:r>
+      <w:r>
+        <w:t>r</w:t>
+      </w:r>
+      <w:r>
+        <w:t xml:space="preserve"> benchmarking code across different implementations. </w:t>
+      </w:r>
+    </w:p>
+    <w:p>
+      <w:pPr>
+        <w:ind w:firstLine="720"/>
+      </w:pPr>
+      <w:r>
+        <w:t xml:space="preserve">Admittedly, </w:t>
+      </w:r>
+      <w:r>
+        <w:t xml:space="preserve">our tree </w:t>
+      </w:r>
+      <w:r>
+        <w:t>module</w:t>
+      </w:r>
+      <w:r>
+        <w:t xml:space="preserve"> needs to </w:t>
+      </w:r>
+      <w:r>
+        <w:t xml:space="preserve">undergo a </w:t>
+      </w:r>
+      <w:r>
+        <w:t xml:space="preserve">refactor. Although, our AVL and BST share a common framework, due to time we were unable to create generics for them. Having generics would make our dry and would make our implementation more modular. </w:t>
       </w:r>
     </w:p>
     <w:p>
@@ -2130,19 +3200,161 @@
       </w:pPr>
       <w:r>
         <w:lastRenderedPageBreak/>
-        <w:t>Our benchmarking library housed all our logic for tracking and benchmarking the experiments. Each tree was given its own benchmarking  script which was then called by our main function. Each benchmarking was composed of two private functions: `</w:t>
-      </w:r>
-      <w:r>
-        <w:t>__get_regular_operation_time</w:t>
-      </w:r>
-      <w:r>
-        <w:t>`, running experiments for searching and delting data; and `</w:t>
-      </w:r>
-      <w:r>
-        <w:t>__get_insertion_time</w:t>
-      </w:r>
-      <w:r>
-        <w:t>`, which tracked the runtime for inserting value. To run an experiment the user needs to call `make main` and then call `.\main.out . If the user desires to to control the experiment run they can all pass in additional keyword arguments (see figure above).</w:t>
+        <w:t xml:space="preserve">Our benchmarking library housed </w:t>
+      </w:r>
+      <w:r>
+        <w:t xml:space="preserve">the </w:t>
+      </w:r>
+      <w:r>
+        <w:t xml:space="preserve">logic for tracking </w:t>
+      </w:r>
+      <w:r>
+        <w:t xml:space="preserve">our </w:t>
+      </w:r>
+      <w:r>
+        <w:t xml:space="preserve">experiments. Each tree was given its own </w:t>
+      </w:r>
+      <w:r>
+        <w:t>benchmarking script</w:t>
+      </w:r>
+      <w:r>
+        <w:t xml:space="preserve"> which was then called by </w:t>
+      </w:r>
+      <w:r>
+        <w:t>the</w:t>
+      </w:r>
+      <w:r>
+        <w:t xml:space="preserve"> main</w:t>
+      </w:r>
+      <w:r>
+        <w:t xml:space="preserve"> script</w:t>
+      </w:r>
+      <w:r>
+        <w:t>. Each</w:t>
+      </w:r>
+      <w:r>
+        <w:t xml:space="preserve"> of these</w:t>
+      </w:r>
+      <w:r>
+        <w:t xml:space="preserve"> benchmarking </w:t>
+      </w:r>
+      <w:r>
+        <w:t xml:space="preserve">scripts are </w:t>
+      </w:r>
+      <w:r>
+        <w:t xml:space="preserve">composed of two private functions: </w:t>
+      </w:r>
+      <w:r>
+        <w:t xml:space="preserve">* </w:t>
+      </w:r>
+    </w:p>
+    <w:p>
+      <w:pPr>
+        <w:pStyle w:val="ListParagraph"/>
+        <w:numPr>
+          <w:ilvl w:val="0"/>
+          <w:numId w:val="8"/>
+        </w:numPr>
+      </w:pPr>
+      <w:r>
+        <w:t>`</w:t>
+      </w:r>
+      <w:r>
+        <w:t>__</w:t>
+      </w:r>
+      <w:proofErr w:type="spellStart"/>
+      <w:r>
+        <w:t>get_regular_operation_time</w:t>
+      </w:r>
+      <w:proofErr w:type="spellEnd"/>
+      <w:r>
+        <w:t>:</w:t>
+      </w:r>
+      <w:r>
+        <w:t xml:space="preserve"> running experiments for searching and </w:t>
+      </w:r>
+      <w:r>
+        <w:t>deleting</w:t>
+      </w:r>
+      <w:r>
+        <w:t xml:space="preserve"> data</w:t>
+      </w:r>
+      <w:r>
+        <w:t>.</w:t>
+      </w:r>
+    </w:p>
+    <w:p>
+      <w:pPr>
+        <w:pStyle w:val="ListParagraph"/>
+        <w:numPr>
+          <w:ilvl w:val="0"/>
+          <w:numId w:val="8"/>
+        </w:numPr>
+      </w:pPr>
+      <w:r>
+        <w:t>`</w:t>
+      </w:r>
+      <w:r>
+        <w:t>__</w:t>
+      </w:r>
+      <w:proofErr w:type="spellStart"/>
+      <w:r>
+        <w:t>get_insertion_time</w:t>
+      </w:r>
+      <w:proofErr w:type="spellEnd"/>
+      <w:r>
+        <w:t>:</w:t>
+      </w:r>
+      <w:r>
+        <w:t xml:space="preserve"> which </w:t>
+      </w:r>
+      <w:r>
+        <w:t>tracks</w:t>
+      </w:r>
+      <w:r>
+        <w:t xml:space="preserve"> the runtime for inserting value</w:t>
+      </w:r>
+      <w:r>
+        <w:t>s</w:t>
+      </w:r>
+      <w:r>
+        <w:t xml:space="preserve">. </w:t>
+      </w:r>
+    </w:p>
+    <w:p>
+      <w:r>
+        <w:t>To run an experiment the user needs to call `make main` and then call `.\</w:t>
+      </w:r>
+      <w:proofErr w:type="spellStart"/>
+      <w:r>
+        <w:t>main.out</w:t>
+      </w:r>
+      <w:proofErr w:type="spellEnd"/>
+      <w:r>
+        <w:t>`</w:t>
+      </w:r>
+      <w:r>
+        <w:t xml:space="preserve">. If the user </w:t>
+      </w:r>
+      <w:r>
+        <w:t>desires</w:t>
+      </w:r>
+      <w:r>
+        <w:t xml:space="preserve"> to control the experiment</w:t>
+      </w:r>
+      <w:r>
+        <w:t>al</w:t>
+      </w:r>
+      <w:r>
+        <w:t xml:space="preserve"> </w:t>
+      </w:r>
+      <w:proofErr w:type="gramStart"/>
+      <w:r>
+        <w:t>run</w:t>
+      </w:r>
+      <w:proofErr w:type="gramEnd"/>
+      <w:r>
+        <w:t xml:space="preserve"> they can all pass in additional keyword arguments (see figure above).</w:t>
       </w:r>
     </w:p>
     <w:p>
@@ -2167,10 +3379,46 @@
         <w:t>review</w:t>
       </w:r>
       <w:r>
-        <w:t xml:space="preserve"> the results from the experiment describe in the previous section. </w:t>
-      </w:r>
-      <w:r>
-        <w:t>Our goal in this analysis is to validate our theoretical analysis by showing how the data describes it run time. Mostly this will be a descriptive analysis where we look at various types of graphs and describe what we are seeing in the results. To conclude this section, Will perform a predictive exercise where we see if we can’t effectively regress tree size on operation.</w:t>
+        <w:t xml:space="preserve"> the results from the experiment </w:t>
+      </w:r>
+      <w:r>
+        <w:t>described</w:t>
+      </w:r>
+      <w:r>
+        <w:t xml:space="preserve"> in the previous section.</w:t>
+      </w:r>
+      <w:r>
+        <w:t xml:space="preserve"> This empirical analysis will be used to validate our theoretical analysis</w:t>
+      </w:r>
+      <w:r>
+        <w:t xml:space="preserve">. </w:t>
+      </w:r>
+      <w:r>
+        <w:t>T</w:t>
+      </w:r>
+      <w:r>
+        <w:t xml:space="preserve">his </w:t>
+      </w:r>
+      <w:r>
+        <w:t xml:space="preserve">analysis </w:t>
+      </w:r>
+      <w:r>
+        <w:t xml:space="preserve">will </w:t>
+      </w:r>
+      <w:r>
+        <w:t>use both</w:t>
+      </w:r>
+      <w:r>
+        <w:t xml:space="preserve"> descriptive </w:t>
+      </w:r>
+      <w:r>
+        <w:t xml:space="preserve">and predictive </w:t>
+      </w:r>
+      <w:r>
+        <w:t>analy</w:t>
+      </w:r>
+      <w:r>
+        <w:t>tics. Our descriptive analysis will describe various plots are showing. Our predictive analysis, which is also descriptive, will use a linear model to describe our results.</w:t>
       </w:r>
     </w:p>
     <w:p>
@@ -2242,7 +3490,13 @@
         <w:t xml:space="preserve">functions: </w:t>
       </w:r>
       <w:r>
-        <w:t xml:space="preserve">search deletion and insertion. Each graph contains </w:t>
+        <w:t>search</w:t>
+      </w:r>
+      <w:r>
+        <w:t>,</w:t>
+      </w:r>
+      <w:r>
+        <w:t xml:space="preserve"> deletion and insertion. Each graph contains </w:t>
       </w:r>
       <w:r>
         <w:t>two</w:t>
@@ -2260,7 +3514,13 @@
         <w:t xml:space="preserve"> </w:t>
       </w:r>
       <w:r>
-        <w:t>order in random datasets.</w:t>
+        <w:t xml:space="preserve">order </w:t>
+      </w:r>
+      <w:r>
+        <w:t>and</w:t>
+      </w:r>
+      <w:r>
+        <w:t xml:space="preserve"> random datasets.</w:t>
       </w:r>
       <w:r>
         <w:t xml:space="preserve"> The results in the above </w:t>
@@ -2282,26 +3542,73 @@
         </w:tabs>
       </w:pPr>
       <w:r>
-        <w:t xml:space="preserve">Our first observation of note are the noticeable step in our `in order dataset lines`.  We are not exactly sure why we are seeing this stepping pattern, </w:t>
+        <w:t>Our first observation of note</w:t>
+      </w:r>
+      <w:r>
+        <w:t xml:space="preserve"> </w:t>
+      </w:r>
+      <w:r>
+        <w:t xml:space="preserve">is </w:t>
+      </w:r>
+      <w:r>
+        <w:t>the noticeable step</w:t>
+      </w:r>
+      <w:r>
+        <w:t>s</w:t>
+      </w:r>
+      <w:r>
+        <w:t xml:space="preserve"> in our `in order dataset lines`.  We are not exactly sure why we are seeing this stepping pattern, </w:t>
       </w:r>
       <w:r>
         <w:t xml:space="preserve">but we hypothesize that in order insertion causes leaf node levels to be more uniform. </w:t>
       </w:r>
       <w:r>
-        <w:t xml:space="preserve">Another insight comes from the noise in the `delete random line`. This noise is expected since deletion can cause cascading </w:t>
+        <w:t xml:space="preserve">Another insight comes from the noise </w:t>
       </w:r>
       <w:r>
         <w:lastRenderedPageBreak/>
-        <w:t xml:space="preserve">changes, but nonetheless the trend still looks logarithmic. </w:t>
+        <w:t>in the `delete random line`. This noise is expected since deletion can cause cascading changes, but nonetheless</w:t>
+      </w:r>
+      <w:r>
+        <w:t>,</w:t>
+      </w:r>
+      <w:r>
+        <w:t xml:space="preserve"> th</w:t>
+      </w:r>
+      <w:r>
+        <w:t>is</w:t>
+      </w:r>
+      <w:r>
+        <w:t xml:space="preserve"> trend still looks logarithmic. </w:t>
       </w:r>
       <w:r>
         <w:t>To summarize, these results show and validate $</w:t>
       </w:r>
       <w:r>
+        <w:t>O(</w:t>
+      </w:r>
+      <w:r>
         <w:t>\l</w:t>
       </w:r>
       <w:r>
-        <w:t xml:space="preserve">og(n)$ performance </w:t>
+        <w:t>og(n</w:t>
+      </w:r>
+      <w:proofErr w:type="gramStart"/>
+      <w:r>
+        <w:t>)</w:t>
+      </w:r>
+      <w:r>
+        <w:t>)</w:t>
+      </w:r>
+      <w:r>
+        <w:t>$</w:t>
+      </w:r>
+      <w:proofErr w:type="gramEnd"/>
+      <w:r>
+        <w:t xml:space="preserve"> performance </w:t>
+      </w:r>
+      <w:r>
+        <w:t>for these functions.</w:t>
       </w:r>
     </w:p>
     <w:p>
@@ -2365,7 +3672,15 @@
         <w:t>corresponds to</w:t>
       </w:r>
       <w:r>
-        <w:t xml:space="preserve"> the number of nodes in in an AVL tree ($n$). Previously, our proof showed that $h=O(log(n))$, and once again our results </w:t>
+        <w:t xml:space="preserve"> the number of nodes in in an AVL tree ($n$). Previously, our proof showed that $h=O(log(n</w:t>
+      </w:r>
+      <w:proofErr w:type="gramStart"/>
+      <w:r>
+        <w:t>))$</w:t>
+      </w:r>
+      <w:proofErr w:type="gramEnd"/>
+      <w:r>
+        <w:t xml:space="preserve">, and once again our results </w:t>
       </w:r>
       <w:r>
         <w:t xml:space="preserve">clearly validate our initial conclusion. </w:t>
@@ -2386,12 +3701,32 @@
         <w:t xml:space="preserve"> a stepping pattern which represents our tree acquiring another level. </w:t>
       </w:r>
       <w:r>
-        <w:t>We expect each step to get larger as the tree grow by a factor of ~$2^n$. Another notable pattern comes from the significant height difference between a randomly built AVL tree and an in order built AVL tree. This algins to Brown’s findings, which noted that in order insertion produced a tree which was over 2 times faster than a randomly built tree [CITE].</w:t>
-      </w:r>
-    </w:p>
-    <w:p>
-      <w:r>
-        <w:tab/>
+        <w:t>We expect each step to get larger</w:t>
+      </w:r>
+      <w:r>
+        <w:t xml:space="preserve"> </w:t>
+      </w:r>
+      <w:r>
+        <w:t xml:space="preserve">as the tree </w:t>
+      </w:r>
+      <w:proofErr w:type="gramStart"/>
+      <w:r>
+        <w:t>grow</w:t>
+      </w:r>
+      <w:proofErr w:type="gramEnd"/>
+      <w:r>
+        <w:t xml:space="preserve"> by a factor of ~$2^n$. Another notable pattern comes from the significant height difference between a randomly built AVL tree and an in order built AVL tree. This algins to Brown’s findings, which noted that in order insertion produced a tree which was over 2 times faster than a randomly built tree [CITE].</w:t>
+      </w:r>
+      <w:r>
+        <w:t xml:space="preserve"> The performance can be seen in the level difference between the two different implementations. The results in the plot above show that height is indeed $O(log(n</w:t>
+      </w:r>
+      <w:proofErr w:type="gramStart"/>
+      <w:r>
+        <w:t>))$</w:t>
+      </w:r>
+      <w:proofErr w:type="gramEnd"/>
+      <w:r>
+        <w:t>.</w:t>
       </w:r>
     </w:p>
     <w:p>
@@ -2399,6 +3734,7 @@
         <w:pStyle w:val="Heading3"/>
       </w:pPr>
       <w:r>
+        <w:lastRenderedPageBreak/>
         <w:t>Total Rotations:</w:t>
       </w:r>
     </w:p>
@@ -2449,7 +3785,6 @@
     </w:p>
     <w:p>
       <w:r>
-        <w:lastRenderedPageBreak/>
         <w:tab/>
         <w:t xml:space="preserve">The graph above describes the number of rotations </w:t>
       </w:r>
@@ -2457,7 +3792,13 @@
         <w:t>a</w:t>
       </w:r>
       <w:r>
-        <w:t>s a function of data set and operation performed. Some interesting findings can be derived from the graph above which further highlight a stark difference between in order and randomly built AVL tree</w:t>
+        <w:t xml:space="preserve">s a function of data set and </w:t>
+      </w:r>
+      <w:r>
+        <w:t>function</w:t>
+      </w:r>
+      <w:r>
+        <w:t>. Some interesting findings can be derived from the graph above which further highlight a stark difference between in order and randomly built AVL tree</w:t>
       </w:r>
       <w:r>
         <w:t>s</w:t>
@@ -2484,7 +3825,16 @@
         <w:t>ould cause the maximum number of rotations</w:t>
       </w:r>
       <w:r>
-        <w:t>[cite]</w:t>
+        <w:t xml:space="preserve"> </w:t>
+      </w:r>
+      <w:r>
+        <w:t>[</w:t>
+      </w:r>
+      <w:r>
+        <w:t xml:space="preserve">Brown, </w:t>
+      </w:r>
+      <w:r>
+        <w:t>cite]</w:t>
       </w:r>
       <w:r>
         <w:t xml:space="preserve">. Essentially, we are constantly building a </w:t>
@@ -2492,11 +3842,36 @@
       <w:r>
         <w:t>“</w:t>
       </w:r>
+      <w:proofErr w:type="gramStart"/>
       <w:r>
         <w:t>link</w:t>
       </w:r>
       <w:r>
-        <w:t xml:space="preserve">ed-list” which must be corrected with a coresponding rotation. Brown’s work showed that a sorted AVL tree caused a nearly 2 times increase in the  number of rotations when compared to an randomly built AVL tree, and our results confirm his findings. </w:t>
+        <w:t>ed-list</w:t>
+      </w:r>
+      <w:proofErr w:type="gramEnd"/>
+      <w:r>
+        <w:t xml:space="preserve">” which must be corrected with a </w:t>
+      </w:r>
+      <w:r>
+        <w:t>corresponding</w:t>
+      </w:r>
+      <w:r>
+        <w:t xml:space="preserve"> rotation. Brown’s work showed that a sorted AVL tree caused a nearly 2 times increase in </w:t>
+      </w:r>
+      <w:r>
+        <w:t>the number</w:t>
+      </w:r>
+      <w:r>
+        <w:t xml:space="preserve"> of rotations when compared to </w:t>
+      </w:r>
+      <w:proofErr w:type="gramStart"/>
+      <w:r>
+        <w:t>an</w:t>
+      </w:r>
+      <w:proofErr w:type="gramEnd"/>
+      <w:r>
+        <w:t xml:space="preserve"> randomly built AVL tree, and our results confirm his findings. </w:t>
       </w:r>
     </w:p>
     <w:p/>
@@ -2557,7 +3932,23 @@
     </w:p>
     <w:p>
       <w:r>
-        <w:t>Operations = c_1 \cdot \log(n) + c_2 =22 \c dotlog(n) + 291</w:t>
+        <w:t>Operations = c_1 \</w:t>
+      </w:r>
+      <w:proofErr w:type="spellStart"/>
+      <w:r>
+        <w:t>cdot</w:t>
+      </w:r>
+      <w:proofErr w:type="spellEnd"/>
+      <w:r>
+        <w:t xml:space="preserve"> \log(n) + c_2 =22 \c </w:t>
+      </w:r>
+      <w:proofErr w:type="spellStart"/>
+      <w:r>
+        <w:t>dotlog</w:t>
+      </w:r>
+      <w:proofErr w:type="spellEnd"/>
+      <w:r>
+        <w:t>(n) + 291</w:t>
       </w:r>
     </w:p>
     <w:p>
@@ -2570,6 +3961,7 @@
         <w:ind w:firstLine="720"/>
       </w:pPr>
       <w:r>
+        <w:lastRenderedPageBreak/>
         <w:t>As a final analysis</w:t>
       </w:r>
       <w:r>
@@ -2585,10 +3977,21 @@
         <w:t xml:space="preserve"> to perform a simple linear regression. </w:t>
       </w:r>
       <w:r>
-        <w:t>The goal of this analysis is to regress the number operations against $\log(n)$, and hopefully by doing so revealing $O(log(n))$ for insertion. Our results and equation can be found above and additional information</w:t>
-      </w:r>
-      <w:r>
-        <w:t xml:space="preserve"> for our experiment can be found in the appendic</w:t>
+        <w:t>The goal of this analysis is to regress the number operations against $\log(n)$, and by doing so revealing $O(log(n</w:t>
+      </w:r>
+      <w:proofErr w:type="gramStart"/>
+      <w:r>
+        <w:t>))$</w:t>
+      </w:r>
+      <w:proofErr w:type="gramEnd"/>
+      <w:r>
+        <w:t xml:space="preserve"> for insertion. Our results and equation can be found above and additional information</w:t>
+      </w:r>
+      <w:r>
+        <w:t xml:space="preserve"> for our experiment can be found in the </w:t>
+      </w:r>
+      <w:r>
+        <w:t>appendix</w:t>
       </w:r>
       <w:r>
         <w:t xml:space="preserve">. </w:t>
@@ -2599,7 +4002,18 @@
         <w:ind w:firstLine="720"/>
       </w:pPr>
       <w:r>
-        <w:t>Our experiment was able to produce an  $R^2$ value of 5</w:t>
+        <w:t xml:space="preserve">Our experiment was able to produce </w:t>
+      </w:r>
+      <w:proofErr w:type="gramStart"/>
+      <w:r>
+        <w:t>an</w:t>
+      </w:r>
+      <w:proofErr w:type="gramEnd"/>
+      <w:r>
+        <w:t xml:space="preserve"> $</w:t>
+      </w:r>
+      <w:r>
+        <w:t>R^2$ value of 5</w:t>
       </w:r>
       <w:r>
         <w:t>2</w:t>
@@ -2608,16 +4022,35 @@
         <w:t xml:space="preserve">%. Our $R^2$ reveals how important a theoretical analysis is for any study. </w:t>
       </w:r>
       <w:r>
-        <w:t>Data for an empircal</w:t>
+        <w:t xml:space="preserve">Data for an </w:t>
+      </w:r>
+      <w:r>
+        <w:t>empirical</w:t>
       </w:r>
       <w:r>
         <w:t xml:space="preserve"> analysis </w:t>
       </w:r>
       <w:r>
-        <w:t xml:space="preserve">can be </w:t>
-      </w:r>
-      <w:r>
-        <w:t xml:space="preserve"> very noisy and this noise can make results </w:t>
+        <w:t xml:space="preserve">can </w:t>
+      </w:r>
+      <w:proofErr w:type="gramStart"/>
+      <w:r>
+        <w:t xml:space="preserve">be </w:t>
+      </w:r>
+      <w:r>
+        <w:t xml:space="preserve"> very</w:t>
+      </w:r>
+      <w:proofErr w:type="gramEnd"/>
+      <w:r>
+        <w:t xml:space="preserve"> </w:t>
+      </w:r>
+      <w:proofErr w:type="gramStart"/>
+      <w:r>
+        <w:t>noisy</w:t>
+      </w:r>
+      <w:proofErr w:type="gramEnd"/>
+      <w:r>
+        <w:t xml:space="preserve"> and this noise can make results </w:t>
       </w:r>
       <w:r>
         <w:t>ambiguou</w:t>
@@ -2640,27 +4073,108 @@
         <w:t xml:space="preserve"> residual plot shows homoscedasticity and normally distributed residuals. </w:t>
       </w:r>
       <w:r>
-        <w:t xml:space="preserve">The only violation of BLUE would be </w:t>
+        <w:t xml:space="preserve">The only violation of BLUE would be the linearity assumption. The linearity assumption may be broken since we can see a </w:t>
+      </w:r>
+      <w:r>
+        <w:t xml:space="preserve">slight </w:t>
+      </w:r>
+      <w:r>
+        <w:t>stepping pattern in our residual plot. This stepping pattern can be explained with the height of our tree increasing for specific ranges of $n$. In summary</w:t>
+      </w:r>
+      <w:r>
+        <w:t xml:space="preserve">, our model shows $log(n)$ performance which algins with our theoretical analysis. </w:t>
+      </w:r>
+    </w:p>
+    <w:p/>
+    <w:p>
+      <w:r>
+        <w:t>Conclusion:</w:t>
+      </w:r>
+    </w:p>
+    <w:p>
+      <w:r>
+        <w:tab/>
+        <w:t xml:space="preserve">This report provides a comprehensive analysis of an AVL tree. We started this report describing the AVL tree’s history and use in practical applications. We also moved on to show how this self-balancing tree identified imbalance using the balance factor and then corrected for that imbalance using rotations. </w:t>
+      </w:r>
+    </w:p>
+    <w:p>
+      <w:r>
+        <w:tab/>
+        <w:t>After providing an overview of an AVL tree, we went on to perform a theoretical runtime analysis. We started this analysis with proving that $h = O(log(n</w:t>
+      </w:r>
+      <w:proofErr w:type="gramStart"/>
+      <w:r>
+        <w:t>))$</w:t>
+      </w:r>
+      <w:proofErr w:type="gramEnd"/>
+      <w:r>
+        <w:t xml:space="preserve">. This proof was foundational, because it </w:t>
+      </w:r>
+      <w:r>
+        <w:t>was subsequently relied on for our Big-O analysis for search, deletion and insertion.</w:t>
+      </w:r>
+    </w:p>
+    <w:p>
+      <w:r>
+        <w:tab/>
+        <w:t>After our theoretical analysis, we went on to describe our experiment and code. The code for this project was comprehensive and allowed us to gather a significant amount of data points. These data points included variables such as run-time, operation count, rotation count, and tree height.  We also describe how we performed each trial and how we corrected for noisy data and autocorrelation. This experiment design provided a foundation for performing our empirical analysis.</w:t>
+      </w:r>
+    </w:p>
+    <w:p>
+      <w:r>
+        <w:tab/>
+        <w:t xml:space="preserve">Our empirical analysis was aimed at supporting our conclusions drawn in our theoretical analysis. Our analysis used both descriptive and inferential analysis. For the </w:t>
       </w:r>
       <w:r>
         <w:lastRenderedPageBreak/>
-        <w:t xml:space="preserve">the linearity assumption. The linearity assumption may be broken since we can see a </w:t>
-      </w:r>
-      <w:r>
-        <w:t xml:space="preserve">slight </w:t>
-      </w:r>
-      <w:r>
-        <w:t>stepping pattern in our residual plot. This stepping pattern can be explained with the height of our tree increasing for specific ranges of $n$. In summary</w:t>
-      </w:r>
-      <w:r>
-        <w:t xml:space="preserve">, our model shows $log(n)$ performance which algins with our theoretical analysis. </w:t>
+        <w:t xml:space="preserve">descriptive portion of the analysis, we went through three graphs which all supported </w:t>
+      </w:r>
+      <w:r>
+        <w:t xml:space="preserve">theoretical analysis. We also used inferential techniques by regressing $operations ~ log(n)$. This regressor should favorable characteristics and </w:t>
+      </w:r>
+      <w:r>
+        <w:t>continue</w:t>
+      </w:r>
+      <w:r>
+        <w:t xml:space="preserve"> to support </w:t>
+      </w:r>
+      <w:proofErr w:type="gramStart"/>
+      <w:r>
+        <w:t>or</w:t>
+      </w:r>
+      <w:proofErr w:type="gramEnd"/>
+      <w:r>
+        <w:t xml:space="preserve"> theoretical analysis.</w:t>
       </w:r>
     </w:p>
     <w:p>
       <w:r>
         <w:tab/>
       </w:r>
-    </w:p>
+      <w:r>
+        <w:t xml:space="preserve">This project was exciting and intense. </w:t>
+      </w:r>
+    </w:p>
+    <w:p/>
+    <w:p/>
+    <w:p/>
+    <w:p>
+      <w:pPr>
+        <w:rPr>
+          <w:b/>
+          <w:bCs/>
+        </w:rPr>
+      </w:pPr>
+    </w:p>
+    <w:p>
+      <w:pPr>
+        <w:rPr>
+          <w:b/>
+          <w:bCs/>
+        </w:rPr>
+      </w:pPr>
+    </w:p>
+    <w:p/>
     <w:p/>
     <w:p/>
     <w:p>
@@ -2726,6 +4240,7 @@
         <w:pStyle w:val="Heading4"/>
       </w:pPr>
       <w:r>
+        <w:lastRenderedPageBreak/>
         <w:t>Right-Left Rotation</w:t>
       </w:r>
     </w:p>
@@ -2781,12 +4296,11 @@
         <w:rPr>
           <w:noProof/>
         </w:rPr>
-        <w:lastRenderedPageBreak/>
         <w:drawing>
-          <wp:inline distT="0" distB="0" distL="0" distR="0" wp14:anchorId="52C08C06" wp14:editId="0D8963D4">
-            <wp:extent cx="5830114" cy="4029637"/>
-            <wp:effectExtent l="0" t="0" r="0" b="9525"/>
-            <wp:docPr id="1850288782" name="Picture 1" descr="A screenshot of a computer&#10;&#10;AI-generated content may be incorrect."/>
+          <wp:inline distT="0" distB="0" distL="0" distR="0" wp14:anchorId="05402D6F" wp14:editId="74BCE405">
+            <wp:extent cx="5828030" cy="4029710"/>
+            <wp:effectExtent l="0" t="0" r="1270" b="8890"/>
+            <wp:docPr id="2119436776" name="Picture 1"/>
             <wp:cNvGraphicFramePr>
               <a:graphicFrameLocks xmlns:a="http://schemas.openxmlformats.org/drawingml/2006/main" noChangeAspect="1"/>
             </wp:cNvGraphicFramePr>
@@ -2794,23 +4308,33 @@
               <a:graphicData uri="http://schemas.openxmlformats.org/drawingml/2006/picture">
                 <pic:pic xmlns:pic="http://schemas.openxmlformats.org/drawingml/2006/picture">
                   <pic:nvPicPr>
-                    <pic:cNvPr id="1850288782" name="Picture 1" descr="A screenshot of a computer&#10;&#10;AI-generated content may be incorrect."/>
-                    <pic:cNvPicPr/>
+                    <pic:cNvPr id="0" name="Picture 2"/>
+                    <pic:cNvPicPr>
+                      <a:picLocks noChangeAspect="1" noChangeArrowheads="1"/>
+                    </pic:cNvPicPr>
                   </pic:nvPicPr>
                   <pic:blipFill>
-                    <a:blip r:embed="rId19"/>
+                    <a:blip r:embed="rId19">
+                      <a:extLst>
+                        <a:ext uri="{28A0092B-C50C-407E-A947-70E740481C1C}">
+                          <a14:useLocalDpi xmlns:a14="http://schemas.microsoft.com/office/drawing/2010/main" val="0"/>
+                        </a:ext>
+                      </a:extLst>
+                    </a:blip>
+                    <a:srcRect/>
                     <a:stretch>
                       <a:fillRect/>
                     </a:stretch>
                   </pic:blipFill>
-                  <pic:spPr>
+                  <pic:spPr bwMode="auto">
                     <a:xfrm>
                       <a:off x="0" y="0"/>
-                      <a:ext cx="5830114" cy="4029637"/>
+                      <a:ext cx="5828030" cy="4029710"/>
                     </a:xfrm>
                     <a:prstGeom prst="rect">
                       <a:avLst/>
                     </a:prstGeom>
+                    <a:noFill/>
                   </pic:spPr>
                 </pic:pic>
               </a:graphicData>
@@ -2875,8 +4399,16 @@
           <w:rPr>
             <w:rStyle w:val="Hyperlink"/>
           </w:rPr>
-          <w:t>Balanced Binary Tree - GeeksforGeeks</w:t>
+          <w:t xml:space="preserve">Balanced Binary Tree - </w:t>
         </w:r>
+        <w:proofErr w:type="spellStart"/>
+        <w:r>
+          <w:rPr>
+            <w:rStyle w:val="Hyperlink"/>
+          </w:rPr>
+          <w:t>GeeksforGeeks</w:t>
+        </w:r>
+        <w:proofErr w:type="spellEnd"/>
       </w:hyperlink>
     </w:p>
     <w:p>
@@ -3019,6 +4551,7 @@
         <w:pStyle w:val="Heading2"/>
       </w:pPr>
       <w:r>
+        <w:lastRenderedPageBreak/>
         <w:t>References:</w:t>
       </w:r>
     </w:p>
@@ -3859,7 +5392,7 @@
       <w:lvlText w:val=""/>
       <w:lvlJc w:val="left"/>
       <w:pPr>
-        <w:ind w:left="720" w:hanging="360"/>
+        <w:ind w:left="1080" w:hanging="360"/>
       </w:pPr>
       <w:rPr>
         <w:rFonts w:ascii="Symbol" w:eastAsiaTheme="minorHAnsi" w:hAnsi="Symbol" w:cstheme="minorBidi" w:hint="default"/>
@@ -3871,7 +5404,7 @@
       <w:lvlText w:val="o"/>
       <w:lvlJc w:val="left"/>
       <w:pPr>
-        <w:ind w:left="1440" w:hanging="360"/>
+        <w:ind w:left="1800" w:hanging="360"/>
       </w:pPr>
       <w:rPr>
         <w:rFonts w:ascii="Courier New" w:hAnsi="Courier New" w:cs="Courier New" w:hint="default"/>
@@ -3883,7 +5416,7 @@
       <w:lvlText w:val=""/>
       <w:lvlJc w:val="left"/>
       <w:pPr>
-        <w:ind w:left="2160" w:hanging="360"/>
+        <w:ind w:left="2520" w:hanging="360"/>
       </w:pPr>
       <w:rPr>
         <w:rFonts w:ascii="Wingdings" w:hAnsi="Wingdings" w:hint="default"/>
@@ -3895,7 +5428,7 @@
       <w:lvlText w:val=""/>
       <w:lvlJc w:val="left"/>
       <w:pPr>
-        <w:ind w:left="2880" w:hanging="360"/>
+        <w:ind w:left="3240" w:hanging="360"/>
       </w:pPr>
       <w:rPr>
         <w:rFonts w:ascii="Symbol" w:hAnsi="Symbol" w:hint="default"/>
@@ -3907,7 +5440,7 @@
       <w:lvlText w:val="o"/>
       <w:lvlJc w:val="left"/>
       <w:pPr>
-        <w:ind w:left="3600" w:hanging="360"/>
+        <w:ind w:left="3960" w:hanging="360"/>
       </w:pPr>
       <w:rPr>
         <w:rFonts w:ascii="Courier New" w:hAnsi="Courier New" w:cs="Courier New" w:hint="default"/>
@@ -3919,7 +5452,7 @@
       <w:lvlText w:val=""/>
       <w:lvlJc w:val="left"/>
       <w:pPr>
-        <w:ind w:left="4320" w:hanging="360"/>
+        <w:ind w:left="4680" w:hanging="360"/>
       </w:pPr>
       <w:rPr>
         <w:rFonts w:ascii="Wingdings" w:hAnsi="Wingdings" w:hint="default"/>
@@ -3931,7 +5464,7 @@
       <w:lvlText w:val=""/>
       <w:lvlJc w:val="left"/>
       <w:pPr>
-        <w:ind w:left="5040" w:hanging="360"/>
+        <w:ind w:left="5400" w:hanging="360"/>
       </w:pPr>
       <w:rPr>
         <w:rFonts w:ascii="Symbol" w:hAnsi="Symbol" w:hint="default"/>
@@ -3943,7 +5476,7 @@
       <w:lvlText w:val="o"/>
       <w:lvlJc w:val="left"/>
       <w:pPr>
-        <w:ind w:left="5760" w:hanging="360"/>
+        <w:ind w:left="6120" w:hanging="360"/>
       </w:pPr>
       <w:rPr>
         <w:rFonts w:ascii="Courier New" w:hAnsi="Courier New" w:cs="Courier New" w:hint="default"/>
@@ -3955,7 +5488,7 @@
       <w:lvlText w:val=""/>
       <w:lvlJc w:val="left"/>
       <w:pPr>
-        <w:ind w:left="6480" w:hanging="360"/>
+        <w:ind w:left="6840" w:hanging="360"/>
       </w:pPr>
       <w:rPr>
         <w:rFonts w:ascii="Wingdings" w:hAnsi="Wingdings" w:hint="default"/>
@@ -4713,7 +6246,7 @@
   <w:style w:type="paragraph" w:default="1" w:styleId="Normal">
     <w:name w:val="Normal"/>
     <w:qFormat/>
-    <w:rsid w:val="002F40C6"/>
+    <w:rsid w:val="00FF4973"/>
   </w:style>
   <w:style w:type="paragraph" w:styleId="Heading1">
     <w:name w:val="heading 1"/>

</xml_diff>

<commit_message>
conlcusion in md added
</commit_message>
<xml_diff>
--- a/AVL Trees.docx
+++ b/AVL Trees.docx
@@ -4094,13 +4094,75 @@
     <w:p>
       <w:r>
         <w:tab/>
-        <w:t xml:space="preserve">This report provides a comprehensive analysis of an AVL tree. We started this report describing the AVL tree’s history and use in practical applications. We also moved on to show how this self-balancing tree identified imbalance using the balance factor and then corrected for that imbalance using rotations. </w:t>
+        <w:t xml:space="preserve">This report provides a comprehensive analysis of an AVL tree. </w:t>
+      </w:r>
+      <w:r>
+        <w:t xml:space="preserve">Through this analysis, we were able to build, validate and test our AVL tree. To </w:t>
+      </w:r>
+      <w:proofErr w:type="gramStart"/>
+      <w:r>
+        <w:t>concluded</w:t>
+      </w:r>
+      <w:proofErr w:type="gramEnd"/>
+      <w:r>
+        <w:t xml:space="preserve">, we will walk through each section of the report and highlight some of the key </w:t>
+      </w:r>
+      <w:proofErr w:type="spellStart"/>
+      <w:r>
+        <w:t>takeways</w:t>
+      </w:r>
+      <w:proofErr w:type="spellEnd"/>
+      <w:r>
+        <w:t>.</w:t>
+      </w:r>
+    </w:p>
+    <w:p>
+      <w:pPr>
+        <w:ind w:firstLine="720"/>
+      </w:pPr>
+      <w:r>
+        <w:t xml:space="preserve">In the first section, AVL Algorithm, we began with </w:t>
+      </w:r>
+      <w:r>
+        <w:t xml:space="preserve">describing </w:t>
+      </w:r>
+      <w:r>
+        <w:t>an</w:t>
+      </w:r>
+      <w:r>
+        <w:t xml:space="preserve"> AVL tree’s history and use in practical applications. </w:t>
+      </w:r>
+      <w:r>
+        <w:t>An A</w:t>
+      </w:r>
+      <w:r>
+        <w:t xml:space="preserve">VL </w:t>
+      </w:r>
+      <w:r>
+        <w:t xml:space="preserve">tree can often be found in </w:t>
+      </w:r>
+      <w:proofErr w:type="spellStart"/>
+      <w:r>
+        <w:t>linux</w:t>
+      </w:r>
+      <w:proofErr w:type="spellEnd"/>
+      <w:r>
+        <w:t xml:space="preserve"> kernels, database indexes and so on. After showing the practical aspects of an AVL tree, we moved on to describe how an AVL tree maintains its balance. An AVL tree identifies imbalance with </w:t>
+      </w:r>
+      <w:r>
+        <w:t xml:space="preserve">using the balance factor and then corrected for that imbalance using rotations. </w:t>
       </w:r>
     </w:p>
     <w:p>
       <w:r>
         <w:tab/>
-        <w:t>After providing an overview of an AVL tree, we went on to perform a theoretical runtime analysis. We started this analysis with proving that $h = O(log(n</w:t>
+        <w:t>After providing an overview of an AVL tree, we went on to perform a theoretical runtime analysis</w:t>
+      </w:r>
+      <w:r>
+        <w:t xml:space="preserve"> in the next section</w:t>
+      </w:r>
+      <w:r>
+        <w:t>. We started this analysis with proving that $h = O(log(n</w:t>
       </w:r>
       <w:proofErr w:type="gramStart"/>
       <w:r>
@@ -4113,38 +4175,73 @@
       <w:r>
         <w:t>was subsequently relied on for our Big-O analysis for search, deletion and insertion.</w:t>
       </w:r>
+      <w:r>
+        <w:t xml:space="preserve"> All our time complexities showed $O(log(n</w:t>
+      </w:r>
+      <w:proofErr w:type="gramStart"/>
+      <w:r>
+        <w:t>))$</w:t>
+      </w:r>
+      <w:proofErr w:type="gramEnd"/>
+      <w:r>
+        <w:t xml:space="preserve"> performance. We also investigated our space complexity, and this really showed why it is often better to use iteration over recursion. </w:t>
+      </w:r>
     </w:p>
     <w:p>
       <w:r>
         <w:tab/>
-        <w:t>After our theoretical analysis, we went on to describe our experiment and code. The code for this project was comprehensive and allowed us to gather a significant amount of data points. These data points included variables such as run-time, operation count, rotation count, and tree height.  We also describe how we performed each trial and how we corrected for noisy data and autocorrelation. This experiment design provided a foundation for performing our empirical analysis.</w:t>
+      </w:r>
+      <w:r>
+        <w:t>In the Implementation section</w:t>
+      </w:r>
+      <w:r>
+        <w:t>, we describe</w:t>
+      </w:r>
+      <w:r>
+        <w:t>d</w:t>
+      </w:r>
+      <w:r>
+        <w:t xml:space="preserve"> our experiment and code. The code for this project was comprehensive and allowed us to gather a significant amount of data </w:t>
+      </w:r>
+      <w:r>
+        <w:lastRenderedPageBreak/>
+        <w:t xml:space="preserve">points. These data points included variables such as run-time, operation count, rotation count, and tree height.  We also describe how we performed each trial and how we corrected for noisy data and autocorrelation. This experiment </w:t>
+      </w:r>
+      <w:r>
+        <w:t xml:space="preserve">and code </w:t>
+      </w:r>
+      <w:r>
+        <w:t>provided a foundation for performing our empirical analysis.</w:t>
       </w:r>
     </w:p>
     <w:p>
       <w:r>
         <w:tab/>
-        <w:t xml:space="preserve">Our empirical analysis was aimed at supporting our conclusions drawn in our theoretical analysis. Our analysis used both descriptive and inferential analysis. For the </w:t>
-      </w:r>
-      <w:r>
-        <w:lastRenderedPageBreak/>
-        <w:t xml:space="preserve">descriptive portion of the analysis, we went through three graphs which all supported </w:t>
-      </w:r>
-      <w:r>
-        <w:t xml:space="preserve">theoretical analysis. We also used inferential techniques by regressing $operations ~ log(n)$. This regressor should favorable characteristics and </w:t>
+        <w:t xml:space="preserve">Our empirical analysis was aimed at supporting our conclusions drawn in our theoretical analysis. Our analysis used both descriptive and inferential analysis. For the descriptive portion of the analysis, we went through three graphs which all supported </w:t>
+      </w:r>
+      <w:r>
+        <w:t xml:space="preserve">theoretical analysis. We also used inferential techniques by regressing $operations ~ log(n)$. This regressor </w:t>
+      </w:r>
+      <w:r>
+        <w:t>showed</w:t>
+      </w:r>
+      <w:r>
+        <w:t xml:space="preserve"> favorable characteristics and </w:t>
       </w:r>
       <w:r>
         <w:t>continue</w:t>
       </w:r>
       <w:r>
-        <w:t xml:space="preserve"> to support </w:t>
-      </w:r>
-      <w:proofErr w:type="gramStart"/>
-      <w:r>
-        <w:t>or</w:t>
-      </w:r>
-      <w:proofErr w:type="gramEnd"/>
-      <w:r>
-        <w:t xml:space="preserve"> theoretical analysis.</w:t>
+        <w:t>d</w:t>
+      </w:r>
+      <w:r>
+        <w:t xml:space="preserve"> to support o</w:t>
+      </w:r>
+      <w:r>
+        <w:t>u</w:t>
+      </w:r>
+      <w:r>
+        <w:t>r theoretical analysis.</w:t>
       </w:r>
     </w:p>
     <w:p>
@@ -4153,6 +4250,44 @@
       </w:r>
       <w:r>
         <w:t xml:space="preserve">This project was exciting and intense. </w:t>
+      </w:r>
+      <w:r>
+        <w:t xml:space="preserve">The biggest lesson for this project was being able to effectively scope out work. The initial plan for the project was a little too ambitious and this led to a significant amount of lost time. This project also highlighted how important a theocratical analysis is. Seeing that our linear model could only account for 52% of the variation in our model was eye opening. This research also revealed the power of </w:t>
+      </w:r>
+      <w:r>
+        <w:t>self-balancing</w:t>
+      </w:r>
+      <w:r>
+        <w:t xml:space="preserve"> trees. For very little cost, we can have a tree that is guaranteed to have $O(log(n</w:t>
+      </w:r>
+      <w:proofErr w:type="gramStart"/>
+      <w:r>
+        <w:t>))$</w:t>
+      </w:r>
+      <w:proofErr w:type="gramEnd"/>
+      <w:r>
+        <w:t xml:space="preserve"> performance. </w:t>
+      </w:r>
+      <w:r>
+        <w:t xml:space="preserve">We demonstrated this performance by inserting over 50 million values into our </w:t>
+      </w:r>
+      <w:r>
+        <w:t>tree</w:t>
+      </w:r>
+      <w:r>
+        <w:t xml:space="preserve">. </w:t>
+      </w:r>
+      <w:r>
+        <w:t>Overall,</w:t>
+      </w:r>
+      <w:r>
+        <w:t xml:space="preserve"> this was a successful project</w:t>
+      </w:r>
+      <w:r>
+        <w:t xml:space="preserve"> for it</w:t>
+      </w:r>
+      <w:r>
+        <w:t xml:space="preserve"> showed the power, performance and practical use of ana AVL tree. </w:t>
       </w:r>
     </w:p>
     <w:p/>
@@ -4182,6 +4317,7 @@
         <w:pStyle w:val="Heading2"/>
       </w:pPr>
       <w:r>
+        <w:lastRenderedPageBreak/>
         <w:t>Appendix</w:t>
       </w:r>
     </w:p>
@@ -4240,7 +4376,6 @@
         <w:pStyle w:val="Heading4"/>
       </w:pPr>
       <w:r>
-        <w:lastRenderedPageBreak/>
         <w:t>Right-Left Rotation</w:t>
       </w:r>
     </w:p>
@@ -4296,6 +4431,7 @@
         <w:rPr>
           <w:noProof/>
         </w:rPr>
+        <w:lastRenderedPageBreak/>
         <w:drawing>
           <wp:inline distT="0" distB="0" distL="0" distR="0" wp14:anchorId="05402D6F" wp14:editId="74BCE405">
             <wp:extent cx="5828030" cy="4029710"/>
@@ -4551,7 +4687,6 @@
         <w:pStyle w:val="Heading2"/>
       </w:pPr>
       <w:r>
-        <w:lastRenderedPageBreak/>
         <w:t>References:</w:t>
       </w:r>
     </w:p>

</xml_diff>